<commit_message>
Added a few citations
</commit_message>
<xml_diff>
--- a/MS Drafts/Age cohort study_manuscript draft.docx
+++ b/MS Drafts/Age cohort study_manuscript draft.docx
@@ -15,21 +15,7 @@
         <w:rPr>
           <w:rFonts w:ascii="Times New Roman" w:eastAsia="Times New Roman" w:hAnsi="Times New Roman" w:cs="Times New Roman"/>
         </w:rPr>
-        <w:t xml:space="preserve">Determining the age of worker </w:t>
-      </w:r>
-      <w:proofErr w:type="gramStart"/>
-      <w:r>
-        <w:rPr>
-          <w:rFonts w:ascii="Times New Roman" w:eastAsia="Times New Roman" w:hAnsi="Times New Roman" w:cs="Times New Roman"/>
-        </w:rPr>
-        <w:t>honey bees</w:t>
-      </w:r>
-      <w:proofErr w:type="gramEnd"/>
-      <w:r>
-        <w:rPr>
-          <w:rFonts w:ascii="Times New Roman" w:eastAsia="Times New Roman" w:hAnsi="Times New Roman" w:cs="Times New Roman"/>
-        </w:rPr>
-        <w:t xml:space="preserve"> (</w:t>
+        <w:t>Determining the age of worker honey bees (</w:t>
       </w:r>
       <w:r>
         <w:rPr>
@@ -212,16 +198,8 @@
         <w:rPr>
           <w:rFonts w:ascii="Times New Roman" w:eastAsia="Times New Roman" w:hAnsi="Times New Roman" w:cs="Times New Roman"/>
         </w:rPr>
-        <w:t xml:space="preserve"> </w:t>
-      </w:r>
-      <w:proofErr w:type="gramStart"/>
-      <w:r>
-        <w:rPr>
-          <w:rFonts w:ascii="Times New Roman" w:eastAsia="Times New Roman" w:hAnsi="Times New Roman" w:cs="Times New Roman"/>
-        </w:rPr>
-        <w:t>honey bee</w:t>
-      </w:r>
-      <w:proofErr w:type="gramEnd"/>
+        <w:t xml:space="preserve"> honey bee</w:t>
+      </w:r>
       <w:r>
         <w:rPr>
           <w:rFonts w:ascii="Times New Roman" w:eastAsia="Times New Roman" w:hAnsi="Times New Roman" w:cs="Times New Roman"/>
@@ -312,21 +290,7 @@
         <w:rPr>
           <w:rFonts w:ascii="Times New Roman" w:eastAsia="Times New Roman" w:hAnsi="Times New Roman" w:cs="Times New Roman"/>
         </w:rPr>
-        <w:t xml:space="preserve">; it is consumed by adult </w:t>
-      </w:r>
-      <w:proofErr w:type="gramStart"/>
-      <w:r>
-        <w:rPr>
-          <w:rFonts w:ascii="Times New Roman" w:eastAsia="Times New Roman" w:hAnsi="Times New Roman" w:cs="Times New Roman"/>
-        </w:rPr>
-        <w:t>honey bee</w:t>
-      </w:r>
-      <w:proofErr w:type="gramEnd"/>
-      <w:r>
-        <w:rPr>
-          <w:rFonts w:ascii="Times New Roman" w:eastAsia="Times New Roman" w:hAnsi="Times New Roman" w:cs="Times New Roman"/>
-        </w:rPr>
-        <w:t xml:space="preserve"> workers, but is not stored or fed to larvae</w:t>
+        <w:t>; it is consumed by adult honey bee workers, but is not stored or fed to larvae</w:t>
       </w:r>
       <w:r>
         <w:rPr>
@@ -334,39 +298,17 @@
         </w:rPr>
         <w:t xml:space="preserve">. Here, we determined the age at which adult workers interact with and consume PSPs to understand PSP utilization in </w:t>
       </w:r>
-      <w:proofErr w:type="gramStart"/>
-      <w:r>
-        <w:rPr>
-          <w:rFonts w:ascii="Times New Roman" w:eastAsia="Times New Roman" w:hAnsi="Times New Roman" w:cs="Times New Roman"/>
-        </w:rPr>
-        <w:t>honey bee</w:t>
-      </w:r>
-      <w:proofErr w:type="gramEnd"/>
-      <w:r>
-        <w:rPr>
-          <w:rFonts w:ascii="Times New Roman" w:eastAsia="Times New Roman" w:hAnsi="Times New Roman" w:cs="Times New Roman"/>
-        </w:rPr>
-        <w:t xml:space="preserve"> </w:t>
-      </w:r>
-      <w:r>
-        <w:rPr>
-          <w:rFonts w:ascii="Times New Roman" w:eastAsia="Times New Roman" w:hAnsi="Times New Roman" w:cs="Times New Roman"/>
-        </w:rPr>
-        <w:t xml:space="preserve">colonies. We released cohorts of marked, newly emerged workers into hives containing dyed PSPs, undyed PSPs (negative control), dyed fondant (positive control), and dyed modeling clay (consumption control). We recorded the number of marked workers with the treatments for four weeks following </w:t>
-      </w:r>
-      <w:proofErr w:type="gramStart"/>
-      <w:r>
-        <w:rPr>
-          <w:rFonts w:ascii="Times New Roman" w:eastAsia="Times New Roman" w:hAnsi="Times New Roman" w:cs="Times New Roman"/>
-        </w:rPr>
-        <w:t>worker</w:t>
-      </w:r>
-      <w:proofErr w:type="gramEnd"/>
-      <w:r>
-        <w:rPr>
-          <w:rFonts w:ascii="Times New Roman" w:eastAsia="Times New Roman" w:hAnsi="Times New Roman" w:cs="Times New Roman"/>
-        </w:rPr>
-        <w:t xml:space="preserve"> release. Additionally, we collected 20 marked workers daily from all colonies to </w:t>
+      <w:r>
+        <w:rPr>
+          <w:rFonts w:ascii="Times New Roman" w:eastAsia="Times New Roman" w:hAnsi="Times New Roman" w:cs="Times New Roman"/>
+        </w:rPr>
+        <w:t xml:space="preserve">honey bee </w:t>
+      </w:r>
+      <w:r>
+        <w:rPr>
+          <w:rFonts w:ascii="Times New Roman" w:eastAsia="Times New Roman" w:hAnsi="Times New Roman" w:cs="Times New Roman"/>
+        </w:rPr>
+        <w:t xml:space="preserve">colonies. We released cohorts of marked, newly emerged workers into hives containing dyed PSPs, undyed PSPs (negative control), dyed fondant (positive control), and dyed modeling clay (consumption control). We recorded the number of marked workers with the treatments for four weeks following worker release. Additionally, we collected 20 marked workers daily from all colonies to </w:t>
       </w:r>
       <w:r>
         <w:rPr>
@@ -473,23 +415,7 @@
           <w:rFonts w:ascii="Times New Roman" w:hAnsi="Times New Roman" w:cs="Times New Roman"/>
           <w:color w:val="000000" w:themeColor="text1"/>
         </w:rPr>
-        <w:t xml:space="preserve">Western </w:t>
-      </w:r>
-      <w:proofErr w:type="gramStart"/>
-      <w:r>
-        <w:rPr>
-          <w:rFonts w:ascii="Times New Roman" w:hAnsi="Times New Roman" w:cs="Times New Roman"/>
-          <w:color w:val="000000" w:themeColor="text1"/>
-        </w:rPr>
-        <w:t>honey bees</w:t>
-      </w:r>
-      <w:proofErr w:type="gramEnd"/>
-      <w:r>
-        <w:rPr>
-          <w:rFonts w:ascii="Times New Roman" w:hAnsi="Times New Roman" w:cs="Times New Roman"/>
-          <w:color w:val="000000" w:themeColor="text1"/>
-        </w:rPr>
-        <w:t xml:space="preserve"> (</w:t>
+        <w:t>Western honey bees (</w:t>
       </w:r>
       <w:r>
         <w:rPr>
@@ -579,111 +505,63 @@
           <w:rFonts w:ascii="Times New Roman" w:hAnsi="Times New Roman" w:cs="Times New Roman"/>
           <w:color w:val="000000" w:themeColor="text1"/>
         </w:rPr>
-        <w:t xml:space="preserve">are the most important products produced by plants that </w:t>
-      </w:r>
-      <w:proofErr w:type="gramStart"/>
+        <w:t>are the most important products produced by plants that honey bees consume.</w:t>
+      </w:r>
       <w:r>
         <w:rPr>
           <w:rFonts w:ascii="Times New Roman" w:hAnsi="Times New Roman" w:cs="Times New Roman"/>
           <w:color w:val="000000" w:themeColor="text1"/>
         </w:rPr>
-        <w:t>honey bees</w:t>
-      </w:r>
-      <w:proofErr w:type="gramEnd"/>
+        <w:t xml:space="preserve"> Nectar is converted to honey by removing a large percentage of the moisture, and is honey bees’ primary source of carbohydrates (Brodschneider and Crailsheim 2010).</w:t>
+      </w:r>
       <w:r>
         <w:rPr>
           <w:rFonts w:ascii="Times New Roman" w:hAnsi="Times New Roman" w:cs="Times New Roman"/>
           <w:color w:val="000000" w:themeColor="text1"/>
         </w:rPr>
-        <w:t xml:space="preserve"> consume.</w:t>
+        <w:t xml:space="preserve"> P</w:t>
       </w:r>
       <w:r>
         <w:rPr>
           <w:rFonts w:ascii="Times New Roman" w:hAnsi="Times New Roman" w:cs="Times New Roman"/>
           <w:color w:val="000000" w:themeColor="text1"/>
         </w:rPr>
-        <w:t xml:space="preserve"> Nectar is converted to honey by removing a large percentage of the moisture, and is </w:t>
-      </w:r>
-      <w:proofErr w:type="gramStart"/>
+        <w:t xml:space="preserve">ollen from plants </w:t>
+      </w:r>
       <w:r>
         <w:rPr>
           <w:rFonts w:ascii="Times New Roman" w:hAnsi="Times New Roman" w:cs="Times New Roman"/>
           <w:color w:val="000000" w:themeColor="text1"/>
         </w:rPr>
-        <w:t>honey bees’</w:t>
-      </w:r>
-      <w:proofErr w:type="gramEnd"/>
+        <w:t>is</w:t>
+      </w:r>
       <w:r>
         <w:rPr>
           <w:rFonts w:ascii="Times New Roman" w:hAnsi="Times New Roman" w:cs="Times New Roman"/>
           <w:color w:val="000000" w:themeColor="text1"/>
         </w:rPr>
-        <w:t xml:space="preserve"> primary source of carbohydrates (Brodschneider and Crailsheim 2010).</w:t>
+        <w:t xml:space="preserve"> use</w:t>
       </w:r>
       <w:r>
         <w:rPr>
           <w:rFonts w:ascii="Times New Roman" w:hAnsi="Times New Roman" w:cs="Times New Roman"/>
           <w:color w:val="000000" w:themeColor="text1"/>
         </w:rPr>
-        <w:t xml:space="preserve"> P</w:t>
+        <w:t>d</w:t>
       </w:r>
       <w:r>
         <w:rPr>
           <w:rFonts w:ascii="Times New Roman" w:hAnsi="Times New Roman" w:cs="Times New Roman"/>
           <w:color w:val="000000" w:themeColor="text1"/>
         </w:rPr>
-        <w:t xml:space="preserve">ollen from plants </w:t>
+        <w:t xml:space="preserve"> as their primary source of proteins, vitamins, lipids, and minerals (Brodschneider and Crailsheim 2010). Pollen is necessary for hive growth, maintenance, and health</w:t>
       </w:r>
       <w:r>
         <w:rPr>
           <w:rFonts w:ascii="Times New Roman" w:hAnsi="Times New Roman" w:cs="Times New Roman"/>
           <w:color w:val="000000" w:themeColor="text1"/>
         </w:rPr>
-        <w:t>is</w:t>
-      </w:r>
-      <w:r>
-        <w:rPr>
-          <w:rFonts w:ascii="Times New Roman" w:hAnsi="Times New Roman" w:cs="Times New Roman"/>
-          <w:color w:val="000000" w:themeColor="text1"/>
-        </w:rPr>
-        <w:t xml:space="preserve"> use</w:t>
-      </w:r>
-      <w:r>
-        <w:rPr>
-          <w:rFonts w:ascii="Times New Roman" w:hAnsi="Times New Roman" w:cs="Times New Roman"/>
-          <w:color w:val="000000" w:themeColor="text1"/>
-        </w:rPr>
-        <w:t>d</w:t>
-      </w:r>
-      <w:r>
-        <w:rPr>
-          <w:rFonts w:ascii="Times New Roman" w:hAnsi="Times New Roman" w:cs="Times New Roman"/>
-          <w:color w:val="000000" w:themeColor="text1"/>
-        </w:rPr>
-        <w:t xml:space="preserve"> as their primary source of proteins, vitamins, lipids, and minerals (Brodschneider and Crailsheim 2010). Pollen is necessary for hive growth, maintenance, and health</w:t>
-      </w:r>
-      <w:r>
-        <w:rPr>
-          <w:rFonts w:ascii="Times New Roman" w:hAnsi="Times New Roman" w:cs="Times New Roman"/>
-          <w:color w:val="000000" w:themeColor="text1"/>
-        </w:rPr>
-        <w:t xml:space="preserve"> and is fed to developing </w:t>
-      </w:r>
-      <w:proofErr w:type="gramStart"/>
-      <w:r>
-        <w:rPr>
-          <w:rFonts w:ascii="Times New Roman" w:hAnsi="Times New Roman" w:cs="Times New Roman"/>
-          <w:color w:val="000000" w:themeColor="text1"/>
-        </w:rPr>
-        <w:t>honey bee</w:t>
-      </w:r>
-      <w:proofErr w:type="gramEnd"/>
-      <w:r>
-        <w:rPr>
-          <w:rFonts w:ascii="Times New Roman" w:hAnsi="Times New Roman" w:cs="Times New Roman"/>
-          <w:color w:val="000000" w:themeColor="text1"/>
-        </w:rPr>
-        <w:t xml:space="preserve"> brood</w:t>
+        <w:t xml:space="preserve"> and is fed to developing honey bee brood</w:t>
       </w:r>
       <w:r>
         <w:rPr>
@@ -766,21 +644,7 @@
         <w:rPr>
           <w:rFonts w:ascii="Times New Roman" w:hAnsi="Times New Roman" w:cs="Times New Roman"/>
         </w:rPr>
-        <w:t xml:space="preserve"> age cohort individual workers belong. As a result, pollen consumption is determined by the age of </w:t>
-      </w:r>
-      <w:proofErr w:type="gramStart"/>
-      <w:r>
-        <w:rPr>
-          <w:rFonts w:ascii="Times New Roman" w:hAnsi="Times New Roman" w:cs="Times New Roman"/>
-        </w:rPr>
-        <w:t>honey bee</w:t>
-      </w:r>
-      <w:proofErr w:type="gramEnd"/>
-      <w:r>
-        <w:rPr>
-          <w:rFonts w:ascii="Times New Roman" w:hAnsi="Times New Roman" w:cs="Times New Roman"/>
-        </w:rPr>
-        <w:t xml:space="preserve"> workers</w:t>
+        <w:t xml:space="preserve"> age cohort individual workers belong. As a result, pollen consumption is determined by the age of honey bee workers</w:t>
       </w:r>
       <w:r>
         <w:rPr>
@@ -810,35 +674,7 @@
         <w:rPr>
           <w:rFonts w:ascii="Times New Roman" w:hAnsi="Times New Roman" w:cs="Times New Roman"/>
         </w:rPr>
-        <w:t xml:space="preserve"> Given that nurse bees are responsible for feeding pollen to larvae, pollen consumption in adult </w:t>
-      </w:r>
-      <w:proofErr w:type="gramStart"/>
-      <w:r>
-        <w:rPr>
-          <w:rFonts w:ascii="Times New Roman" w:hAnsi="Times New Roman" w:cs="Times New Roman"/>
-        </w:rPr>
-        <w:t>bees</w:t>
-      </w:r>
-      <w:proofErr w:type="gramEnd"/>
-      <w:r>
-        <w:rPr>
-          <w:rFonts w:ascii="Times New Roman" w:hAnsi="Times New Roman" w:cs="Times New Roman"/>
-        </w:rPr>
-        <w:t xml:space="preserve"> peaks around 9 days post eclosion. Once </w:t>
-      </w:r>
-      <w:proofErr w:type="gramStart"/>
-      <w:r>
-        <w:rPr>
-          <w:rFonts w:ascii="Times New Roman" w:hAnsi="Times New Roman" w:cs="Times New Roman"/>
-        </w:rPr>
-        <w:t>honey bees</w:t>
-      </w:r>
-      <w:proofErr w:type="gramEnd"/>
-      <w:r>
-        <w:rPr>
-          <w:rFonts w:ascii="Times New Roman" w:hAnsi="Times New Roman" w:cs="Times New Roman"/>
-        </w:rPr>
-        <w:t xml:space="preserve"> transition from nursing to foraging-related tasks, their consumption of pollen drops as they no longer need to provide nutrients to larvae. </w:t>
+        <w:t xml:space="preserve"> Given that nurse bees are responsible for feeding pollen to larvae, pollen consumption in adult bees peaks around 9 days post eclosion. Once honey bees transition from nursing to foraging-related tasks, their consumption of pollen drops as they no longer need to provide nutrients to larvae. </w:t>
       </w:r>
       <w:r>
         <w:rPr>
@@ -863,21 +699,7 @@
           <w:rFonts w:ascii="Times New Roman" w:hAnsi="Times New Roman" w:cs="Times New Roman"/>
         </w:rPr>
         <w:lastRenderedPageBreak/>
-        <w:t xml:space="preserve">be the most cognitively demanding task </w:t>
-      </w:r>
-      <w:proofErr w:type="gramStart"/>
-      <w:r>
-        <w:rPr>
-          <w:rFonts w:ascii="Times New Roman" w:hAnsi="Times New Roman" w:cs="Times New Roman"/>
-        </w:rPr>
-        <w:t>honey bees</w:t>
-      </w:r>
-      <w:proofErr w:type="gramEnd"/>
-      <w:r>
-        <w:rPr>
-          <w:rFonts w:ascii="Times New Roman" w:hAnsi="Times New Roman" w:cs="Times New Roman"/>
-        </w:rPr>
-        <w:t xml:space="preserve"> perform (Robinson 2002), it stands to reason that this task is not conducted until roughly the halfway point of an adult honey bee’s lifetime. Interestingly, the presence of foragers themselves can delay nurse bees’ transition to foraging, indicating potential variation between </w:t>
+        <w:t xml:space="preserve">be the most cognitively demanding task honey bees perform (Robinson 2002), it stands to reason that this task is not conducted until roughly the halfway point of an adult honey bee’s lifetime. Interestingly, the presence of foragers themselves can delay nurse bees’ transition to foraging, indicating potential variation between </w:t>
       </w:r>
       <w:r>
         <w:rPr>
@@ -927,53 +749,21 @@
           <w:rFonts w:ascii="Times New Roman" w:hAnsi="Times New Roman" w:cs="Times New Roman"/>
           <w:color w:val="000000" w:themeColor="text1"/>
         </w:rPr>
-        <w:t xml:space="preserve"> produce pollen as a form of reproduction and the phenology of pollen presence in the environment depends on the species of plants present. Depending on the geographical location, there may be instances throughout the year where pollen is not produced in large enough quantities to support </w:t>
-      </w:r>
-      <w:proofErr w:type="gramStart"/>
+        <w:t xml:space="preserve"> produce pollen as a form of reproduction and the phenology of pollen presence in the environment depends on the species of plants present. Depending on the geographical location, there may be instances throughout the year where pollen is not produced in large enough quantities to support honey bee colonies</w:t>
+      </w:r>
       <w:r>
         <w:rPr>
           <w:rFonts w:ascii="Times New Roman" w:hAnsi="Times New Roman" w:cs="Times New Roman"/>
           <w:color w:val="000000" w:themeColor="text1"/>
         </w:rPr>
-        <w:t>honey bee</w:t>
-      </w:r>
-      <w:proofErr w:type="gramEnd"/>
+        <w:t xml:space="preserve"> (Lau et al. 2019)</w:t>
+      </w:r>
       <w:r>
         <w:rPr>
           <w:rFonts w:ascii="Times New Roman" w:hAnsi="Times New Roman" w:cs="Times New Roman"/>
           <w:color w:val="000000" w:themeColor="text1"/>
         </w:rPr>
-        <w:t xml:space="preserve"> colonies</w:t>
-      </w:r>
-      <w:r>
-        <w:rPr>
-          <w:rFonts w:ascii="Times New Roman" w:hAnsi="Times New Roman" w:cs="Times New Roman"/>
-          <w:color w:val="000000" w:themeColor="text1"/>
-        </w:rPr>
-        <w:t xml:space="preserve"> (Lau et al. 2019)</w:t>
-      </w:r>
-      <w:r>
-        <w:rPr>
-          <w:rFonts w:ascii="Times New Roman" w:hAnsi="Times New Roman" w:cs="Times New Roman"/>
-          <w:color w:val="000000" w:themeColor="text1"/>
-        </w:rPr>
-        <w:t xml:space="preserve">. Although </w:t>
-      </w:r>
-      <w:proofErr w:type="gramStart"/>
-      <w:r>
-        <w:rPr>
-          <w:rFonts w:ascii="Times New Roman" w:hAnsi="Times New Roman" w:cs="Times New Roman"/>
-          <w:color w:val="000000" w:themeColor="text1"/>
-        </w:rPr>
-        <w:t>honey bees</w:t>
-      </w:r>
-      <w:proofErr w:type="gramEnd"/>
-      <w:r>
-        <w:rPr>
-          <w:rFonts w:ascii="Times New Roman" w:hAnsi="Times New Roman" w:cs="Times New Roman"/>
-          <w:color w:val="000000" w:themeColor="text1"/>
-        </w:rPr>
-        <w:t xml:space="preserve"> collect and store pollen when available, honey bees have shown a preference for fresh pollen (</w:t>
+        <w:t>. Although honey bees collect and store pollen when available, honey bees have shown a preference for fresh pollen (</w:t>
       </w:r>
       <w:r>
         <w:rPr>
@@ -1124,143 +914,77 @@
           <w:rFonts w:ascii="Times New Roman" w:hAnsi="Times New Roman" w:cs="Times New Roman"/>
           <w:color w:val="000000" w:themeColor="text1"/>
         </w:rPr>
-        <w:t xml:space="preserve"> Specifically, a proportion of </w:t>
-      </w:r>
-      <w:proofErr w:type="gramStart"/>
+        <w:t xml:space="preserve"> Specifically, a proportion of honey bees ingest provided pollen substitutes, but honey bee workers do not feed the pollen substitutes to larvae, nor do they store commercial pollen substitutes as</w:t>
+      </w:r>
       <w:r>
         <w:rPr>
           <w:rFonts w:ascii="Times New Roman" w:hAnsi="Times New Roman" w:cs="Times New Roman"/>
           <w:color w:val="000000" w:themeColor="text1"/>
         </w:rPr>
-        <w:t>honey bees</w:t>
-      </w:r>
-      <w:proofErr w:type="gramEnd"/>
+        <w:t xml:space="preserve"> bee bread</w:t>
+      </w:r>
       <w:r>
         <w:rPr>
           <w:rFonts w:ascii="Times New Roman" w:hAnsi="Times New Roman" w:cs="Times New Roman"/>
           <w:color w:val="000000" w:themeColor="text1"/>
         </w:rPr>
-        <w:t xml:space="preserve"> ingest provided pollen substitutes, but honey bee workers do not feed the pollen substitutes to larvae, nor do they store commercial pollen substitutes as</w:t>
+        <w:t xml:space="preserve"> (Noordyke et al. 2021)</w:t>
       </w:r>
       <w:r>
         <w:rPr>
           <w:rFonts w:ascii="Times New Roman" w:hAnsi="Times New Roman" w:cs="Times New Roman"/>
           <w:color w:val="000000" w:themeColor="text1"/>
         </w:rPr>
-        <w:t xml:space="preserve"> bee bread</w:t>
+        <w:t xml:space="preserve">. </w:t>
       </w:r>
       <w:r>
         <w:rPr>
           <w:rFonts w:ascii="Times New Roman" w:hAnsi="Times New Roman" w:cs="Times New Roman"/>
           <w:color w:val="000000" w:themeColor="text1"/>
         </w:rPr>
-        <w:t xml:space="preserve"> (Noordyke et al. 2021)</w:t>
+        <w:t>Owing to</w:t>
       </w:r>
       <w:r>
         <w:rPr>
           <w:rFonts w:ascii="Times New Roman" w:hAnsi="Times New Roman" w:cs="Times New Roman"/>
           <w:color w:val="000000" w:themeColor="text1"/>
         </w:rPr>
-        <w:t xml:space="preserve">. </w:t>
-      </w:r>
-      <w:proofErr w:type="gramStart"/>
+        <w:t xml:space="preserve"> these results, there is </w:t>
+      </w:r>
       <w:r>
         <w:rPr>
           <w:rFonts w:ascii="Times New Roman" w:hAnsi="Times New Roman" w:cs="Times New Roman"/>
           <w:color w:val="000000" w:themeColor="text1"/>
         </w:rPr>
-        <w:t>Owing to</w:t>
+        <w:t>a lack</w:t>
       </w:r>
       <w:r>
         <w:rPr>
           <w:rFonts w:ascii="Times New Roman" w:hAnsi="Times New Roman" w:cs="Times New Roman"/>
           <w:color w:val="000000" w:themeColor="text1"/>
         </w:rPr>
-        <w:t xml:space="preserve"> these results, there</w:t>
-      </w:r>
-      <w:proofErr w:type="gramEnd"/>
+        <w:t xml:space="preserve"> evidence that commercial pollen substitutes are used the same way that pollen is used within colonies.</w:t>
+      </w:r>
       <w:r>
         <w:rPr>
           <w:rFonts w:ascii="Times New Roman" w:hAnsi="Times New Roman" w:cs="Times New Roman"/>
           <w:color w:val="000000" w:themeColor="text1"/>
         </w:rPr>
-        <w:t xml:space="preserve"> is </w:t>
+        <w:t xml:space="preserve"> Additionally, there is evidence that honey bee nurses do not differentiate between nutritional quality in natural pollen</w:t>
       </w:r>
       <w:r>
         <w:rPr>
           <w:rFonts w:ascii="Times New Roman" w:hAnsi="Times New Roman" w:cs="Times New Roman"/>
           <w:color w:val="000000" w:themeColor="text1"/>
         </w:rPr>
-        <w:t xml:space="preserve">a </w:t>
-      </w:r>
-      <w:proofErr w:type="gramStart"/>
+        <w:t xml:space="preserve"> (Corby-Harris et al. 2018), so more nutritious pollen supplements may not be apparent to nurse bees.</w:t>
+      </w:r>
       <w:r>
         <w:rPr>
           <w:rFonts w:ascii="Times New Roman" w:hAnsi="Times New Roman" w:cs="Times New Roman"/>
           <w:color w:val="000000" w:themeColor="text1"/>
         </w:rPr>
-        <w:t>lack</w:t>
-      </w:r>
-      <w:proofErr w:type="gramEnd"/>
-      <w:r>
-        <w:rPr>
-          <w:rFonts w:ascii="Times New Roman" w:hAnsi="Times New Roman" w:cs="Times New Roman"/>
-          <w:color w:val="000000" w:themeColor="text1"/>
-        </w:rPr>
-        <w:t xml:space="preserve"> evidence that commercial pollen substitutes are used the same way that pollen is used within colonies.</w:t>
-      </w:r>
-      <w:r>
-        <w:rPr>
-          <w:rFonts w:ascii="Times New Roman" w:hAnsi="Times New Roman" w:cs="Times New Roman"/>
-          <w:color w:val="000000" w:themeColor="text1"/>
-        </w:rPr>
-        <w:t xml:space="preserve"> Additionally, there is evidence that </w:t>
-      </w:r>
-      <w:proofErr w:type="gramStart"/>
-      <w:r>
-        <w:rPr>
-          <w:rFonts w:ascii="Times New Roman" w:hAnsi="Times New Roman" w:cs="Times New Roman"/>
-          <w:color w:val="000000" w:themeColor="text1"/>
-        </w:rPr>
-        <w:t>honey bee</w:t>
-      </w:r>
-      <w:proofErr w:type="gramEnd"/>
-      <w:r>
-        <w:rPr>
-          <w:rFonts w:ascii="Times New Roman" w:hAnsi="Times New Roman" w:cs="Times New Roman"/>
-          <w:color w:val="000000" w:themeColor="text1"/>
-        </w:rPr>
-        <w:t xml:space="preserve"> nurses do not differentiate between nutritional quality in natural pollen</w:t>
-      </w:r>
-      <w:r>
-        <w:rPr>
-          <w:rFonts w:ascii="Times New Roman" w:hAnsi="Times New Roman" w:cs="Times New Roman"/>
-          <w:color w:val="000000" w:themeColor="text1"/>
-        </w:rPr>
-        <w:t xml:space="preserve"> (Corby-Harris et al. 2018), so more nutritious pollen supplements may not be apparent to nurse bees.</w:t>
-      </w:r>
-      <w:r>
-        <w:rPr>
-          <w:rFonts w:ascii="Times New Roman" w:hAnsi="Times New Roman" w:cs="Times New Roman"/>
-          <w:color w:val="000000" w:themeColor="text1"/>
-        </w:rPr>
-        <w:t xml:space="preserve"> Given that commercial pollen substitutes are consumed by </w:t>
-      </w:r>
-      <w:proofErr w:type="gramStart"/>
-      <w:r>
-        <w:rPr>
-          <w:rFonts w:ascii="Times New Roman" w:hAnsi="Times New Roman" w:cs="Times New Roman"/>
-          <w:color w:val="000000" w:themeColor="text1"/>
-        </w:rPr>
-        <w:t>honey bees</w:t>
-      </w:r>
-      <w:proofErr w:type="gramEnd"/>
-      <w:r>
-        <w:rPr>
-          <w:rFonts w:ascii="Times New Roman" w:hAnsi="Times New Roman" w:cs="Times New Roman"/>
-          <w:color w:val="000000" w:themeColor="text1"/>
-        </w:rPr>
-        <w:t xml:space="preserve"> adults, and is thus interpreted as food, the age at which honey bees </w:t>
+        <w:t xml:space="preserve"> Given that commercial pollen substitutes are consumed by honey bees adults, and is thus interpreted as food, the age at which honey bees </w:t>
       </w:r>
       <w:r>
         <w:rPr>
@@ -1319,47 +1043,31 @@
         <w:rPr>
           <w:rFonts w:ascii="Times New Roman" w:hAnsi="Times New Roman" w:cs="Times New Roman"/>
         </w:rPr>
-        <w:t xml:space="preserve">e sought to answer the following questions: 1) at what age do </w:t>
-      </w:r>
-      <w:proofErr w:type="gramStart"/>
-      <w:r>
-        <w:rPr>
-          <w:rFonts w:ascii="Times New Roman" w:hAnsi="Times New Roman" w:cs="Times New Roman"/>
-        </w:rPr>
-        <w:t>honey bee</w:t>
-      </w:r>
-      <w:proofErr w:type="gramEnd"/>
-      <w:r>
-        <w:rPr>
-          <w:rFonts w:ascii="Times New Roman" w:hAnsi="Times New Roman" w:cs="Times New Roman"/>
-        </w:rPr>
-        <w:t xml:space="preserve"> workers visit and interact with commercial pollen substitutes and 2) at what age do honey bee workers ingest commercial pollen substitutes? </w:t>
-      </w:r>
-      <w:r>
-        <w:rPr>
-          <w:rFonts w:ascii="Times New Roman" w:hAnsi="Times New Roman" w:cs="Times New Roman"/>
-        </w:rPr>
-        <w:t xml:space="preserve">In the event that </w:t>
-      </w:r>
-      <w:proofErr w:type="gramStart"/>
-      <w:r>
-        <w:rPr>
-          <w:rFonts w:ascii="Times New Roman" w:hAnsi="Times New Roman" w:cs="Times New Roman"/>
-        </w:rPr>
-        <w:t>honey bee</w:t>
-      </w:r>
-      <w:proofErr w:type="gramEnd"/>
-      <w:r>
-        <w:rPr>
-          <w:rFonts w:ascii="Times New Roman" w:hAnsi="Times New Roman" w:cs="Times New Roman"/>
-        </w:rPr>
-        <w:t xml:space="preserve"> nurses are the primary consumers of commercial pollen substitutes, it could be hypothesized that the nutrients would eventually be fed to larvae. This scenario would be the intended use of commercial pollen substitutes. If, however, foragers are the primary consumers of commercial pollen substitutes, then it could be hypothesized that foragers are consuming the substitutes for energy and are targeting the commercial pollen substitutes for their carbohydrate content. In the present study, we hypothesized that nurse bees (ages 5-9 days post eclosion) both visit and consume commercial pollen substitutes, given that they are the primary consumers of bee bread in the colony</w:t>
-      </w:r>
-      <w:r>
-        <w:rPr>
-          <w:rFonts w:ascii="Times New Roman" w:hAnsi="Times New Roman" w:cs="Times New Roman"/>
-        </w:rPr>
-        <w:t xml:space="preserve"> (cite crailsheim)</w:t>
+        <w:t xml:space="preserve">e sought to answer the following questions: 1) at what age do honey bee workers visit and interact with commercial pollen substitutes and 2) at what age do honey bee workers ingest commercial pollen substitutes? </w:t>
+      </w:r>
+      <w:r>
+        <w:rPr>
+          <w:rFonts w:ascii="Times New Roman" w:hAnsi="Times New Roman" w:cs="Times New Roman"/>
+        </w:rPr>
+        <w:t>In the event that honey bee nurses are the primary consumers of commercial pollen substitutes, it could be hypothesized that the nutrients would eventually be fed to larvae. This scenario would be the intended use of commercial pollen substitutes. If, however, foragers are the primary consumers of commercial pollen substitutes, then it could be hypothesized that foragers are consuming the substitutes for energy and are targeting the commercial pollen substitutes for their carbohydrate content. In the present study, we hypothesized that nurse bees (ages 5-9 days post eclosion) both visit and consume commercial pollen substitutes, given that they are the primary consumers of bee bread in the colony</w:t>
+      </w:r>
+      <w:r>
+        <w:rPr>
+          <w:rFonts w:ascii="Times New Roman" w:hAnsi="Times New Roman" w:cs="Times New Roman"/>
+        </w:rPr>
+        <w:t xml:space="preserve"> (</w:t>
+      </w:r>
+      <w:r>
+        <w:rPr>
+          <w:rFonts w:ascii="Times New Roman" w:hAnsi="Times New Roman" w:cs="Times New Roman"/>
+        </w:rPr>
+        <w:t>Crailsheim et al. 1993</w:t>
+      </w:r>
+      <w:r>
+        <w:rPr>
+          <w:rFonts w:ascii="Times New Roman" w:hAnsi="Times New Roman" w:cs="Times New Roman"/>
+        </w:rPr>
+        <w:t>)</w:t>
       </w:r>
       <w:r>
         <w:rPr>
@@ -1446,7 +1154,6 @@
           <w:rFonts w:ascii="Times New Roman" w:hAnsi="Times New Roman" w:cs="Times New Roman"/>
         </w:rPr>
       </w:pPr>
-      <w:proofErr w:type="gramStart"/>
       <w:r>
         <w:rPr>
           <w:rFonts w:ascii="Times New Roman" w:eastAsia="Times New Roman" w:hAnsi="Times New Roman" w:cs="Times New Roman"/>
@@ -1455,538 +1162,457 @@
           <w:i/>
           <w:iCs/>
         </w:rPr>
-        <w:t>Honey Bee</w:t>
-      </w:r>
-      <w:proofErr w:type="gramEnd"/>
-      <w:r>
-        <w:rPr>
-          <w:rFonts w:ascii="Times New Roman" w:eastAsia="Times New Roman" w:hAnsi="Times New Roman" w:cs="Times New Roman"/>
+        <w:t>Honey Bee Colonies</w:t>
+      </w:r>
+    </w:p>
+    <w:p>
+      <w:pPr>
+        <w:spacing w:line="480" w:lineRule="auto"/>
+        <w:ind w:firstLine="720"/>
+        <w:rPr>
+          <w:rFonts w:ascii="Times New Roman" w:hAnsi="Times New Roman" w:cs="Times New Roman"/>
+        </w:rPr>
+      </w:pPr>
+      <w:r>
+        <w:rPr>
+          <w:rFonts w:ascii="Times New Roman" w:eastAsia="Times New Roman" w:hAnsi="Times New Roman" w:cs="Times New Roman"/>
+        </w:rPr>
+        <w:lastRenderedPageBreak/>
+        <w:t xml:space="preserve">Fifteen colonies in five frame Langstroth equipment (i.e. five frame nucleus colonies or nucs) were moved from Jester Apiaries in Mims, FL, USA to the University of Florida Honey Bee Research and Extension Laboratory, Gainesville, FL, USA (29.634°, -82.365°) on 15 October 2020. On 19 October 2020, we brought 23 frames of capped brood from the study colonies and three extra colonies to the lab between 15:00 and 18:00 to allow worker bees to emerge overnight. The frames of brood were kept at 32°C in the observation hive room. </w:t>
+      </w:r>
+    </w:p>
+    <w:p>
+      <w:pPr>
+        <w:spacing w:line="480" w:lineRule="auto"/>
+        <w:ind w:firstLine="720"/>
+        <w:rPr>
+          <w:rFonts w:ascii="Times New Roman" w:hAnsi="Times New Roman" w:cs="Times New Roman"/>
+        </w:rPr>
+      </w:pPr>
+      <w:r>
+        <w:rPr>
+          <w:rFonts w:ascii="Times New Roman" w:eastAsia="Times New Roman" w:hAnsi="Times New Roman" w:cs="Times New Roman"/>
+        </w:rPr>
+        <w:t>We gathered newly emerged bees &lt; 24 h old using methods from Williams et al. (2013) over three consecutive days. All newly emerged bees were placed in the same container and allowed to mix thoroughly to reduce the potential effects of genetic variation between colonies. We painted the thoraces of the newly emerged bees using Testors Enamel paint (</w:t>
+      </w:r>
+      <w:r>
+        <w:rPr>
+          <w:rFonts w:ascii="Times New Roman" w:eastAsia="Times New Roman" w:hAnsi="Times New Roman" w:cs="Times New Roman"/>
+          <w:color w:val="000000" w:themeColor="text1"/>
+        </w:rPr>
+        <w:t>The Testor Corporation, Rockford, IL</w:t>
+      </w:r>
+      <w:r>
+        <w:rPr>
+          <w:rFonts w:ascii="Times New Roman" w:eastAsia="Times New Roman" w:hAnsi="Times New Roman" w:cs="Times New Roman"/>
+        </w:rPr>
+        <w:t>) on 20 October 2020, 21 October 2020, and 22 October 2020</w:t>
+      </w:r>
+      <w:r>
+        <w:rPr>
+          <w:rFonts w:ascii="Times New Roman" w:eastAsia="Times New Roman" w:hAnsi="Times New Roman" w:cs="Times New Roman"/>
+          <w:color w:val="000000" w:themeColor="text1"/>
+        </w:rPr>
+        <w:t xml:space="preserve">. </w:t>
+      </w:r>
+      <w:commentRangeStart w:id="18"/>
+      <w:commentRangeStart w:id="19"/>
+      <w:r>
+        <w:rPr>
+          <w:rFonts w:ascii="Times New Roman" w:eastAsia="Times New Roman" w:hAnsi="Times New Roman" w:cs="Times New Roman"/>
+          <w:color w:val="000000" w:themeColor="text1"/>
+        </w:rPr>
+        <w:t>We used paint colors “Gloss Turquoise”, “Flat Red”, and “Flat Violet”.</w:t>
+      </w:r>
+      <w:commentRangeEnd w:id="18"/>
+      <w:r>
+        <w:commentReference w:id="18"/>
+      </w:r>
+      <w:commentRangeEnd w:id="19"/>
+      <w:r>
+        <w:rPr>
+          <w:rStyle w:val="CommentReference"/>
+          <w:rFonts w:ascii="Times New Roman" w:eastAsia="Times New Roman" w:hAnsi="Times New Roman" w:cs="Times New Roman"/>
+        </w:rPr>
+        <w:commentReference w:id="19"/>
+      </w:r>
+      <w:r>
+        <w:rPr>
+          <w:rFonts w:ascii="Times New Roman" w:eastAsia="Times New Roman" w:hAnsi="Times New Roman" w:cs="Times New Roman"/>
+        </w:rPr>
+        <w:t xml:space="preserve"> Groups of eight hundred painted bees were introduced to five colonies the same day that they were painted. We randomly selected the colonies to receive painted bees on each day.</w:t>
+      </w:r>
+    </w:p>
+    <w:p>
+      <w:pPr>
+        <w:spacing w:line="480" w:lineRule="auto"/>
+        <w:ind w:firstLine="720"/>
+        <w:rPr>
+          <w:rFonts w:ascii="Times New Roman" w:hAnsi="Times New Roman" w:cs="Times New Roman"/>
+        </w:rPr>
+      </w:pPr>
+      <w:r>
+        <w:rPr>
+          <w:rFonts w:ascii="Times New Roman" w:eastAsia="Times New Roman" w:hAnsi="Times New Roman" w:cs="Times New Roman"/>
+        </w:rPr>
+        <w:t>We heavily smoked colonies prior to introducing the new painted bees. We also closed colony entrances to prevent the ejection of new bees. Then, we poured the bees on the top bars of the brood box and lightly misted them with a sucrose solution in a spray bottle. We added a medium super to each hive to add space for diet patties. Diet patties were added to each colony. We opened colony entrances approximately two hours after introducing the painted bees.</w:t>
+      </w:r>
+    </w:p>
+    <w:p>
+      <w:pPr>
+        <w:spacing w:line="480" w:lineRule="auto"/>
+        <w:rPr>
+          <w:rFonts w:ascii="Times New Roman" w:hAnsi="Times New Roman" w:cs="Times New Roman"/>
+        </w:rPr>
+      </w:pPr>
+    </w:p>
+    <w:p>
+      <w:pPr>
+        <w:spacing w:line="480" w:lineRule="auto"/>
+        <w:rPr>
+          <w:rFonts w:ascii="Times New Roman" w:hAnsi="Times New Roman" w:cs="Times New Roman"/>
           <w:b/>
           <w:bCs/>
           <w:i/>
           <w:iCs/>
         </w:rPr>
-        <w:t xml:space="preserve"> Colonies</w:t>
-      </w:r>
-    </w:p>
-    <w:p>
-      <w:pPr>
-        <w:spacing w:line="480" w:lineRule="auto"/>
-        <w:ind w:firstLine="720"/>
-        <w:rPr>
-          <w:rFonts w:ascii="Times New Roman" w:hAnsi="Times New Roman" w:cs="Times New Roman"/>
-        </w:rPr>
-      </w:pPr>
-      <w:r>
-        <w:rPr>
-          <w:rFonts w:ascii="Times New Roman" w:eastAsia="Times New Roman" w:hAnsi="Times New Roman" w:cs="Times New Roman"/>
-        </w:rPr>
-        <w:lastRenderedPageBreak/>
-        <w:t xml:space="preserve">Fifteen colonies in five frame Langstroth equipment (i.e. five frame nucleus colonies or nucs) were moved from Jester Apiaries in Mims, FL, USA to the University of Florida </w:t>
-      </w:r>
-      <w:proofErr w:type="gramStart"/>
-      <w:r>
-        <w:rPr>
-          <w:rFonts w:ascii="Times New Roman" w:eastAsia="Times New Roman" w:hAnsi="Times New Roman" w:cs="Times New Roman"/>
-        </w:rPr>
-        <w:t>Honey Bee</w:t>
-      </w:r>
-      <w:proofErr w:type="gramEnd"/>
-      <w:r>
-        <w:rPr>
-          <w:rFonts w:ascii="Times New Roman" w:eastAsia="Times New Roman" w:hAnsi="Times New Roman" w:cs="Times New Roman"/>
-        </w:rPr>
-        <w:t xml:space="preserve"> Research and Extension Laboratory, Gainesville, FL, USA (29.634°, -82.365°) on 15 October 2020. On 19 October 2020, we brought 23 frames of capped brood from the study colonies and three extra colonies to the lab between 15:00 and 18:00 to allow worker bees to emerge overnight. The frames of brood were kept at 32°C in the observation hive room. </w:t>
-      </w:r>
-    </w:p>
-    <w:p>
-      <w:pPr>
-        <w:spacing w:line="480" w:lineRule="auto"/>
-        <w:ind w:firstLine="720"/>
-        <w:rPr>
-          <w:rFonts w:ascii="Times New Roman" w:hAnsi="Times New Roman" w:cs="Times New Roman"/>
-        </w:rPr>
-      </w:pPr>
-      <w:r>
-        <w:rPr>
-          <w:rFonts w:ascii="Times New Roman" w:eastAsia="Times New Roman" w:hAnsi="Times New Roman" w:cs="Times New Roman"/>
-        </w:rPr>
-        <w:t>We gathered newly emerged bees &lt; 24 h old using methods from Williams et al. (2013) over three consecutive days. All newly emerged bees were placed in the same container and allowed to mix thoroughly to reduce the potential effects of genetic variation between colonies. We painted the thoraces of the newly emerged bees using Testors Enamel paint (</w:t>
-      </w:r>
-      <w:r>
-        <w:rPr>
-          <w:rFonts w:ascii="Times New Roman" w:eastAsia="Times New Roman" w:hAnsi="Times New Roman" w:cs="Times New Roman"/>
-          <w:color w:val="000000" w:themeColor="text1"/>
-        </w:rPr>
-        <w:t>The Testor Corporation, Rockford, IL</w:t>
-      </w:r>
-      <w:r>
-        <w:rPr>
-          <w:rFonts w:ascii="Times New Roman" w:eastAsia="Times New Roman" w:hAnsi="Times New Roman" w:cs="Times New Roman"/>
-        </w:rPr>
-        <w:t>) on 20 October 2020, 21 October 2020, and 22 October 2020</w:t>
-      </w:r>
-      <w:r>
-        <w:rPr>
-          <w:rFonts w:ascii="Times New Roman" w:eastAsia="Times New Roman" w:hAnsi="Times New Roman" w:cs="Times New Roman"/>
-          <w:color w:val="000000" w:themeColor="text1"/>
-        </w:rPr>
-        <w:t xml:space="preserve">. </w:t>
-      </w:r>
-      <w:commentRangeStart w:id="18"/>
-      <w:commentRangeStart w:id="19"/>
-      <w:r>
-        <w:rPr>
-          <w:rFonts w:ascii="Times New Roman" w:eastAsia="Times New Roman" w:hAnsi="Times New Roman" w:cs="Times New Roman"/>
-          <w:color w:val="000000" w:themeColor="text1"/>
-        </w:rPr>
-        <w:t>We used paint colors “Gloss Turquoise”, “Flat Red”, and “Flat Violet”.</w:t>
-      </w:r>
-      <w:commentRangeEnd w:id="18"/>
-      <w:r>
-        <w:commentReference w:id="18"/>
-      </w:r>
-      <w:commentRangeEnd w:id="19"/>
-      <w:r>
-        <w:rPr>
-          <w:rStyle w:val="CommentReference"/>
-          <w:rFonts w:ascii="Times New Roman" w:eastAsia="Times New Roman" w:hAnsi="Times New Roman" w:cs="Times New Roman"/>
-        </w:rPr>
-        <w:commentReference w:id="19"/>
-      </w:r>
-      <w:r>
-        <w:rPr>
-          <w:rFonts w:ascii="Times New Roman" w:eastAsia="Times New Roman" w:hAnsi="Times New Roman" w:cs="Times New Roman"/>
-        </w:rPr>
-        <w:t xml:space="preserve"> Groups of eight hundred painted bees were introduced to five colonies the same day that they were painted. We randomly selected the colonies to receive painted bees on each day.</w:t>
-      </w:r>
-    </w:p>
-    <w:p>
-      <w:pPr>
-        <w:spacing w:line="480" w:lineRule="auto"/>
-        <w:ind w:firstLine="720"/>
-        <w:rPr>
-          <w:rFonts w:ascii="Times New Roman" w:hAnsi="Times New Roman" w:cs="Times New Roman"/>
-        </w:rPr>
-      </w:pPr>
-      <w:r>
-        <w:rPr>
-          <w:rFonts w:ascii="Times New Roman" w:eastAsia="Times New Roman" w:hAnsi="Times New Roman" w:cs="Times New Roman"/>
-        </w:rPr>
-        <w:t xml:space="preserve">We heavily smoked colonies prior to introducing the new painted bees. We also closed colony entrances to prevent the ejection of new bees. Then, we poured the bees on the top bars of the brood box and lightly misted them with a sucrose solution in a spray bottle. We added a medium super to each hive to add space for diet patties. Diet </w:t>
-      </w:r>
-      <w:proofErr w:type="gramStart"/>
-      <w:r>
-        <w:rPr>
-          <w:rFonts w:ascii="Times New Roman" w:eastAsia="Times New Roman" w:hAnsi="Times New Roman" w:cs="Times New Roman"/>
-        </w:rPr>
-        <w:t>patties</w:t>
-      </w:r>
-      <w:proofErr w:type="gramEnd"/>
-      <w:r>
-        <w:rPr>
-          <w:rFonts w:ascii="Times New Roman" w:eastAsia="Times New Roman" w:hAnsi="Times New Roman" w:cs="Times New Roman"/>
-        </w:rPr>
-        <w:t xml:space="preserve"> were added to each colony. We opened colony entrances approximately two hours after introducing the painted bees.</w:t>
-      </w:r>
-    </w:p>
-    <w:p>
-      <w:pPr>
-        <w:spacing w:line="480" w:lineRule="auto"/>
-        <w:rPr>
-          <w:rFonts w:ascii="Times New Roman" w:hAnsi="Times New Roman" w:cs="Times New Roman"/>
-        </w:rPr>
-      </w:pPr>
-    </w:p>
-    <w:p>
-      <w:pPr>
-        <w:spacing w:line="480" w:lineRule="auto"/>
-        <w:rPr>
-          <w:rFonts w:ascii="Times New Roman" w:hAnsi="Times New Roman" w:cs="Times New Roman"/>
+      </w:pPr>
+      <w:r>
+        <w:rPr>
+          <w:rFonts w:ascii="Times New Roman" w:eastAsia="Times New Roman" w:hAnsi="Times New Roman" w:cs="Times New Roman"/>
           <w:b/>
           <w:bCs/>
           <w:i/>
           <w:iCs/>
         </w:rPr>
-      </w:pPr>
-      <w:r>
-        <w:rPr>
-          <w:rFonts w:ascii="Times New Roman" w:eastAsia="Times New Roman" w:hAnsi="Times New Roman" w:cs="Times New Roman"/>
+        <w:t>Treatment Groups</w:t>
+      </w:r>
+    </w:p>
+    <w:p>
+      <w:pPr>
+        <w:spacing w:line="480" w:lineRule="auto"/>
+        <w:ind w:firstLine="720"/>
+        <w:rPr>
+          <w:rFonts w:ascii="Times New Roman" w:hAnsi="Times New Roman" w:cs="Times New Roman"/>
+        </w:rPr>
+      </w:pPr>
+      <w:r>
+        <w:rPr>
+          <w:rFonts w:ascii="Times New Roman" w:eastAsia="Times New Roman" w:hAnsi="Times New Roman" w:cs="Times New Roman"/>
+        </w:rPr>
+        <w:t xml:space="preserve">The treatment groups were as follows: (1) six colonies received AP23 (Dadant and Sons Inc., High Springs, FL, USA) mixed with Brilliant Blue FCF (also Erioglaucine A, Sigma </w:t>
+      </w:r>
+      <w:r>
+        <w:rPr>
+          <w:rFonts w:ascii="Times New Roman" w:eastAsia="Times New Roman" w:hAnsi="Times New Roman" w:cs="Times New Roman"/>
+        </w:rPr>
+        <w:lastRenderedPageBreak/>
+        <w:t xml:space="preserve">Aldrich Lot #SHBL4427), (2) three colonies received AP23 without dye (negative control), (3) three colonies received fondant mixed with Brilliant Blue FCF, and (4) three colonies received Crayola model magic clay (Crayola, LLC, Easton, PA, USA) mixed with Brilliant Blue FCF (consumption control). Brilliant Blue FCF was found to be non-toxic to adult honey bees when ingested (Ehrenberg et al. 2019, Noordyke et al. 2021). Honey bees will not eat Crayola Model Magic clay and in some cases will even eject it from the hive (Noordyke et al. 2021). Thus, we used it as a consumption control, which allows us to see how the Brilliant Blue FCF dye moves throughout the colony when we know the bees do not like a diet. Diets were fed </w:t>
+      </w:r>
+      <w:r>
+        <w:rPr>
+          <w:rFonts w:ascii="Times New Roman" w:eastAsia="Times New Roman" w:hAnsi="Times New Roman" w:cs="Times New Roman"/>
+          <w:i/>
+          <w:iCs/>
+        </w:rPr>
+        <w:t>ad libitum</w:t>
+      </w:r>
+      <w:r>
+        <w:rPr>
+          <w:rFonts w:ascii="Times New Roman" w:eastAsia="Times New Roman" w:hAnsi="Times New Roman" w:cs="Times New Roman"/>
+        </w:rPr>
+        <w:t xml:space="preserve"> for 28 d. Nucs from each treatment group were spaced at least </w:t>
+      </w:r>
+      <w:r>
+        <w:rPr>
+          <w:rFonts w:ascii="Times New Roman" w:eastAsia="Times New Roman" w:hAnsi="Times New Roman" w:cs="Times New Roman"/>
+          <w:color w:val="000000" w:themeColor="text1"/>
+        </w:rPr>
+        <w:t xml:space="preserve">20 m apart </w:t>
+      </w:r>
+      <w:r>
+        <w:rPr>
+          <w:rFonts w:ascii="Times New Roman" w:eastAsia="Times New Roman" w:hAnsi="Times New Roman" w:cs="Times New Roman"/>
+        </w:rPr>
+        <w:t>to reduce the possibility of drifting (workers flying between colonies).</w:t>
+      </w:r>
+    </w:p>
+    <w:p>
+      <w:pPr>
+        <w:spacing w:line="480" w:lineRule="auto"/>
+        <w:ind w:firstLine="720"/>
+        <w:rPr>
+          <w:rFonts w:ascii="Times New Roman" w:hAnsi="Times New Roman" w:cs="Times New Roman"/>
+        </w:rPr>
+      </w:pPr>
+      <w:r>
+        <w:rPr>
+          <w:rFonts w:ascii="Times New Roman" w:eastAsia="Times New Roman" w:hAnsi="Times New Roman" w:cs="Times New Roman"/>
+        </w:rPr>
+        <w:t xml:space="preserve">We placed </w:t>
+      </w:r>
+      <w:r>
+        <w:rPr>
+          <w:rFonts w:ascii="Times New Roman" w:eastAsia="Times New Roman" w:hAnsi="Times New Roman" w:cs="Times New Roman"/>
+          <w:color w:val="000000" w:themeColor="text1"/>
+        </w:rPr>
+        <w:t>diets in petri dishes (</w:t>
+      </w:r>
+      <w:r>
+        <w:rPr>
+          <w:rFonts w:ascii="Times New Roman" w:eastAsia="Times New Roman" w:hAnsi="Times New Roman" w:cs="Times New Roman"/>
+        </w:rPr>
+        <w:t xml:space="preserve">11 cm diameter, 1 cm deep) to ensure we could see all bees interacting with the diets from above. Each petri dish contained 200 g of diet. </w:t>
+      </w:r>
+      <w:r>
+        <w:rPr>
+          <w:rFonts w:ascii="Times New Roman" w:eastAsia="Times New Roman" w:hAnsi="Times New Roman" w:cs="Times New Roman"/>
+          <w:color w:val="000000" w:themeColor="text1"/>
+        </w:rPr>
+        <w:t>The Crayola Model Magic clay weighed much less than the other diets so we placed the same surface area of clay in each petri dish</w:t>
+      </w:r>
+      <w:r>
+        <w:rPr>
+          <w:rFonts w:ascii="Times New Roman" w:eastAsia="Times New Roman" w:hAnsi="Times New Roman" w:cs="Times New Roman"/>
+          <w:color w:val="ED7D31" w:themeColor="accent2"/>
+        </w:rPr>
+        <w:t xml:space="preserve"> </w:t>
+      </w:r>
+      <w:commentRangeStart w:id="20"/>
+      <w:commentRangeStart w:id="21"/>
+      <w:r>
+        <w:rPr>
+          <w:rFonts w:ascii="Times New Roman" w:hAnsi="Times New Roman" w:cs="Times New Roman"/>
+        </w:rPr>
+        <w:t>(we used the same w:v ratio which was 86g to 200g AP23 or the same volume of 166.6 cm3)</w:t>
+      </w:r>
+      <w:r>
+        <w:rPr>
+          <w:rFonts w:ascii="Times New Roman" w:eastAsia="Times New Roman" w:hAnsi="Times New Roman" w:cs="Times New Roman"/>
+          <w:color w:val="ED7D31" w:themeColor="accent2"/>
+        </w:rPr>
+        <w:t xml:space="preserve"> </w:t>
+      </w:r>
+      <w:commentRangeEnd w:id="20"/>
+      <w:r>
+        <w:commentReference w:id="20"/>
+      </w:r>
+      <w:commentRangeEnd w:id="21"/>
+      <w:r>
+        <w:rPr>
+          <w:rStyle w:val="CommentReference"/>
+          <w:rFonts w:ascii="Times New Roman" w:eastAsia="Times New Roman" w:hAnsi="Times New Roman" w:cs="Times New Roman"/>
+        </w:rPr>
+        <w:commentReference w:id="21"/>
+      </w:r>
+      <w:r>
+        <w:rPr>
+          <w:rFonts w:ascii="Times New Roman" w:eastAsia="Times New Roman" w:hAnsi="Times New Roman" w:cs="Times New Roman"/>
+          <w:color w:val="000000" w:themeColor="text1"/>
+        </w:rPr>
+        <w:t>The clay patties were in petri dishes during the first week of the study, but because bees were not interacting with the clay patties, we took them out of the petri dishes and placed them directly on the top bars of the hives.</w:t>
+      </w:r>
+      <w:r>
+        <w:rPr>
+          <w:rFonts w:ascii="Times New Roman" w:eastAsia="Times New Roman" w:hAnsi="Times New Roman" w:cs="Times New Roman"/>
+          <w:color w:val="000000" w:themeColor="text1"/>
+        </w:rPr>
+        <w:t xml:space="preserve"> The negative and consumption controls were 100% effective with no dye present and the positive was 97.7% effective. </w:t>
+      </w:r>
+    </w:p>
+    <w:p>
+      <w:pPr>
+        <w:spacing w:line="480" w:lineRule="auto"/>
+        <w:rPr>
+          <w:rFonts w:ascii="Times New Roman" w:hAnsi="Times New Roman" w:cs="Times New Roman"/>
+        </w:rPr>
+      </w:pPr>
+    </w:p>
+    <w:p>
+      <w:pPr>
+        <w:spacing w:line="480" w:lineRule="auto"/>
+        <w:rPr>
+          <w:rFonts w:ascii="Times New Roman" w:hAnsi="Times New Roman" w:cs="Times New Roman"/>
           <w:b/>
           <w:bCs/>
           <w:i/>
           <w:iCs/>
         </w:rPr>
-        <w:t>Treatment Groups</w:t>
-      </w:r>
-    </w:p>
-    <w:p>
-      <w:pPr>
-        <w:spacing w:line="480" w:lineRule="auto"/>
-        <w:ind w:firstLine="720"/>
-        <w:rPr>
-          <w:rFonts w:ascii="Times New Roman" w:hAnsi="Times New Roman" w:cs="Times New Roman"/>
-        </w:rPr>
-      </w:pPr>
-      <w:r>
-        <w:rPr>
-          <w:rFonts w:ascii="Times New Roman" w:eastAsia="Times New Roman" w:hAnsi="Times New Roman" w:cs="Times New Roman"/>
-        </w:rPr>
-        <w:t xml:space="preserve">The treatment groups were as follows: (1) six colonies received AP23 (Dadant and Sons Inc., High Springs, FL, USA) mixed with Brilliant Blue FCF (also Erioglaucine A, Sigma </w:t>
-      </w:r>
-      <w:r>
-        <w:rPr>
-          <w:rFonts w:ascii="Times New Roman" w:eastAsia="Times New Roman" w:hAnsi="Times New Roman" w:cs="Times New Roman"/>
-        </w:rPr>
-        <w:lastRenderedPageBreak/>
-        <w:t xml:space="preserve">Aldrich Lot #SHBL4427), (2) three colonies received AP23 without dye (negative control), (3) three colonies received fondant mixed with Brilliant Blue FCF, and (4) three colonies received Crayola model magic clay (Crayola, LLC, Easton, PA, USA) mixed with Brilliant Blue FCF (consumption control). Brilliant Blue FCF was found to be non-toxic to adult </w:t>
-      </w:r>
-      <w:proofErr w:type="gramStart"/>
-      <w:r>
-        <w:rPr>
-          <w:rFonts w:ascii="Times New Roman" w:eastAsia="Times New Roman" w:hAnsi="Times New Roman" w:cs="Times New Roman"/>
-        </w:rPr>
-        <w:t>honey bees</w:t>
-      </w:r>
-      <w:proofErr w:type="gramEnd"/>
-      <w:r>
-        <w:rPr>
-          <w:rFonts w:ascii="Times New Roman" w:eastAsia="Times New Roman" w:hAnsi="Times New Roman" w:cs="Times New Roman"/>
-        </w:rPr>
-        <w:t xml:space="preserve"> when ingested (Ehrenberg et al. 2019, Noordyke et al. 2021). </w:t>
-      </w:r>
-      <w:proofErr w:type="gramStart"/>
-      <w:r>
-        <w:rPr>
-          <w:rFonts w:ascii="Times New Roman" w:eastAsia="Times New Roman" w:hAnsi="Times New Roman" w:cs="Times New Roman"/>
-        </w:rPr>
-        <w:t>Honey bees</w:t>
-      </w:r>
-      <w:proofErr w:type="gramEnd"/>
-      <w:r>
-        <w:rPr>
-          <w:rFonts w:ascii="Times New Roman" w:eastAsia="Times New Roman" w:hAnsi="Times New Roman" w:cs="Times New Roman"/>
-        </w:rPr>
-        <w:t xml:space="preserve"> will not eat Crayola Model Magic clay and in some cases will even eject it from the hive (Noordyke et al. 2021). Thus, we used it as a consumption control, which allows us to see how the Brilliant Blue FCF dye moves throughout the colony when we know the bees do not like a diet. Diets were fed </w:t>
-      </w:r>
-      <w:r>
-        <w:rPr>
-          <w:rFonts w:ascii="Times New Roman" w:eastAsia="Times New Roman" w:hAnsi="Times New Roman" w:cs="Times New Roman"/>
-          <w:i/>
-          <w:iCs/>
-        </w:rPr>
-        <w:t>ad libitum</w:t>
-      </w:r>
-      <w:r>
-        <w:rPr>
-          <w:rFonts w:ascii="Times New Roman" w:eastAsia="Times New Roman" w:hAnsi="Times New Roman" w:cs="Times New Roman"/>
-        </w:rPr>
-        <w:t xml:space="preserve"> for 28 d. Nucs from each treatment group were spaced at least </w:t>
-      </w:r>
-      <w:r>
-        <w:rPr>
-          <w:rFonts w:ascii="Times New Roman" w:eastAsia="Times New Roman" w:hAnsi="Times New Roman" w:cs="Times New Roman"/>
-          <w:color w:val="000000" w:themeColor="text1"/>
-        </w:rPr>
-        <w:t xml:space="preserve">20 m apart </w:t>
-      </w:r>
-      <w:r>
-        <w:rPr>
-          <w:rFonts w:ascii="Times New Roman" w:eastAsia="Times New Roman" w:hAnsi="Times New Roman" w:cs="Times New Roman"/>
-        </w:rPr>
-        <w:t>to reduce the possibility of drifting (workers flying between colonies).</w:t>
-      </w:r>
-    </w:p>
-    <w:p>
-      <w:pPr>
-        <w:spacing w:line="480" w:lineRule="auto"/>
-        <w:ind w:firstLine="720"/>
-        <w:rPr>
-          <w:rFonts w:ascii="Times New Roman" w:hAnsi="Times New Roman" w:cs="Times New Roman"/>
-        </w:rPr>
-      </w:pPr>
-      <w:r>
-        <w:rPr>
-          <w:rFonts w:ascii="Times New Roman" w:eastAsia="Times New Roman" w:hAnsi="Times New Roman" w:cs="Times New Roman"/>
-        </w:rPr>
-        <w:t xml:space="preserve">We placed </w:t>
-      </w:r>
-      <w:r>
-        <w:rPr>
-          <w:rFonts w:ascii="Times New Roman" w:eastAsia="Times New Roman" w:hAnsi="Times New Roman" w:cs="Times New Roman"/>
-          <w:color w:val="000000" w:themeColor="text1"/>
-        </w:rPr>
-        <w:t>diets in petri dishes (</w:t>
-      </w:r>
-      <w:r>
-        <w:rPr>
-          <w:rFonts w:ascii="Times New Roman" w:eastAsia="Times New Roman" w:hAnsi="Times New Roman" w:cs="Times New Roman"/>
-        </w:rPr>
-        <w:t xml:space="preserve">11 cm diameter, 1 cm deep) to ensure we could see all bees interacting with the diets from above. Each petri dish contained 200 g of diet. </w:t>
-      </w:r>
-      <w:r>
-        <w:rPr>
-          <w:rFonts w:ascii="Times New Roman" w:eastAsia="Times New Roman" w:hAnsi="Times New Roman" w:cs="Times New Roman"/>
-          <w:color w:val="000000" w:themeColor="text1"/>
-        </w:rPr>
-        <w:t>The Crayola Model Magic clay weighed much less than the other diets so we placed the same surface area of clay in each petri dish</w:t>
-      </w:r>
-      <w:r>
-        <w:rPr>
-          <w:rFonts w:ascii="Times New Roman" w:eastAsia="Times New Roman" w:hAnsi="Times New Roman" w:cs="Times New Roman"/>
-          <w:color w:val="ED7D31" w:themeColor="accent2"/>
-        </w:rPr>
-        <w:t xml:space="preserve"> </w:t>
-      </w:r>
-      <w:commentRangeStart w:id="20"/>
-      <w:r>
-        <w:rPr>
-          <w:rFonts w:ascii="Times New Roman" w:eastAsia="Times New Roman" w:hAnsi="Times New Roman" w:cs="Times New Roman"/>
-          <w:color w:val="ED7D31" w:themeColor="accent2"/>
-        </w:rPr>
-        <w:t>(we used the same w:v ratio which was 86g to 200g AP23 or the same volume of 166.6 cm</w:t>
-      </w:r>
-      <w:r>
-        <w:rPr>
-          <w:rFonts w:ascii="Times New Roman" w:eastAsia="Times New Roman" w:hAnsi="Times New Roman" w:cs="Times New Roman"/>
-          <w:color w:val="ED7D31" w:themeColor="accent2"/>
-          <w:vertAlign w:val="superscript"/>
-        </w:rPr>
-        <w:t>3</w:t>
-      </w:r>
-      <w:r>
-        <w:rPr>
-          <w:rFonts w:ascii="Times New Roman" w:eastAsia="Times New Roman" w:hAnsi="Times New Roman" w:cs="Times New Roman"/>
-          <w:color w:val="ED7D31" w:themeColor="accent2"/>
-        </w:rPr>
-        <w:t xml:space="preserve">) </w:t>
-      </w:r>
-      <w:commentRangeEnd w:id="20"/>
-      <w:r>
-        <w:commentReference w:id="20"/>
-      </w:r>
-      <w:r>
-        <w:rPr>
-          <w:rFonts w:ascii="Times New Roman" w:eastAsia="Times New Roman" w:hAnsi="Times New Roman" w:cs="Times New Roman"/>
-          <w:color w:val="000000" w:themeColor="text1"/>
-        </w:rPr>
-        <w:t>The clay patties were in petri dishes during the first week of the study, but because bees were not interacting with the clay patties, we took them out of the petri dishes and placed them directly on the top bars of the hives.</w:t>
-      </w:r>
-      <w:r>
-        <w:rPr>
-          <w:rFonts w:ascii="Times New Roman" w:eastAsia="Times New Roman" w:hAnsi="Times New Roman" w:cs="Times New Roman"/>
-          <w:color w:val="000000" w:themeColor="text1"/>
-        </w:rPr>
-        <w:t xml:space="preserve"> The negative and consumption controls were 100% effective with no dye present and the positive was 97.7% effective. </w:t>
-      </w:r>
-    </w:p>
-    <w:p>
-      <w:pPr>
-        <w:spacing w:line="480" w:lineRule="auto"/>
-        <w:rPr>
-          <w:rFonts w:ascii="Times New Roman" w:hAnsi="Times New Roman" w:cs="Times New Roman"/>
-        </w:rPr>
-      </w:pPr>
-    </w:p>
-    <w:p>
-      <w:pPr>
-        <w:spacing w:line="480" w:lineRule="auto"/>
-        <w:rPr>
-          <w:rFonts w:ascii="Times New Roman" w:hAnsi="Times New Roman" w:cs="Times New Roman"/>
+      </w:pPr>
+      <w:r>
+        <w:rPr>
+          <w:rFonts w:ascii="Times New Roman" w:eastAsia="Times New Roman" w:hAnsi="Times New Roman" w:cs="Times New Roman"/>
           <w:b/>
           <w:bCs/>
           <w:i/>
           <w:iCs/>
         </w:rPr>
-      </w:pPr>
-      <w:r>
-        <w:rPr>
-          <w:rFonts w:ascii="Times New Roman" w:eastAsia="Times New Roman" w:hAnsi="Times New Roman" w:cs="Times New Roman"/>
+        <w:t>Sample and Data Collection</w:t>
+      </w:r>
+    </w:p>
+    <w:p>
+      <w:pPr>
+        <w:spacing w:line="480" w:lineRule="auto"/>
+        <w:ind w:firstLine="720"/>
+        <w:rPr>
+          <w:rFonts w:ascii="Times New Roman" w:hAnsi="Times New Roman" w:cs="Times New Roman"/>
+        </w:rPr>
+      </w:pPr>
+      <w:r>
+        <w:rPr>
+          <w:rFonts w:ascii="Times New Roman" w:eastAsia="Times New Roman" w:hAnsi="Times New Roman" w:cs="Times New Roman"/>
+        </w:rPr>
+        <w:t xml:space="preserve">We monitored colonies for 28 d. We began sampling and data collection between 09:30 and 11:30 every day. Upon opening each colony, diets were checked for the number of painted bees interacting with the diets (interacting meaning either proboscis touching the diet surface or </w:t>
+      </w:r>
+      <w:r>
+        <w:rPr>
+          <w:rFonts w:ascii="Times New Roman" w:eastAsia="Times New Roman" w:hAnsi="Times New Roman" w:cs="Times New Roman"/>
+        </w:rPr>
+        <w:lastRenderedPageBreak/>
+        <w:t xml:space="preserve">mandibles chewing the diet). We also estimated the percent surface area remaining of each diet when counting painted bees interacting with the diets. The </w:t>
+      </w:r>
+      <w:r>
+        <w:rPr>
+          <w:rFonts w:ascii="Times New Roman" w:eastAsia="Times New Roman" w:hAnsi="Times New Roman" w:cs="Times New Roman"/>
+        </w:rPr>
+        <w:t xml:space="preserve">estimated </w:t>
+      </w:r>
+      <w:r>
+        <w:rPr>
+          <w:rFonts w:ascii="Times New Roman" w:eastAsia="Times New Roman" w:hAnsi="Times New Roman" w:cs="Times New Roman"/>
+        </w:rPr>
+        <w:t>percent</w:t>
+      </w:r>
+      <w:r>
+        <w:rPr>
+          <w:rFonts w:ascii="Times New Roman" w:eastAsia="Times New Roman" w:hAnsi="Times New Roman" w:cs="Times New Roman"/>
+        </w:rPr>
+        <w:t>age</w:t>
+      </w:r>
+      <w:r>
+        <w:rPr>
+          <w:rFonts w:ascii="Times New Roman" w:eastAsia="Times New Roman" w:hAnsi="Times New Roman" w:cs="Times New Roman"/>
+        </w:rPr>
+        <w:t xml:space="preserve"> area remaining was recorded as 0%, 25%, 50%, 75%, or 100%.</w:t>
+      </w:r>
+    </w:p>
+    <w:p>
+      <w:pPr>
+        <w:spacing w:line="480" w:lineRule="auto"/>
+        <w:ind w:firstLine="720"/>
+        <w:rPr>
+          <w:rFonts w:ascii="Times New Roman" w:hAnsi="Times New Roman" w:cs="Times New Roman"/>
+        </w:rPr>
+      </w:pPr>
+      <w:r>
+        <w:rPr>
+          <w:rFonts w:ascii="Times New Roman" w:eastAsia="Times New Roman" w:hAnsi="Times New Roman" w:cs="Times New Roman"/>
+        </w:rPr>
+        <w:t>We systematically collected 20 painted bees from each colony every day for 28 d. We collected two painted bees per side of each of five frames. Many colonies had fewer than two painted bees per side of each frame during the last week of the study. In this case, we collected more than two painted bees on the next nearest frame until we had a full sample. Some days near the end of the study, we would not find 20 painted bees in a colony and would collect as many as we could find to get a partial sample. If we could not find any painted bees in a colony for two days in a row, then we took the colony out of the study. Bee samples were stored in the freezer at -6°C.</w:t>
+      </w:r>
+    </w:p>
+    <w:p>
+      <w:pPr>
+        <w:spacing w:line="480" w:lineRule="auto"/>
+        <w:rPr>
+          <w:rFonts w:ascii="Times New Roman" w:hAnsi="Times New Roman" w:cs="Times New Roman"/>
+        </w:rPr>
+      </w:pPr>
+    </w:p>
+    <w:p>
+      <w:pPr>
+        <w:spacing w:line="480" w:lineRule="auto"/>
+        <w:rPr>
+          <w:rFonts w:ascii="Times New Roman" w:hAnsi="Times New Roman" w:cs="Times New Roman"/>
           <w:b/>
           <w:bCs/>
           <w:i/>
           <w:iCs/>
         </w:rPr>
-        <w:t>Sample and Data Collection</w:t>
-      </w:r>
-    </w:p>
-    <w:p>
-      <w:pPr>
-        <w:spacing w:line="480" w:lineRule="auto"/>
-        <w:ind w:firstLine="720"/>
-        <w:rPr>
-          <w:rFonts w:ascii="Times New Roman" w:hAnsi="Times New Roman" w:cs="Times New Roman"/>
-        </w:rPr>
-      </w:pPr>
-      <w:r>
-        <w:rPr>
-          <w:rFonts w:ascii="Times New Roman" w:eastAsia="Times New Roman" w:hAnsi="Times New Roman" w:cs="Times New Roman"/>
-        </w:rPr>
-        <w:t xml:space="preserve">We monitored colonies for 28 d. We began sampling and data collection between 09:30 and 11:30 every day. Upon opening each colony, diets were checked for the number of painted bees interacting with the diets (interacting meaning either proboscis touching the diet surface or </w:t>
-      </w:r>
-      <w:r>
-        <w:rPr>
-          <w:rFonts w:ascii="Times New Roman" w:eastAsia="Times New Roman" w:hAnsi="Times New Roman" w:cs="Times New Roman"/>
-        </w:rPr>
-        <w:lastRenderedPageBreak/>
-        <w:t xml:space="preserve">mandibles chewing the diet). We also estimated the percent surface area remaining of each diet when counting painted bees interacting with the diets. The </w:t>
-      </w:r>
-      <w:r>
-        <w:rPr>
-          <w:rFonts w:ascii="Times New Roman" w:eastAsia="Times New Roman" w:hAnsi="Times New Roman" w:cs="Times New Roman"/>
-        </w:rPr>
-        <w:t xml:space="preserve">estimated </w:t>
-      </w:r>
-      <w:r>
-        <w:rPr>
-          <w:rFonts w:ascii="Times New Roman" w:eastAsia="Times New Roman" w:hAnsi="Times New Roman" w:cs="Times New Roman"/>
-        </w:rPr>
-        <w:t>percent</w:t>
-      </w:r>
-      <w:r>
-        <w:rPr>
-          <w:rFonts w:ascii="Times New Roman" w:eastAsia="Times New Roman" w:hAnsi="Times New Roman" w:cs="Times New Roman"/>
-        </w:rPr>
-        <w:t>age</w:t>
-      </w:r>
-      <w:r>
-        <w:rPr>
-          <w:rFonts w:ascii="Times New Roman" w:eastAsia="Times New Roman" w:hAnsi="Times New Roman" w:cs="Times New Roman"/>
-        </w:rPr>
-        <w:t xml:space="preserve"> area remaining was recorded as 0%, 25%, 50%, 75%, or 100%.</w:t>
-      </w:r>
-    </w:p>
-    <w:p>
-      <w:pPr>
-        <w:spacing w:line="480" w:lineRule="auto"/>
-        <w:ind w:firstLine="720"/>
-        <w:rPr>
-          <w:rFonts w:ascii="Times New Roman" w:hAnsi="Times New Roman" w:cs="Times New Roman"/>
-        </w:rPr>
-      </w:pPr>
-      <w:r>
-        <w:rPr>
-          <w:rFonts w:ascii="Times New Roman" w:eastAsia="Times New Roman" w:hAnsi="Times New Roman" w:cs="Times New Roman"/>
-        </w:rPr>
-        <w:t xml:space="preserve">We systematically collected 20 painted bees from each colony every day for 28 d. We collected two painted bees per side of each of </w:t>
-      </w:r>
-      <w:proofErr w:type="gramStart"/>
-      <w:r>
-        <w:rPr>
-          <w:rFonts w:ascii="Times New Roman" w:eastAsia="Times New Roman" w:hAnsi="Times New Roman" w:cs="Times New Roman"/>
-        </w:rPr>
-        <w:t>five</w:t>
-      </w:r>
-      <w:proofErr w:type="gramEnd"/>
-      <w:r>
-        <w:rPr>
-          <w:rFonts w:ascii="Times New Roman" w:eastAsia="Times New Roman" w:hAnsi="Times New Roman" w:cs="Times New Roman"/>
-        </w:rPr>
-        <w:t xml:space="preserve"> frames. Many colonies had fewer than two painted bees per side of each frame during the last week of the study. In this case, we collected more than two painted bees on the next nearest frame until we had a full sample. Some days near the end of the study, we would not find 20 painted bees in a colony and would collect as many as we could find to get a partial sample. If we could not find any painted bees in a colony for two days in a row, then we took the colony out of the study. Bee samples were stored in the freezer at -6°C.</w:t>
-      </w:r>
-    </w:p>
-    <w:p>
-      <w:pPr>
-        <w:spacing w:line="480" w:lineRule="auto"/>
-        <w:rPr>
-          <w:rFonts w:ascii="Times New Roman" w:hAnsi="Times New Roman" w:cs="Times New Roman"/>
-        </w:rPr>
-      </w:pPr>
-    </w:p>
-    <w:p>
-      <w:pPr>
-        <w:spacing w:line="480" w:lineRule="auto"/>
-        <w:rPr>
-          <w:rFonts w:ascii="Times New Roman" w:hAnsi="Times New Roman" w:cs="Times New Roman"/>
+      </w:pPr>
+      <w:r>
+        <w:rPr>
+          <w:rFonts w:ascii="Times New Roman" w:eastAsia="Times New Roman" w:hAnsi="Times New Roman" w:cs="Times New Roman"/>
           <w:b/>
           <w:bCs/>
           <w:i/>
           <w:iCs/>
         </w:rPr>
-      </w:pPr>
-      <w:r>
-        <w:rPr>
-          <w:rFonts w:ascii="Times New Roman" w:eastAsia="Times New Roman" w:hAnsi="Times New Roman" w:cs="Times New Roman"/>
+        <w:t>Dye Extraction</w:t>
+      </w:r>
+    </w:p>
+    <w:p>
+      <w:pPr>
+        <w:spacing w:line="480" w:lineRule="auto"/>
+        <w:ind w:firstLine="720"/>
+        <w:rPr>
+          <w:rFonts w:ascii="Times New Roman" w:hAnsi="Times New Roman" w:cs="Times New Roman"/>
+        </w:rPr>
+      </w:pPr>
+      <w:r>
+        <w:rPr>
+          <w:rFonts w:ascii="Times New Roman" w:eastAsia="Times New Roman" w:hAnsi="Times New Roman" w:cs="Times New Roman"/>
+        </w:rPr>
+        <w:t>We extracted dye from worker bee abdomens using methods from Noordyke et al. (2021). Two observers visually inspected samples for the presence of dye by holding vials over a white surface under the same lighting conditions.</w:t>
+      </w:r>
+      <w:r>
+        <w:rPr>
+          <w:rFonts w:ascii="Times New Roman" w:eastAsia="Times New Roman" w:hAnsi="Times New Roman" w:cs="Times New Roman"/>
+        </w:rPr>
+        <w:t xml:space="preserve"> Only samples in which the two visual graders agreed were included in our statistical analysis.</w:t>
+      </w:r>
+    </w:p>
+    <w:p>
+      <w:pPr>
+        <w:spacing w:line="480" w:lineRule="auto"/>
+        <w:rPr>
+          <w:rFonts w:ascii="Times New Roman" w:hAnsi="Times New Roman" w:cs="Times New Roman"/>
+        </w:rPr>
+      </w:pPr>
+    </w:p>
+    <w:p>
+      <w:pPr>
+        <w:spacing w:line="480" w:lineRule="auto"/>
+        <w:rPr>
+          <w:rFonts w:ascii="Times New Roman" w:hAnsi="Times New Roman" w:cs="Times New Roman"/>
           <w:b/>
           <w:bCs/>
           <w:i/>
           <w:iCs/>
         </w:rPr>
-        <w:t>Dye Extraction</w:t>
-      </w:r>
-    </w:p>
-    <w:p>
-      <w:pPr>
-        <w:spacing w:line="480" w:lineRule="auto"/>
-        <w:ind w:firstLine="720"/>
-        <w:rPr>
-          <w:rFonts w:ascii="Times New Roman" w:hAnsi="Times New Roman" w:cs="Times New Roman"/>
-        </w:rPr>
-      </w:pPr>
-      <w:r>
-        <w:rPr>
-          <w:rFonts w:ascii="Times New Roman" w:eastAsia="Times New Roman" w:hAnsi="Times New Roman" w:cs="Times New Roman"/>
-        </w:rPr>
-        <w:t>We extracted dye from worker bee abdomens using methods from Noordyke et al. (2021). Two observers visually inspected samples for the presence of dye by holding vials over a white surface under the same lighting conditions.</w:t>
-      </w:r>
-      <w:r>
-        <w:rPr>
-          <w:rFonts w:ascii="Times New Roman" w:eastAsia="Times New Roman" w:hAnsi="Times New Roman" w:cs="Times New Roman"/>
-        </w:rPr>
-        <w:t xml:space="preserve"> Only samples in which the two visual graders agreed were included in our statistical analysis.</w:t>
-      </w:r>
-    </w:p>
-    <w:p>
-      <w:pPr>
-        <w:spacing w:line="480" w:lineRule="auto"/>
-        <w:rPr>
-          <w:rFonts w:ascii="Times New Roman" w:hAnsi="Times New Roman" w:cs="Times New Roman"/>
-        </w:rPr>
-      </w:pPr>
-    </w:p>
-    <w:p>
-      <w:pPr>
-        <w:spacing w:line="480" w:lineRule="auto"/>
-        <w:rPr>
-          <w:rFonts w:ascii="Times New Roman" w:hAnsi="Times New Roman" w:cs="Times New Roman"/>
+      </w:pPr>
+      <w:r>
+        <w:rPr>
+          <w:rFonts w:ascii="Times New Roman" w:eastAsia="Times New Roman" w:hAnsi="Times New Roman" w:cs="Times New Roman"/>
           <w:b/>
           <w:bCs/>
           <w:i/>
           <w:iCs/>
         </w:rPr>
-      </w:pPr>
-      <w:r>
-        <w:rPr>
-          <w:rFonts w:ascii="Times New Roman" w:eastAsia="Times New Roman" w:hAnsi="Times New Roman" w:cs="Times New Roman"/>
-          <w:b/>
-          <w:bCs/>
+        <w:t>Statistical Analysis</w:t>
+      </w:r>
+    </w:p>
+    <w:p>
+      <w:pPr>
+        <w:spacing w:line="480" w:lineRule="auto"/>
+        <w:rPr>
+          <w:rFonts w:ascii="Times New Roman" w:hAnsi="Times New Roman" w:cs="Times New Roman"/>
           <w:i/>
           <w:iCs/>
         </w:rPr>
-        <w:t>Statistical Analysis</w:t>
-      </w:r>
-    </w:p>
-    <w:p>
-      <w:pPr>
-        <w:spacing w:line="480" w:lineRule="auto"/>
-        <w:rPr>
-          <w:rFonts w:ascii="Times New Roman" w:hAnsi="Times New Roman" w:cs="Times New Roman"/>
+      </w:pPr>
+      <w:commentRangeStart w:id="22"/>
+      <w:r>
+        <w:rPr>
+          <w:rFonts w:ascii="Times New Roman" w:eastAsia="Times New Roman" w:hAnsi="Times New Roman" w:cs="Times New Roman"/>
           <w:i/>
           <w:iCs/>
         </w:rPr>
-      </w:pPr>
-      <w:commentRangeStart w:id="21"/>
-      <w:r>
-        <w:rPr>
-          <w:rFonts w:ascii="Times New Roman" w:eastAsia="Times New Roman" w:hAnsi="Times New Roman" w:cs="Times New Roman"/>
-          <w:i/>
-          <w:iCs/>
-        </w:rPr>
         <w:t>Model selection</w:t>
       </w:r>
-      <w:commentRangeEnd w:id="21"/>
-      <w:r>
-        <w:commentReference w:id="21"/>
+      <w:commentRangeEnd w:id="22"/>
+      <w:r>
+        <w:commentReference w:id="22"/>
       </w:r>
     </w:p>
     <w:p>
@@ -2067,63 +1693,7 @@
         <w:rPr>
           <w:rFonts w:ascii="Times New Roman" w:eastAsia="Times New Roman" w:hAnsi="Times New Roman" w:cs="Times New Roman"/>
         </w:rPr>
-        <w:t xml:space="preserve"> − minimum AICc), and AICc weight with </w:t>
-      </w:r>
-      <w:proofErr w:type="gramStart"/>
-      <w:r>
-        <w:rPr>
-          <w:rFonts w:ascii="Times New Roman" w:eastAsia="Times New Roman" w:hAnsi="Times New Roman" w:cs="Times New Roman"/>
-        </w:rPr>
-        <w:t>MuMIn::</w:t>
-      </w:r>
-      <w:proofErr w:type="gramEnd"/>
-      <w:r>
-        <w:rPr>
-          <w:rFonts w:ascii="Times New Roman" w:eastAsia="Times New Roman" w:hAnsi="Times New Roman" w:cs="Times New Roman"/>
-        </w:rPr>
-        <w:t xml:space="preserve">model.sel (Bartoń 2022). We considered models with smaller AICc values and fewer predictor variables to be more parsimonious (Burnham and Anderson 2004). We averaged our top models using </w:t>
-      </w:r>
-      <w:proofErr w:type="gramStart"/>
-      <w:r>
-        <w:rPr>
-          <w:rFonts w:ascii="Times New Roman" w:eastAsia="Times New Roman" w:hAnsi="Times New Roman" w:cs="Times New Roman"/>
-        </w:rPr>
-        <w:t>MuMIn::</w:t>
-      </w:r>
-      <w:proofErr w:type="gramEnd"/>
-      <w:r>
-        <w:rPr>
-          <w:rFonts w:ascii="Times New Roman" w:eastAsia="Times New Roman" w:hAnsi="Times New Roman" w:cs="Times New Roman"/>
-        </w:rPr>
-        <w:t xml:space="preserve">model_avg (Bartoń 2022) and then selected the full average, or zero method, to account for high model selection uncertainty (Grueber et al. 2011; Symonds and Moussalli 2011). We examined estimate sizes from the averaged model to identify the important variables for our system and select the most parsimonious model for the rest of the analysis. With the most parsimonious model for each experiment, Estimated Marginal Means (EMMs) and 95% confidence intervals of the response variables were calculated across worker age using </w:t>
-      </w:r>
-      <w:proofErr w:type="gramStart"/>
-      <w:r>
-        <w:rPr>
-          <w:rFonts w:ascii="Times New Roman" w:eastAsia="Times New Roman" w:hAnsi="Times New Roman" w:cs="Times New Roman"/>
-        </w:rPr>
-        <w:t>emmeans::</w:t>
-      </w:r>
-      <w:proofErr w:type="gramEnd"/>
-      <w:r>
-        <w:rPr>
-          <w:rFonts w:ascii="Times New Roman" w:eastAsia="Times New Roman" w:hAnsi="Times New Roman" w:cs="Times New Roman"/>
-        </w:rPr>
-        <w:t xml:space="preserve">emmeans (Lenth 2022). We visually assessed various model assumptions for our most parsimonious models using simulated residuals in </w:t>
-      </w:r>
-      <w:proofErr w:type="gramStart"/>
-      <w:r>
-        <w:rPr>
-          <w:rFonts w:ascii="Times New Roman" w:eastAsia="Times New Roman" w:hAnsi="Times New Roman" w:cs="Times New Roman"/>
-        </w:rPr>
-        <w:t>DHARMa::</w:t>
-      </w:r>
-      <w:proofErr w:type="gramEnd"/>
-      <w:r>
-        <w:rPr>
-          <w:rFonts w:ascii="Times New Roman" w:eastAsia="Times New Roman" w:hAnsi="Times New Roman" w:cs="Times New Roman"/>
-        </w:rPr>
-        <w:t xml:space="preserve"> simulateResiduals (Hartig 2022).</w:t>
+        <w:t xml:space="preserve"> − minimum AICc), and AICc weight with MuMIn::model.sel (Bartoń 2022). We considered models with smaller AICc values and fewer predictor variables to be more parsimonious (Burnham and Anderson 2004). We averaged our top models using MuMIn::model_avg (Bartoń 2022) and then selected the full average, or zero method, to account for high model selection uncertainty (Grueber et al. 2011; Symonds and Moussalli 2011). We examined estimate sizes from the averaged model to identify the important variables for our system and select the most parsimonious model for the rest of the analysis. With the most parsimonious model for each experiment, Estimated Marginal Means (EMMs) and 95% confidence intervals of the response variables were calculated across worker age using emmeans::emmeans (Lenth 2022). We visually assessed various model assumptions for our most parsimonious models using simulated residuals in DHARMa:: simulateResiduals (Hartig 2022).</w:t>
       </w:r>
     </w:p>
     <w:p>
@@ -2184,35 +1754,7 @@
           <w:rFonts w:ascii="Times New Roman" w:eastAsia="Times New Roman" w:hAnsi="Times New Roman" w:cs="Times New Roman"/>
         </w:rPr>
         <w:lastRenderedPageBreak/>
-        <w:t xml:space="preserve">and humidity (%) (Clarke and Robert 2018; Wang et al. 2009). Additionally, we visualized the correlation between environmental variables using a correlation matrix and </w:t>
-      </w:r>
-      <w:proofErr w:type="gramStart"/>
-      <w:r>
-        <w:rPr>
-          <w:rFonts w:ascii="Times New Roman" w:eastAsia="Times New Roman" w:hAnsi="Times New Roman" w:cs="Times New Roman"/>
-        </w:rPr>
-        <w:t>corrplot::</w:t>
-      </w:r>
-      <w:proofErr w:type="gramEnd"/>
-      <w:r>
-        <w:rPr>
-          <w:rFonts w:ascii="Times New Roman" w:eastAsia="Times New Roman" w:hAnsi="Times New Roman" w:cs="Times New Roman"/>
-        </w:rPr>
-        <w:t xml:space="preserve">corrplot in R (version 1.4.3) to avoid selecting highly correlated variables in our models. For comparisons, we scaled all environmental variables to have a mean of zero and a one-unit increase </w:t>
-      </w:r>
-      <w:proofErr w:type="gramStart"/>
-      <w:r>
-        <w:rPr>
-          <w:rFonts w:ascii="Times New Roman" w:eastAsia="Times New Roman" w:hAnsi="Times New Roman" w:cs="Times New Roman"/>
-        </w:rPr>
-        <w:t>represent</w:t>
-      </w:r>
-      <w:proofErr w:type="gramEnd"/>
-      <w:r>
-        <w:rPr>
-          <w:rFonts w:ascii="Times New Roman" w:eastAsia="Times New Roman" w:hAnsi="Times New Roman" w:cs="Times New Roman"/>
-        </w:rPr>
-        <w:t xml:space="preserve"> an increase of one standard deviation. </w:t>
+        <w:t xml:space="preserve">and humidity (%) (Clarke and Robert 2018; Wang et al. 2009). Additionally, we visualized the correlation between environmental variables using a correlation matrix and corrplot::corrplot in R (version 1.4.3) to avoid selecting highly correlated variables in our models. For comparisons, we scaled all environmental variables to have a mean of zero and a one-unit increase represent an increase of one standard deviation. </w:t>
       </w:r>
     </w:p>
     <w:p>
@@ -2227,21 +1769,7 @@
         <w:rPr>
           <w:rFonts w:ascii="Times New Roman" w:eastAsia="Times New Roman" w:hAnsi="Times New Roman" w:cs="Times New Roman"/>
         </w:rPr>
-        <w:t xml:space="preserve">We evaluated the effect of the environmental variables on each experiment in our system by visually assessing a plot of each unscaled environmental variable against the residuals of a generalized linear mixed effects model containing all components of the corresponding full model, except for the environmental variable being evaluated. We examined the direction and steepness of a slope from a generalized linear model that represented the relationship between each environmental variable and our system. Slopes nearly or equal to zero indicated a negligible effect of the environmental variable. We elected to assess each environmental variable against the residuals of our selected models instead of raw means of each response variable to account for the various terms and random effects in our models, </w:t>
-      </w:r>
-      <w:proofErr w:type="gramStart"/>
-      <w:r>
-        <w:rPr>
-          <w:rFonts w:ascii="Times New Roman" w:eastAsia="Times New Roman" w:hAnsi="Times New Roman" w:cs="Times New Roman"/>
-        </w:rPr>
-        <w:t>similar to</w:t>
-      </w:r>
-      <w:proofErr w:type="gramEnd"/>
-      <w:r>
-        <w:rPr>
-          <w:rFonts w:ascii="Times New Roman" w:eastAsia="Times New Roman" w:hAnsi="Times New Roman" w:cs="Times New Roman"/>
-        </w:rPr>
-        <w:t xml:space="preserve"> how the averaged model estimates were calculated.</w:t>
+        <w:t>We evaluated the effect of the environmental variables on each experiment in our system by visually assessing a plot of each unscaled environmental variable against the residuals of a generalized linear mixed effects model containing all components of the corresponding full model, except for the environmental variable being evaluated. We examined the direction and steepness of a slope from a generalized linear model that represented the relationship between each environmental variable and our system. Slopes nearly or equal to zero indicated a negligible effect of the environmental variable. We elected to assess each environmental variable against the residuals of our selected models instead of raw means of each response variable to account for the various terms and random effects in our models, similar to how the averaged model estimates were calculated.</w:t>
       </w:r>
     </w:p>
     <w:p>
@@ -2273,18 +1801,90 @@
           <w:i/>
           <w:iCs/>
         </w:rPr>
-        <w:t xml:space="preserve">Dye presence in bee </w:t>
-      </w:r>
-      <w:proofErr w:type="gramStart"/>
-      <w:r>
-        <w:rPr>
-          <w:rFonts w:ascii="Times New Roman" w:eastAsia="Times New Roman" w:hAnsi="Times New Roman" w:cs="Times New Roman"/>
+        <w:t>Dye presence in bee guts</w:t>
+      </w:r>
+    </w:p>
+    <w:p>
+      <w:pPr>
+        <w:spacing w:line="480" w:lineRule="auto"/>
+        <w:ind w:firstLine="720"/>
+        <w:rPr>
+          <w:rFonts w:ascii="Times New Roman" w:hAnsi="Times New Roman" w:cs="Times New Roman"/>
+        </w:rPr>
+      </w:pPr>
+      <w:r>
+        <w:rPr>
+          <w:rFonts w:ascii="Times New Roman" w:eastAsia="Times New Roman" w:hAnsi="Times New Roman" w:cs="Times New Roman"/>
+        </w:rPr>
+        <w:t xml:space="preserve">To examine dye presence in bee guts across worker age, we constructed models with a binomial distribution (1 = dye present, 0 = dye absent) and dye presence as the response variable. We selected worker age as linear and quadratic fixed effect predictor variables in our full model. We included the quadratic term based on our prediction that dye presence would peak at days five to </w:t>
+      </w:r>
+      <w:r>
+        <w:rPr>
+          <w:rFonts w:ascii="Times New Roman" w:eastAsia="Times New Roman" w:hAnsi="Times New Roman" w:cs="Times New Roman"/>
+        </w:rPr>
+        <w:t>nine</w:t>
+      </w:r>
+      <w:r>
+        <w:rPr>
+          <w:rFonts w:ascii="Times New Roman" w:eastAsia="Times New Roman" w:hAnsi="Times New Roman" w:cs="Times New Roman"/>
+        </w:rPr>
+        <w:t xml:space="preserve"> Additionally, we included the four environmental variables of interest as fixed effect covariates. We summarized the average value of each variable for the 23 hours preceding </w:t>
+      </w:r>
+      <w:r>
+        <w:rPr>
+          <w:rFonts w:ascii="Times New Roman" w:eastAsia="Times New Roman" w:hAnsi="Times New Roman" w:cs="Times New Roman"/>
+        </w:rPr>
+        <w:lastRenderedPageBreak/>
+        <w:t xml:space="preserve">sampling </w:t>
+      </w:r>
+      <w:commentRangeStart w:id="23"/>
+      <w:commentRangeStart w:id="24"/>
+      <w:r>
+        <w:rPr>
+          <w:rFonts w:ascii="Times New Roman" w:eastAsia="Times New Roman" w:hAnsi="Times New Roman" w:cs="Times New Roman"/>
+        </w:rPr>
+        <w:t>(12:00 day n-1 – 11:00 day n)</w:t>
+      </w:r>
+      <w:commentRangeEnd w:id="23"/>
+      <w:commentRangeEnd w:id="24"/>
+      <w:r>
+        <w:commentReference w:id="23"/>
+      </w:r>
+      <w:r>
+        <w:commentReference w:id="24"/>
+      </w:r>
+      <w:r>
+        <w:rPr>
+          <w:rFonts w:ascii="Times New Roman" w:eastAsia="Times New Roman" w:hAnsi="Times New Roman" w:cs="Times New Roman"/>
+        </w:rPr>
+        <w:t>. To account for time-dependent colony effects, we adopted a colony random effect with a first-order autoregressive (AR1) correlation structure. An AR1 correlation structure accounts for higher correlation in time points closer together (Shan et al. 2020). From our full model, we created subsequent models with all possible combinations of environmental covariates (Symonds and Moussalli 2011) and a variety of null models with (1) a colony random effect without AR1 correlation structure, (2) only weather variables, (3) no quadratic age fixed effect predictor variable, and (4) no predictor variables (response ~ 1). All 20 models were constructed with glmmTMB::glmmTMB (Brooks et al. 2017) and underwent model selection with AICc (Table 1). We initially examined all models within ∆i &lt; 6 (Richards 2005).  However, 15 of our 20 models were within ∆i &lt; 6 and our goal of model selection was not met. Thus, we applied a more restrictive criteria of ∆i &lt; 2 to consider and averaged our top models (Symonds and Moussalli 2011).</w:t>
+      </w:r>
+    </w:p>
+    <w:p>
+      <w:pPr>
+        <w:spacing w:line="480" w:lineRule="auto"/>
+        <w:rPr>
+          <w:rFonts w:ascii="Times New Roman" w:hAnsi="Times New Roman" w:cs="Times New Roman"/>
+        </w:rPr>
+      </w:pPr>
+    </w:p>
+    <w:p>
+      <w:pPr>
+        <w:spacing w:line="480" w:lineRule="auto"/>
+        <w:rPr>
+          <w:rFonts w:ascii="Times New Roman" w:hAnsi="Times New Roman" w:cs="Times New Roman"/>
           <w:i/>
           <w:iCs/>
         </w:rPr>
-        <w:t>guts</w:t>
-      </w:r>
-      <w:proofErr w:type="gramEnd"/>
+      </w:pPr>
+      <w:r>
+        <w:rPr>
+          <w:rFonts w:ascii="Times New Roman" w:eastAsia="Times New Roman" w:hAnsi="Times New Roman" w:cs="Times New Roman"/>
+          <w:i/>
+          <w:iCs/>
+        </w:rPr>
+        <w:t>Observations of marked bees on PSPs</w:t>
+      </w:r>
     </w:p>
     <w:p>
       <w:pPr>
@@ -2298,62 +1898,7 @@
         <w:rPr>
           <w:rFonts w:ascii="Times New Roman" w:eastAsia="Times New Roman" w:hAnsi="Times New Roman" w:cs="Times New Roman"/>
         </w:rPr>
-        <w:t xml:space="preserve">To examine dye presence in bee guts across worker age, we constructed models with a binomial distribution (1 = dye present, 0 = dye absent) and dye presence as the response variable. We selected worker age as linear and quadratic fixed effect predictor variables in our full model. We included the quadratic term based on our prediction that dye presence would peak at days five to </w:t>
-      </w:r>
-      <w:r>
-        <w:rPr>
-          <w:rFonts w:ascii="Times New Roman" w:eastAsia="Times New Roman" w:hAnsi="Times New Roman" w:cs="Times New Roman"/>
-        </w:rPr>
-        <w:t>nine</w:t>
-      </w:r>
-      <w:r>
-        <w:rPr>
-          <w:rFonts w:ascii="Times New Roman" w:eastAsia="Times New Roman" w:hAnsi="Times New Roman" w:cs="Times New Roman"/>
-        </w:rPr>
-        <w:t xml:space="preserve"> Additionally, we included the four environmental variables of interest as fixed effect covariates. We summarized the average value of each variable for the 23 hours preceding </w:t>
-      </w:r>
-      <w:r>
-        <w:rPr>
-          <w:rFonts w:ascii="Times New Roman" w:eastAsia="Times New Roman" w:hAnsi="Times New Roman" w:cs="Times New Roman"/>
-        </w:rPr>
-        <w:lastRenderedPageBreak/>
-        <w:t xml:space="preserve">sampling </w:t>
-      </w:r>
-      <w:commentRangeStart w:id="22"/>
-      <w:commentRangeStart w:id="23"/>
-      <w:r>
-        <w:rPr>
-          <w:rFonts w:ascii="Times New Roman" w:eastAsia="Times New Roman" w:hAnsi="Times New Roman" w:cs="Times New Roman"/>
-        </w:rPr>
-        <w:t>(12:00 day n-1 – 11:00 day n)</w:t>
-      </w:r>
-      <w:commentRangeEnd w:id="22"/>
-      <w:commentRangeEnd w:id="23"/>
-      <w:r>
-        <w:commentReference w:id="22"/>
-      </w:r>
-      <w:r>
-        <w:commentReference w:id="23"/>
-      </w:r>
-      <w:r>
-        <w:rPr>
-          <w:rFonts w:ascii="Times New Roman" w:eastAsia="Times New Roman" w:hAnsi="Times New Roman" w:cs="Times New Roman"/>
-        </w:rPr>
-        <w:t xml:space="preserve">. To account for time-dependent colony effects, we adopted a colony random effect with a first-order autoregressive (AR1) correlation structure. An AR1 correlation structure accounts for higher correlation in time points closer together (Shan et al. 2020). From our full model, we created subsequent models with all possible combinations of environmental covariates (Symonds and Moussalli 2011) and a variety of null models with (1) a colony random effect without AR1 correlation structure, (2) only weather variables, (3) no quadratic age fixed effect predictor variable, and (4) no predictor variables (response ~ 1). All 20 models were constructed with </w:t>
-      </w:r>
-      <w:proofErr w:type="gramStart"/>
-      <w:r>
-        <w:rPr>
-          <w:rFonts w:ascii="Times New Roman" w:eastAsia="Times New Roman" w:hAnsi="Times New Roman" w:cs="Times New Roman"/>
-        </w:rPr>
-        <w:t>glmmTMB::</w:t>
-      </w:r>
-      <w:proofErr w:type="gramEnd"/>
-      <w:r>
-        <w:rPr>
-          <w:rFonts w:ascii="Times New Roman" w:eastAsia="Times New Roman" w:hAnsi="Times New Roman" w:cs="Times New Roman"/>
-        </w:rPr>
-        <w:t>glmmTMB (Brooks et al. 2017) and underwent model selection with AICc (Table 1). We initially examined all models within ∆i &lt; 6 (Richards 2005).  However, 15 of our 20 models were within ∆i &lt; 6 and our goal of model selection was not met. Thus, we applied a more restrictive criteria of ∆i &lt; 2 to consider and averaged our top models (Symonds and Moussalli 2011).</w:t>
+        <w:t xml:space="preserve">To examine the presence of marked bees on PSPs across worker age, we constructed models with a negative binomial or Poisson distribution (Table 2) and counts of marked workers on PSPs as our response variable. We combined observations from the AP23 dyed and undyed (negative control) treatment groups, as we hypothesized that the presence of dye would not affect the number of marked bees contacting PSPs. Additionally, any differences between colonies were accounted for in a colony random effect with an AR1 correlation structure. </w:t>
       </w:r>
     </w:p>
     <w:p>
@@ -2363,28 +1908,35 @@
           <w:rFonts w:ascii="Times New Roman" w:hAnsi="Times New Roman" w:cs="Times New Roman"/>
         </w:rPr>
       </w:pPr>
+      <w:r>
+        <w:rPr>
+          <w:rFonts w:ascii="Times New Roman" w:eastAsia="Times New Roman" w:hAnsi="Times New Roman" w:cs="Times New Roman"/>
+        </w:rPr>
+        <w:t xml:space="preserve">We utilized an offset as a fixed effect to account for the changing total population of marked bees in each colony, due to background mortality and the removal of marked bees each day for the dye presence in bee guts experiment (Reitan and Nielsen 2016). The offset was employed as </w:t>
+      </w:r>
+      <w:r>
+        <w:rPr>
+          <w:rFonts w:ascii="Times New Roman" w:eastAsia="Times New Roman" w:hAnsi="Times New Roman" w:cs="Times New Roman"/>
+        </w:rPr>
+        <w:lastRenderedPageBreak/>
+        <w:t xml:space="preserve">the log(total number of bees in each colony), which predicts the outcome variable as the rate of log(number of bees on PSPs) per total number of bees in the colony (Hutchinson and Holtman 2005). The total number of bees in each colony was calculated using the following formula: [number of bees at the start of the day (800 for day 1) – number of bees removed (20 bees per day, unless less than 20 bees were available) – background mortality of the number of bees left after removal each day]. The background mortality was calculated as the median rate of 3.7% (ESFA 2020), unless total bee counts were reduced below zero, in which case we </w:t>
+      </w:r>
+      <w:r>
+        <w:rPr>
+          <w:rFonts w:ascii="Times New Roman" w:eastAsia="Times New Roman" w:hAnsi="Times New Roman" w:cs="Times New Roman"/>
+        </w:rPr>
+        <w:t xml:space="preserve">incrementally </w:t>
+      </w:r>
+      <w:r>
+        <w:rPr>
+          <w:rFonts w:ascii="Times New Roman" w:eastAsia="Times New Roman" w:hAnsi="Times New Roman" w:cs="Times New Roman"/>
+        </w:rPr>
+        <w:t xml:space="preserve">reduced the background mortality rate by 0.1% until total bees were above zero at the end of the sampling period. </w:t>
+      </w:r>
     </w:p>
     <w:p>
       <w:pPr>
         <w:spacing w:line="480" w:lineRule="auto"/>
-        <w:rPr>
-          <w:rFonts w:ascii="Times New Roman" w:hAnsi="Times New Roman" w:cs="Times New Roman"/>
-          <w:i/>
-          <w:iCs/>
-        </w:rPr>
-      </w:pPr>
-      <w:r>
-        <w:rPr>
-          <w:rFonts w:ascii="Times New Roman" w:eastAsia="Times New Roman" w:hAnsi="Times New Roman" w:cs="Times New Roman"/>
-          <w:i/>
-          <w:iCs/>
-        </w:rPr>
-        <w:t>Observations of marked bees on PSPs</w:t>
-      </w:r>
-    </w:p>
-    <w:p>
-      <w:pPr>
-        <w:spacing w:line="480" w:lineRule="auto"/>
         <w:ind w:firstLine="720"/>
         <w:rPr>
           <w:rFonts w:ascii="Times New Roman" w:hAnsi="Times New Roman" w:cs="Times New Roman"/>
@@ -2394,83 +1946,7 @@
         <w:rPr>
           <w:rFonts w:ascii="Times New Roman" w:eastAsia="Times New Roman" w:hAnsi="Times New Roman" w:cs="Times New Roman"/>
         </w:rPr>
-        <w:t xml:space="preserve">To examine the presence of marked bees on PSPs across worker age, we constructed models with a negative binomial or Poisson distribution (Table 2) and counts of marked workers on PSPs as our response variable. We combined observations from the AP23 dyed and undyed (negative control) treatment groups, as we hypothesized that the presence of dye would not affect the number of marked bees contacting PSPs. Additionally, any differences between colonies were accounted for in a colony random effect with an AR1 correlation structure. </w:t>
-      </w:r>
-    </w:p>
-    <w:p>
-      <w:pPr>
-        <w:spacing w:line="480" w:lineRule="auto"/>
-        <w:rPr>
-          <w:rFonts w:ascii="Times New Roman" w:hAnsi="Times New Roman" w:cs="Times New Roman"/>
-        </w:rPr>
-      </w:pPr>
-      <w:r>
-        <w:rPr>
-          <w:rFonts w:ascii="Times New Roman" w:eastAsia="Times New Roman" w:hAnsi="Times New Roman" w:cs="Times New Roman"/>
-        </w:rPr>
-        <w:t xml:space="preserve">We utilized an offset as a fixed effect to account for the changing total population of marked bees in each colony, due to background mortality and the removal of marked bees each day for the dye presence in bee guts experiment (Reitan and Nielsen 2016). The offset was employed as </w:t>
-      </w:r>
-      <w:r>
-        <w:rPr>
-          <w:rFonts w:ascii="Times New Roman" w:eastAsia="Times New Roman" w:hAnsi="Times New Roman" w:cs="Times New Roman"/>
-        </w:rPr>
-        <w:lastRenderedPageBreak/>
-        <w:t xml:space="preserve">the </w:t>
-      </w:r>
-      <w:proofErr w:type="gramStart"/>
-      <w:r>
-        <w:rPr>
-          <w:rFonts w:ascii="Times New Roman" w:eastAsia="Times New Roman" w:hAnsi="Times New Roman" w:cs="Times New Roman"/>
-        </w:rPr>
-        <w:t>log(</w:t>
-      </w:r>
-      <w:proofErr w:type="gramEnd"/>
-      <w:r>
-        <w:rPr>
-          <w:rFonts w:ascii="Times New Roman" w:eastAsia="Times New Roman" w:hAnsi="Times New Roman" w:cs="Times New Roman"/>
-        </w:rPr>
-        <w:t xml:space="preserve">total number of bees in each colony), which predicts the outcome variable as the rate of log(number of bees on PSPs) per total number of bees in the colony (Hutchinson and Holtman 2005). The total number of bees in each colony was calculated using the following formula: [number of bees at the start of the day (800 for day 1) – number of bees removed (20 bees per day, unless less than 20 bees were available) – background mortality of the number of bees left after removal each day]. The background mortality was calculated as the median rate of 3.7% (ESFA 2020), unless total bee counts were reduced below zero, in which case we </w:t>
-      </w:r>
-      <w:r>
-        <w:rPr>
-          <w:rFonts w:ascii="Times New Roman" w:eastAsia="Times New Roman" w:hAnsi="Times New Roman" w:cs="Times New Roman"/>
-        </w:rPr>
-        <w:t xml:space="preserve">incrementally </w:t>
-      </w:r>
-      <w:r>
-        <w:rPr>
-          <w:rFonts w:ascii="Times New Roman" w:eastAsia="Times New Roman" w:hAnsi="Times New Roman" w:cs="Times New Roman"/>
-        </w:rPr>
-        <w:t xml:space="preserve">reduced the background mortality rate by 0.1% until total bees were above zero at the end of the sampling period. </w:t>
-      </w:r>
-    </w:p>
-    <w:p>
-      <w:pPr>
-        <w:spacing w:line="480" w:lineRule="auto"/>
-        <w:ind w:firstLine="720"/>
-        <w:rPr>
-          <w:rFonts w:ascii="Times New Roman" w:hAnsi="Times New Roman" w:cs="Times New Roman"/>
-        </w:rPr>
-      </w:pPr>
-      <w:r>
-        <w:rPr>
-          <w:rFonts w:ascii="Times New Roman" w:eastAsia="Times New Roman" w:hAnsi="Times New Roman" w:cs="Times New Roman"/>
-        </w:rPr>
-        <w:t xml:space="preserve">We included the four environmental variables of interest as fixed effect covariates in our full model to examine potential effects of environmental conditions on worker interaction with PSPs. We summarized the average value of each covariate for the period of sunrise to average observation time (7:00 – 11:00). From our full model, we created subsequent candidate models with all possible combinations of environmental covariates (Symonds and Moussalli 2011) and a variety of null models with (1) a colony random effect without AR1 correlation structure, (2) only weather variables, (3) no quadratic age fixed effect predictor variable, (4) no predictor variables (response ~ 1), and (5) the offset fixed effect removed. All 21 models were constructed with </w:t>
-      </w:r>
-      <w:proofErr w:type="gramStart"/>
-      <w:r>
-        <w:rPr>
-          <w:rFonts w:ascii="Times New Roman" w:eastAsia="Times New Roman" w:hAnsi="Times New Roman" w:cs="Times New Roman"/>
-        </w:rPr>
-        <w:t>glmmTMB::</w:t>
-      </w:r>
-      <w:proofErr w:type="gramEnd"/>
-      <w:r>
-        <w:rPr>
-          <w:rFonts w:ascii="Times New Roman" w:eastAsia="Times New Roman" w:hAnsi="Times New Roman" w:cs="Times New Roman"/>
-        </w:rPr>
-        <w:t xml:space="preserve">glmmTMB (Brooks et al. 2017) and underwent model selection with AICc (Table 2). We averaged all models within ∆i &lt; 6 (Richards 2005).  </w:t>
+        <w:t xml:space="preserve">We included the four environmental variables of interest as fixed effect covariates in our full model to examine potential effects of environmental conditions on worker interaction with PSPs. We summarized the average value of each covariate for the period of sunrise to average observation time (7:00 – 11:00). From our full model, we created subsequent candidate models with all possible combinations of environmental covariates (Symonds and Moussalli 2011) and a variety of null models with (1) a colony random effect without AR1 correlation structure, (2) only weather variables, (3) no quadratic age fixed effect predictor variable, (4) no predictor variables (response ~ 1), and (5) the offset fixed effect removed. All 21 models were constructed with glmmTMB::glmmTMB (Brooks et al. 2017) and underwent model selection with AICc (Table 2). We averaged all models within ∆i &lt; 6 (Richards 2005).  </w:t>
       </w:r>
     </w:p>
     <w:p>
@@ -2492,7 +1968,7 @@
           <w:iCs/>
         </w:rPr>
       </w:pPr>
-      <w:commentRangeStart w:id="24"/>
+      <w:commentRangeStart w:id="25"/>
       <w:r>
         <w:rPr>
           <w:rFonts w:ascii="Times New Roman" w:eastAsia="Times New Roman" w:hAnsi="Times New Roman" w:cs="Times New Roman"/>
@@ -2503,9 +1979,9 @@
         </w:rPr>
         <w:t>Results</w:t>
       </w:r>
-      <w:commentRangeEnd w:id="24"/>
-      <w:r>
-        <w:commentReference w:id="24"/>
+      <w:commentRangeEnd w:id="25"/>
+      <w:r>
+        <w:commentReference w:id="25"/>
       </w:r>
     </w:p>
     <w:p>
@@ -2523,18 +1999,8 @@
           <w:i/>
           <w:iCs/>
         </w:rPr>
-        <w:t xml:space="preserve">Dye presence in bee </w:t>
-      </w:r>
-      <w:proofErr w:type="gramStart"/>
-      <w:r>
-        <w:rPr>
-          <w:rFonts w:ascii="Times New Roman" w:eastAsia="Times New Roman" w:hAnsi="Times New Roman" w:cs="Times New Roman"/>
-          <w:i/>
-          <w:iCs/>
-        </w:rPr>
-        <w:t>guts</w:t>
-      </w:r>
-      <w:proofErr w:type="gramEnd"/>
+        <w:t>Dye presence in bee guts</w:t>
+      </w:r>
     </w:p>
     <w:p>
       <w:pPr>
@@ -2897,20 +2363,20 @@
         </w:rPr>
         <w:tab/>
       </w:r>
-      <w:commentRangeStart w:id="25"/>
+      <w:commentRangeStart w:id="26"/>
       <w:r>
         <w:rPr>
           <w:rFonts w:ascii="Times New Roman" w:eastAsia="Times New Roman" w:hAnsi="Times New Roman" w:cs="Times New Roman"/>
         </w:rPr>
         <w:t xml:space="preserve">Initially, we </w:t>
       </w:r>
-      <w:commentRangeEnd w:id="25"/>
+      <w:commentRangeEnd w:id="26"/>
       <w:r>
         <w:rPr>
           <w:rStyle w:val="CommentReference"/>
           <w:rFonts w:ascii="Times New Roman" w:eastAsia="Times New Roman" w:hAnsi="Times New Roman" w:cs="Times New Roman"/>
         </w:rPr>
-        <w:commentReference w:id="25"/>
+        <w:commentReference w:id="26"/>
       </w:r>
       <w:r>
         <w:rPr>
@@ -2928,21 +2394,7 @@
         <w:rPr>
           <w:rFonts w:ascii="Times New Roman" w:eastAsia="Times New Roman" w:hAnsi="Times New Roman" w:cs="Times New Roman"/>
         </w:rPr>
-        <w:t xml:space="preserve">, we would expect to see a peak in PSP usage around age 8-10 days. Based on our results, PSP usage shows a strong increase over time, with a peak around days 19-20 in both </w:t>
-      </w:r>
-      <w:proofErr w:type="gramStart"/>
-      <w:r>
-        <w:rPr>
-          <w:rFonts w:ascii="Times New Roman" w:eastAsia="Times New Roman" w:hAnsi="Times New Roman" w:cs="Times New Roman"/>
-        </w:rPr>
-        <w:t>dye</w:t>
-      </w:r>
-      <w:proofErr w:type="gramEnd"/>
-      <w:r>
-        <w:rPr>
-          <w:rFonts w:ascii="Times New Roman" w:eastAsia="Times New Roman" w:hAnsi="Times New Roman" w:cs="Times New Roman"/>
-        </w:rPr>
-        <w:t xml:space="preserve"> recovered in honey bee guts and in the observed visitation of honey bees to pollen patties. As a result, we reject our hypothesis. A previous study by Noordyke et al. (2021) showed that nurse bees did not</w:t>
+        <w:t>, we would expect to see a peak in PSP usage around age 8-10 days. Based on our results, PSP usage shows a strong increase over time, with a peak around days 19-20 in both dye recovered in honey bee guts and in the observed visitation of honey bees to pollen patties. As a result, we reject our hypothesis. A previous study by Noordyke et al. (2021) showed that nurse bees did not</w:t>
       </w:r>
       <w:r>
         <w:rPr>
@@ -3075,43 +2527,15 @@
         <w:rPr>
           <w:rFonts w:ascii="Times New Roman" w:eastAsia="Times New Roman" w:hAnsi="Times New Roman" w:cs="Times New Roman"/>
         </w:rPr>
-        <w:t xml:space="preserve">. At the time of our study, </w:t>
-      </w:r>
-      <w:proofErr w:type="gramStart"/>
-      <w:r>
-        <w:rPr>
-          <w:rFonts w:ascii="Times New Roman" w:eastAsia="Times New Roman" w:hAnsi="Times New Roman" w:cs="Times New Roman"/>
-        </w:rPr>
-        <w:t>honey bees</w:t>
-      </w:r>
-      <w:proofErr w:type="gramEnd"/>
-      <w:r>
-        <w:rPr>
-          <w:rFonts w:ascii="Times New Roman" w:eastAsia="Times New Roman" w:hAnsi="Times New Roman" w:cs="Times New Roman"/>
-        </w:rPr>
-        <w:t xml:space="preserve"> were able to forage natural pollen, and there was no pollen dearth. Therefore, it is possible that the division of tasks in colonies are dependent on available nutrition and resources, and that, had our colonies been starving, younger workers would have handled PSPs. A previous study </w:t>
-      </w:r>
-      <w:r>
-        <w:rPr>
-          <w:rFonts w:ascii="Times New Roman" w:eastAsia="Times New Roman" w:hAnsi="Times New Roman" w:cs="Times New Roman"/>
-        </w:rPr>
-        <w:t xml:space="preserve">found that restricting carbohydrates led to changes in the tasks performed by </w:t>
-      </w:r>
-      <w:proofErr w:type="gramStart"/>
-      <w:r>
-        <w:rPr>
-          <w:rFonts w:ascii="Times New Roman" w:eastAsia="Times New Roman" w:hAnsi="Times New Roman" w:cs="Times New Roman"/>
-        </w:rPr>
-        <w:t>honey bees</w:t>
-      </w:r>
-      <w:proofErr w:type="gramEnd"/>
-      <w:r>
-        <w:rPr>
-          <w:rFonts w:ascii="Times New Roman" w:eastAsia="Times New Roman" w:hAnsi="Times New Roman" w:cs="Times New Roman"/>
-        </w:rPr>
-        <w:t xml:space="preserve">, and hypothesized that the development of new foragers is affected by whether carbohydrates are present in the colony (Schulz et al. 1998). </w:t>
-      </w:r>
-      <w:commentRangeStart w:id="26"/>
+        <w:t xml:space="preserve">. At the time of our study, honey bees were able to forage natural pollen, and there was no pollen dearth. Therefore, it is possible that the division of tasks in colonies are dependent on available nutrition and resources, and that, had our colonies been starving, younger workers would have handled PSPs. A previous study </w:t>
+      </w:r>
+      <w:r>
+        <w:rPr>
+          <w:rFonts w:ascii="Times New Roman" w:eastAsia="Times New Roman" w:hAnsi="Times New Roman" w:cs="Times New Roman"/>
+        </w:rPr>
+        <w:t xml:space="preserve">found that restricting carbohydrates led to changes in the tasks performed by honey bees, and hypothesized that the development of new foragers is affected by whether carbohydrates are present in the colony (Schulz et al. 1998). </w:t>
+      </w:r>
+      <w:commentRangeStart w:id="27"/>
       <w:r>
         <w:rPr>
           <w:rFonts w:ascii="Times New Roman" w:eastAsia="Times New Roman" w:hAnsi="Times New Roman" w:cs="Times New Roman"/>
@@ -3130,13 +2554,13 @@
         </w:rPr>
         <w:t xml:space="preserve"> foragers do not burden larvae by using their resources.</w:t>
       </w:r>
-      <w:commentRangeEnd w:id="26"/>
+      <w:commentRangeEnd w:id="27"/>
       <w:r>
         <w:rPr>
           <w:rStyle w:val="CommentReference"/>
           <w:rFonts w:ascii="Times New Roman" w:eastAsia="Times New Roman" w:hAnsi="Times New Roman" w:cs="Times New Roman"/>
         </w:rPr>
-        <w:commentReference w:id="26"/>
+        <w:commentReference w:id="27"/>
       </w:r>
     </w:p>
     <w:p>
@@ -3159,20 +2583,20 @@
         </w:rPr>
         <w:tab/>
       </w:r>
-      <w:commentRangeStart w:id="27"/>
+      <w:commentRangeStart w:id="28"/>
       <w:r>
         <w:rPr>
           <w:rFonts w:ascii="Times New Roman" w:eastAsia="Times New Roman" w:hAnsi="Times New Roman" w:cs="Times New Roman"/>
         </w:rPr>
         <w:t xml:space="preserve">A potential hypothesis </w:t>
       </w:r>
-      <w:commentRangeEnd w:id="27"/>
+      <w:commentRangeEnd w:id="28"/>
       <w:r>
         <w:rPr>
           <w:rStyle w:val="CommentReference"/>
           <w:rFonts w:ascii="Times New Roman" w:eastAsia="Times New Roman" w:hAnsi="Times New Roman" w:cs="Times New Roman"/>
         </w:rPr>
-        <w:commentReference w:id="27"/>
+        <w:commentReference w:id="28"/>
       </w:r>
       <w:r>
         <w:rPr>
@@ -3226,35 +2650,7 @@
         <w:rPr>
           <w:rFonts w:ascii="Times New Roman" w:eastAsia="Times New Roman" w:hAnsi="Times New Roman" w:cs="Times New Roman"/>
         </w:rPr>
-        <w:t xml:space="preserve">, although PSPs do include a large percentage of protein, there is a much larger percentage of carbohydrates in the form of both sucrose syrup and flour, yeast, or additives. If </w:t>
-      </w:r>
-      <w:proofErr w:type="gramStart"/>
-      <w:r>
-        <w:rPr>
-          <w:rFonts w:ascii="Times New Roman" w:eastAsia="Times New Roman" w:hAnsi="Times New Roman" w:cs="Times New Roman"/>
-        </w:rPr>
-        <w:t>honey bees</w:t>
-      </w:r>
-      <w:proofErr w:type="gramEnd"/>
-      <w:r>
-        <w:rPr>
-          <w:rFonts w:ascii="Times New Roman" w:eastAsia="Times New Roman" w:hAnsi="Times New Roman" w:cs="Times New Roman"/>
-        </w:rPr>
-        <w:t xml:space="preserve"> made use of PSPs for their carbohydrates exclusively, workers of all ages would show dye in their guts, with no distribution between ages. This is further confirmed with our fondant control, where bees of all ages in the fondant control group showed dye in their guts (Figure 1). Interestingly, </w:t>
-      </w:r>
-      <w:proofErr w:type="gramStart"/>
-      <w:r>
-        <w:rPr>
-          <w:rFonts w:ascii="Times New Roman" w:eastAsia="Times New Roman" w:hAnsi="Times New Roman" w:cs="Times New Roman"/>
-        </w:rPr>
-        <w:t>honey bees</w:t>
-      </w:r>
-      <w:proofErr w:type="gramEnd"/>
-      <w:r>
-        <w:rPr>
-          <w:rFonts w:ascii="Times New Roman" w:eastAsia="Times New Roman" w:hAnsi="Times New Roman" w:cs="Times New Roman"/>
-        </w:rPr>
-        <w:t xml:space="preserve"> that were observed on the fondant control were of similar age to those observed on PSPs, which indicates that the same group was processing both substances, but the </w:t>
+        <w:t xml:space="preserve">, although PSPs do include a large percentage of protein, there is a much larger percentage of carbohydrates in the form of both sucrose syrup and flour, yeast, or additives. If honey bees made use of PSPs for their carbohydrates exclusively, workers of all ages would show dye in their guts, with no distribution between ages. This is further confirmed with our fondant control, where bees of all ages in the fondant control group showed dye in their guts (Figure 1). Interestingly, honey bees that were observed on the fondant control were of similar age to those observed on PSPs, which indicates that the same group was processing both substances, but the </w:t>
       </w:r>
       <w:r>
         <w:rPr>
@@ -3293,40 +2689,26 @@
         </w:rPr>
         <w:t xml:space="preserve">. Noordyke et al. (2021) previously showed that sampled workers at any age had consumed fondant, </w:t>
       </w:r>
-      <w:commentRangeStart w:id="28"/>
+      <w:commentRangeStart w:id="29"/>
       <w:r>
         <w:rPr>
           <w:rFonts w:ascii="Times New Roman" w:eastAsia="Times New Roman" w:hAnsi="Times New Roman" w:cs="Times New Roman"/>
         </w:rPr>
         <w:t xml:space="preserve">although this result was determined using dye in guts, and bees were not observed interacting with the fondant as was done here. </w:t>
       </w:r>
-      <w:commentRangeEnd w:id="28"/>
+      <w:commentRangeEnd w:id="29"/>
       <w:r>
         <w:rPr>
           <w:rStyle w:val="CommentReference"/>
           <w:rFonts w:ascii="Times New Roman" w:eastAsia="Times New Roman" w:hAnsi="Times New Roman" w:cs="Times New Roman"/>
         </w:rPr>
-        <w:commentReference w:id="28"/>
-      </w:r>
-      <w:r>
-        <w:rPr>
-          <w:rFonts w:ascii="Times New Roman" w:eastAsia="Times New Roman" w:hAnsi="Times New Roman" w:cs="Times New Roman"/>
-        </w:rPr>
-        <w:t xml:space="preserve">Another study found that marked sugar syrup was eventually detected in larvae, nurse bees, and older bees (DeGrandi-Hoffman and Hagler, 2000), again the syrup may have been collected by one </w:t>
-      </w:r>
-      <w:proofErr w:type="gramStart"/>
-      <w:r>
-        <w:rPr>
-          <w:rFonts w:ascii="Times New Roman" w:eastAsia="Times New Roman" w:hAnsi="Times New Roman" w:cs="Times New Roman"/>
-        </w:rPr>
-        <w:t>group, but</w:t>
-      </w:r>
-      <w:proofErr w:type="gramEnd"/>
-      <w:r>
-        <w:rPr>
-          <w:rFonts w:ascii="Times New Roman" w:eastAsia="Times New Roman" w:hAnsi="Times New Roman" w:cs="Times New Roman"/>
-        </w:rPr>
-        <w:t xml:space="preserve"> fed to all bees via troph</w:t>
+        <w:commentReference w:id="29"/>
+      </w:r>
+      <w:r>
+        <w:rPr>
+          <w:rFonts w:ascii="Times New Roman" w:eastAsia="Times New Roman" w:hAnsi="Times New Roman" w:cs="Times New Roman"/>
+        </w:rPr>
+        <w:t>Another study found that marked sugar syrup was eventually detected in larvae, nurse bees, and older bees (DeGrandi-Hoffman and Hagler, 2000), again the syrup may have been collected by one group, but fed to all bees via troph</w:t>
       </w:r>
       <w:r>
         <w:rPr>
@@ -3361,29 +2743,29 @@
         </w:rPr>
         <w:tab/>
       </w:r>
-      <w:commentRangeStart w:id="29"/>
       <w:commentRangeStart w:id="30"/>
+      <w:commentRangeStart w:id="31"/>
       <w:r>
         <w:rPr>
           <w:rFonts w:ascii="Times New Roman" w:eastAsia="Times New Roman" w:hAnsi="Times New Roman" w:cs="Times New Roman"/>
         </w:rPr>
         <w:t xml:space="preserve">There is the possibility </w:t>
       </w:r>
-      <w:commentRangeEnd w:id="29"/>
+      <w:commentRangeEnd w:id="30"/>
       <w:r>
         <w:rPr>
           <w:rStyle w:val="CommentReference"/>
           <w:rFonts w:ascii="Times New Roman" w:eastAsia="Times New Roman" w:hAnsi="Times New Roman" w:cs="Times New Roman"/>
         </w:rPr>
-        <w:commentReference w:id="29"/>
-      </w:r>
-      <w:commentRangeEnd w:id="30"/>
+        <w:commentReference w:id="30"/>
+      </w:r>
+      <w:commentRangeEnd w:id="31"/>
       <w:r>
         <w:rPr>
           <w:rStyle w:val="CommentReference"/>
           <w:rFonts w:ascii="Times New Roman" w:eastAsia="Times New Roman" w:hAnsi="Times New Roman" w:cs="Times New Roman"/>
         </w:rPr>
-        <w:commentReference w:id="30"/>
+        <w:commentReference w:id="31"/>
       </w:r>
       <w:r>
         <w:rPr>
@@ -3413,21 +2795,7 @@
         <w:rPr>
           <w:rFonts w:ascii="Times New Roman" w:eastAsia="Times New Roman" w:hAnsi="Times New Roman" w:cs="Times New Roman"/>
         </w:rPr>
-        <w:t xml:space="preserve">ing task </w:t>
-      </w:r>
-      <w:proofErr w:type="gramStart"/>
-      <w:r>
-        <w:rPr>
-          <w:rFonts w:ascii="Times New Roman" w:eastAsia="Times New Roman" w:hAnsi="Times New Roman" w:cs="Times New Roman"/>
-        </w:rPr>
-        <w:t>honey bees</w:t>
-      </w:r>
-      <w:proofErr w:type="gramEnd"/>
-      <w:r>
-        <w:rPr>
-          <w:rFonts w:ascii="Times New Roman" w:eastAsia="Times New Roman" w:hAnsi="Times New Roman" w:cs="Times New Roman"/>
-        </w:rPr>
-        <w:t xml:space="preserve"> perform (reviewed in Tait and Lihoreau, 2024). If </w:t>
+        <w:t xml:space="preserve">ing task honey bees perform (reviewed in Tait and Lihoreau, 2024). If </w:t>
       </w:r>
       <w:r>
         <w:rPr>
@@ -3480,49 +2848,35 @@
         </w:rPr>
         <w:tab/>
       </w:r>
-      <w:commentRangeStart w:id="31"/>
       <w:commentRangeStart w:id="32"/>
+      <w:commentRangeStart w:id="33"/>
       <w:r>
         <w:rPr>
           <w:rFonts w:ascii="Times New Roman" w:eastAsia="Times New Roman" w:hAnsi="Times New Roman" w:cs="Times New Roman"/>
         </w:rPr>
         <w:t xml:space="preserve">Another </w:t>
       </w:r>
-      <w:commentRangeEnd w:id="31"/>
+      <w:commentRangeEnd w:id="32"/>
       <w:r>
         <w:rPr>
           <w:rStyle w:val="CommentReference"/>
           <w:rFonts w:ascii="Times New Roman" w:eastAsia="Times New Roman" w:hAnsi="Times New Roman" w:cs="Times New Roman"/>
         </w:rPr>
-        <w:commentReference w:id="31"/>
-      </w:r>
-      <w:commentRangeEnd w:id="32"/>
+        <w:commentReference w:id="32"/>
+      </w:r>
+      <w:commentRangeEnd w:id="33"/>
       <w:r>
         <w:rPr>
           <w:rStyle w:val="CommentReference"/>
           <w:rFonts w:ascii="Times New Roman" w:eastAsia="Times New Roman" w:hAnsi="Times New Roman" w:cs="Times New Roman"/>
         </w:rPr>
-        <w:commentReference w:id="32"/>
-      </w:r>
-      <w:r>
-        <w:rPr>
-          <w:rFonts w:ascii="Times New Roman" w:eastAsia="Times New Roman" w:hAnsi="Times New Roman" w:cs="Times New Roman"/>
-        </w:rPr>
-        <w:t xml:space="preserve">hypothesis is that age of </w:t>
-      </w:r>
-      <w:proofErr w:type="gramStart"/>
-      <w:r>
-        <w:rPr>
-          <w:rFonts w:ascii="Times New Roman" w:eastAsia="Times New Roman" w:hAnsi="Times New Roman" w:cs="Times New Roman"/>
-        </w:rPr>
-        <w:t>honey bee</w:t>
-      </w:r>
-      <w:proofErr w:type="gramEnd"/>
-      <w:r>
-        <w:rPr>
-          <w:rFonts w:ascii="Times New Roman" w:eastAsia="Times New Roman" w:hAnsi="Times New Roman" w:cs="Times New Roman"/>
-        </w:rPr>
-        <w:t xml:space="preserve"> worker is the determining factor for resource handling in the colony. In this scenario, pollen-handling and foraging</w:t>
+        <w:commentReference w:id="33"/>
+      </w:r>
+      <w:r>
+        <w:rPr>
+          <w:rFonts w:ascii="Times New Roman" w:eastAsia="Times New Roman" w:hAnsi="Times New Roman" w:cs="Times New Roman"/>
+        </w:rPr>
+        <w:t>hypothesis is that age of honey bee worker is the determining factor for resource handling in the colony. In this scenario, pollen-handling and foraging</w:t>
       </w:r>
       <w:r>
         <w:rPr>
@@ -3540,21 +2894,7 @@
         <w:rPr>
           <w:rFonts w:ascii="Times New Roman" w:eastAsia="Times New Roman" w:hAnsi="Times New Roman" w:cs="Times New Roman"/>
         </w:rPr>
-        <w:t xml:space="preserve">In our negative control (undyed PSPs), we saw peaks at early ages, at around the </w:t>
-      </w:r>
-      <w:proofErr w:type="gramStart"/>
-      <w:r>
-        <w:rPr>
-          <w:rFonts w:ascii="Times New Roman" w:eastAsia="Times New Roman" w:hAnsi="Times New Roman" w:cs="Times New Roman"/>
-        </w:rPr>
-        <w:t>15-20 day</w:t>
-      </w:r>
-      <w:proofErr w:type="gramEnd"/>
-      <w:r>
-        <w:rPr>
-          <w:rFonts w:ascii="Times New Roman" w:eastAsia="Times New Roman" w:hAnsi="Times New Roman" w:cs="Times New Roman"/>
-        </w:rPr>
-        <w:t xml:space="preserve"> range. We hypothesize that this range is still within an acceptable range of forager-aged bees, especially given that this control had fewer colonies (three hives), and between hive variability can be quite high, even in the treatment group (see individual hives in Figures 2 and 4).</w:t>
+        <w:t>In our negative control (undyed PSPs), we saw peaks at early ages, at around the 15-20 day range. We hypothesize that this range is still within an acceptable range of forager-aged bees, especially given that this control had fewer colonies (three hives), and between hive variability can be quite high, even in the treatment group (see individual hives in Figures 2 and 4).</w:t>
       </w:r>
       <w:r>
         <w:rPr>
@@ -3567,21 +2907,7 @@
           <w:rFonts w:ascii="Times New Roman" w:eastAsia="Times New Roman" w:hAnsi="Times New Roman" w:cs="Times New Roman"/>
         </w:rPr>
         <w:lastRenderedPageBreak/>
-        <w:t xml:space="preserve">interesting finding that foragers are interacting with and consuming PSPs, but previous work has shown that </w:t>
-      </w:r>
-      <w:proofErr w:type="gramStart"/>
-      <w:r>
-        <w:rPr>
-          <w:rFonts w:ascii="Times New Roman" w:eastAsia="Times New Roman" w:hAnsi="Times New Roman" w:cs="Times New Roman"/>
-        </w:rPr>
-        <w:t>honey bees</w:t>
-      </w:r>
-      <w:proofErr w:type="gramEnd"/>
-      <w:r>
-        <w:rPr>
-          <w:rFonts w:ascii="Times New Roman" w:eastAsia="Times New Roman" w:hAnsi="Times New Roman" w:cs="Times New Roman"/>
-        </w:rPr>
-        <w:t xml:space="preserve"> do not store PSPs as bee bread (Noordyke et al. 2021)</w:t>
+        <w:t>interesting finding that foragers are interacting with and consuming PSPs, but previous work has shown that honey bees do not store PSPs as bee bread (Noordyke et al. 2021)</w:t>
       </w:r>
       <w:r>
         <w:rPr>
@@ -3589,20 +2915,20 @@
         </w:rPr>
         <w:t xml:space="preserve">. As mentioned above, the nutrients provided by PSPs should reach larvae even if indirectly, which may depend on whether the colony is in starvation or not. This may be an explanation for why PSPs are not useful if natural pollen is entering the colony (Corby-Harris 2018, Camazine 1993, </w:t>
       </w:r>
-      <w:commentRangeStart w:id="33"/>
+      <w:commentRangeStart w:id="34"/>
       <w:r>
         <w:rPr>
           <w:rFonts w:ascii="Times New Roman" w:eastAsia="Times New Roman" w:hAnsi="Times New Roman" w:cs="Times New Roman"/>
         </w:rPr>
         <w:t>CITE</w:t>
       </w:r>
-      <w:commentRangeEnd w:id="33"/>
+      <w:commentRangeEnd w:id="34"/>
       <w:r>
         <w:rPr>
           <w:rStyle w:val="CommentReference"/>
           <w:rFonts w:ascii="Times New Roman" w:eastAsia="Times New Roman" w:hAnsi="Times New Roman" w:cs="Times New Roman"/>
         </w:rPr>
-        <w:commentReference w:id="33"/>
+        <w:commentReference w:id="34"/>
       </w:r>
       <w:r>
         <w:rPr>
@@ -3610,7 +2936,7 @@
         </w:rPr>
         <w:t xml:space="preserve">). </w:t>
       </w:r>
-      <w:commentRangeStart w:id="34"/>
+      <w:commentRangeStart w:id="35"/>
       <w:r>
         <w:rPr>
           <w:rFonts w:ascii="Times New Roman" w:eastAsia="Times New Roman" w:hAnsi="Times New Roman" w:cs="Times New Roman"/>
@@ -3635,13 +2961,13 @@
         </w:rPr>
         <w:t>. If the transfer of information based on protein needs operates in one direction (from nurse bees to foragers) this would align with our lack of dye in nurse bees.</w:t>
       </w:r>
-      <w:commentRangeEnd w:id="34"/>
+      <w:commentRangeEnd w:id="35"/>
       <w:r>
         <w:rPr>
           <w:rStyle w:val="CommentReference"/>
           <w:rFonts w:ascii="Times New Roman" w:eastAsia="Times New Roman" w:hAnsi="Times New Roman" w:cs="Times New Roman"/>
         </w:rPr>
-        <w:commentReference w:id="34"/>
+        <w:commentReference w:id="35"/>
       </w:r>
     </w:p>
     <w:p>
@@ -3664,49 +2990,35 @@
         </w:rPr>
         <w:tab/>
       </w:r>
-      <w:commentRangeStart w:id="35"/>
       <w:commentRangeStart w:id="36"/>
+      <w:commentRangeStart w:id="37"/>
       <w:r>
         <w:rPr>
           <w:rFonts w:ascii="Times New Roman" w:eastAsia="Times New Roman" w:hAnsi="Times New Roman" w:cs="Times New Roman"/>
         </w:rPr>
         <w:t xml:space="preserve">There </w:t>
       </w:r>
-      <w:commentRangeEnd w:id="35"/>
+      <w:commentRangeEnd w:id="36"/>
       <w:r>
         <w:rPr>
           <w:rStyle w:val="CommentReference"/>
           <w:rFonts w:ascii="Times New Roman" w:eastAsia="Times New Roman" w:hAnsi="Times New Roman" w:cs="Times New Roman"/>
         </w:rPr>
-        <w:commentReference w:id="35"/>
-      </w:r>
-      <w:commentRangeEnd w:id="36"/>
+        <w:commentReference w:id="36"/>
+      </w:r>
+      <w:commentRangeEnd w:id="37"/>
       <w:r>
         <w:rPr>
           <w:rStyle w:val="CommentReference"/>
           <w:rFonts w:ascii="Times New Roman" w:eastAsia="Times New Roman" w:hAnsi="Times New Roman" w:cs="Times New Roman"/>
         </w:rPr>
-        <w:commentReference w:id="36"/>
-      </w:r>
-      <w:r>
-        <w:rPr>
-          <w:rFonts w:ascii="Times New Roman" w:eastAsia="Times New Roman" w:hAnsi="Times New Roman" w:cs="Times New Roman"/>
-        </w:rPr>
-        <w:t xml:space="preserve">remains the possibility that the observed patterns reported in this study have no relation to existing research on the division of labor in </w:t>
-      </w:r>
-      <w:proofErr w:type="gramStart"/>
-      <w:r>
-        <w:rPr>
-          <w:rFonts w:ascii="Times New Roman" w:eastAsia="Times New Roman" w:hAnsi="Times New Roman" w:cs="Times New Roman"/>
-        </w:rPr>
-        <w:t>honey bee</w:t>
-      </w:r>
-      <w:proofErr w:type="gramEnd"/>
-      <w:r>
-        <w:rPr>
-          <w:rFonts w:ascii="Times New Roman" w:eastAsia="Times New Roman" w:hAnsi="Times New Roman" w:cs="Times New Roman"/>
-        </w:rPr>
-        <w:t xml:space="preserve"> colonies, especially given that PSPs are an unnatural substance. As mentioned, we do see defined peaks in our treatment groups, which suggests the presence of some age-related task division. </w:t>
+        <w:commentReference w:id="37"/>
+      </w:r>
+      <w:r>
+        <w:rPr>
+          <w:rFonts w:ascii="Times New Roman" w:eastAsia="Times New Roman" w:hAnsi="Times New Roman" w:cs="Times New Roman"/>
+        </w:rPr>
+        <w:t xml:space="preserve">remains the possibility that the observed patterns reported in this study have no relation to existing research on the division of labor in honey bee colonies, especially given that PSPs are an unnatural substance. As mentioned, we do see defined peaks in our treatment groups, which suggests the presence of some age-related task division. </w:t>
       </w:r>
       <w:r>
         <w:rPr>
@@ -3755,84 +3067,57 @@
           <w:rFonts w:ascii="Times New Roman" w:eastAsia="Times New Roman" w:hAnsi="Times New Roman" w:cs="Times New Roman"/>
           <w:color w:val="000000"/>
         </w:rPr>
-        <w:t xml:space="preserve"> It would be useful to collect data on </w:t>
-      </w:r>
-      <w:proofErr w:type="gramStart"/>
+        <w:t xml:space="preserve"> It would be useful to collect data on honey bee age-related tasks under the circumstances of starvation and a general lack of pollen resources. </w:t>
+      </w:r>
       <w:r>
         <w:rPr>
           <w:rFonts w:ascii="Times New Roman" w:eastAsia="Times New Roman" w:hAnsi="Times New Roman" w:cs="Times New Roman"/>
           <w:color w:val="000000"/>
         </w:rPr>
-        <w:t>honey bee</w:t>
-      </w:r>
-      <w:proofErr w:type="gramEnd"/>
+        <w:t>There have been a number of studies that show honey bees prefer natural pollen over PSPs (e.g</w:t>
+      </w:r>
       <w:r>
         <w:rPr>
           <w:rFonts w:ascii="Times New Roman" w:eastAsia="Times New Roman" w:hAnsi="Times New Roman" w:cs="Times New Roman"/>
           <w:color w:val="000000"/>
         </w:rPr>
-        <w:t xml:space="preserve"> age-related tasks under the circumstances of starvation and a general lack of pollen resources. </w:t>
+        <w:t>. Manaswi</w:t>
       </w:r>
       <w:r>
         <w:rPr>
           <w:rFonts w:ascii="Times New Roman" w:eastAsia="Times New Roman" w:hAnsi="Times New Roman" w:cs="Times New Roman"/>
           <w:color w:val="000000"/>
         </w:rPr>
-        <w:t xml:space="preserve">There have been a number of studies that show </w:t>
-      </w:r>
-      <w:proofErr w:type="gramStart"/>
+        <w:t xml:space="preserve"> </w:t>
+      </w:r>
       <w:r>
         <w:rPr>
           <w:rFonts w:ascii="Times New Roman" w:eastAsia="Times New Roman" w:hAnsi="Times New Roman" w:cs="Times New Roman"/>
           <w:color w:val="000000"/>
         </w:rPr>
-        <w:t>honey bees</w:t>
-      </w:r>
-      <w:proofErr w:type="gramEnd"/>
+        <w:t>et al. 2023)</w:t>
+      </w:r>
       <w:r>
         <w:rPr>
           <w:rFonts w:ascii="Times New Roman" w:eastAsia="Times New Roman" w:hAnsi="Times New Roman" w:cs="Times New Roman"/>
           <w:color w:val="000000"/>
         </w:rPr>
-        <w:t xml:space="preserve"> prefer natural pollen over PSPs (e.g. Noordyke et al. 2023)</w:t>
+        <w:t>, and that they prefer fresh pollen over stored (Carroll et al. 2017). B</w:t>
       </w:r>
       <w:r>
         <w:rPr>
           <w:rFonts w:ascii="Times New Roman" w:eastAsia="Times New Roman" w:hAnsi="Times New Roman" w:cs="Times New Roman"/>
           <w:color w:val="000000"/>
         </w:rPr>
-        <w:t>, and that they prefer fresh pollen over stored (Carroll et al. 2017). B</w:t>
+        <w:t xml:space="preserve">eekeepers have reported success with </w:t>
       </w:r>
       <w:r>
         <w:rPr>
           <w:rFonts w:ascii="Times New Roman" w:eastAsia="Times New Roman" w:hAnsi="Times New Roman" w:cs="Times New Roman"/>
           <w:color w:val="000000"/>
         </w:rPr>
-        <w:t xml:space="preserve">eekeepers have reported success with </w:t>
-      </w:r>
-      <w:r>
-        <w:rPr>
-          <w:rFonts w:ascii="Times New Roman" w:eastAsia="Times New Roman" w:hAnsi="Times New Roman" w:cs="Times New Roman"/>
-          <w:color w:val="000000"/>
-        </w:rPr>
         <w:lastRenderedPageBreak/>
-        <w:t xml:space="preserve">mixing natural pollen directly into PSPs. It would then be an important piece of information to determine whether supplemental natural pollen is treated the same way that pollen brought from flowers is, or whether </w:t>
-      </w:r>
-      <w:proofErr w:type="gramStart"/>
-      <w:r>
-        <w:rPr>
-          <w:rFonts w:ascii="Times New Roman" w:eastAsia="Times New Roman" w:hAnsi="Times New Roman" w:cs="Times New Roman"/>
-          <w:color w:val="000000"/>
-        </w:rPr>
-        <w:t>honey bees</w:t>
-      </w:r>
-      <w:proofErr w:type="gramEnd"/>
-      <w:r>
-        <w:rPr>
-          <w:rFonts w:ascii="Times New Roman" w:eastAsia="Times New Roman" w:hAnsi="Times New Roman" w:cs="Times New Roman"/>
-          <w:color w:val="000000"/>
-        </w:rPr>
-        <w:t xml:space="preserve"> interaction with supplemental natural pollen is equivalent to the PSPs used in this study. </w:t>
+        <w:t xml:space="preserve">mixing natural pollen directly into PSPs. It would then be an important piece of information to determine whether supplemental natural pollen is treated the same way that pollen brought from flowers is, or whether honey bees interaction with supplemental natural pollen is equivalent to the PSPs used in this study. </w:t>
       </w:r>
     </w:p>
     <w:p>
@@ -3854,69 +3139,37 @@
           <w:rFonts w:ascii="Times New Roman" w:eastAsia="Times New Roman" w:hAnsi="Times New Roman" w:cs="Times New Roman"/>
           <w:color w:val="000000"/>
         </w:rPr>
-        <w:t xml:space="preserve">We hope that the findings presented here would help to inform beekeepers as to whether supplemental feeding is necessary or whether it would benefit the </w:t>
-      </w:r>
-      <w:proofErr w:type="gramStart"/>
+        <w:t xml:space="preserve">We hope that the findings presented here would help to inform beekeepers as to whether supplemental feeding is necessary or whether it would benefit the colony as a whole. Undoubtedly, a starving colony that is provided with PSPs would be better off </w:t>
+      </w:r>
       <w:r>
         <w:rPr>
           <w:rFonts w:ascii="Times New Roman" w:eastAsia="Times New Roman" w:hAnsi="Times New Roman" w:cs="Times New Roman"/>
           <w:color w:val="000000"/>
         </w:rPr>
-        <w:t>colony as a whole</w:t>
-      </w:r>
-      <w:proofErr w:type="gramEnd"/>
+        <w:t xml:space="preserve">in comparison to a starving colony that has not been provided with supplemental feeding. If natural pollen is abundant, it may be unnecessary and potentially confusing to the colony to provide supplemental protein in the form of PSPs, and sucrose syrup along may be a better option. </w:t>
+      </w:r>
+      <w:commentRangeStart w:id="38"/>
       <w:r>
         <w:rPr>
           <w:rFonts w:ascii="Times New Roman" w:eastAsia="Times New Roman" w:hAnsi="Times New Roman" w:cs="Times New Roman"/>
           <w:color w:val="000000"/>
         </w:rPr>
-        <w:t xml:space="preserve">. Undoubtedly, a starving colony that is provided with PSPs would be better off </w:t>
+        <w:t>Whether PSPs mixed with natural pollen is a good option is yet to be determined.</w:t>
+      </w:r>
+      <w:commentRangeEnd w:id="38"/>
+      <w:r>
+        <w:rPr>
+          <w:rStyle w:val="CommentReference"/>
+          <w:rFonts w:ascii="Times New Roman" w:eastAsia="Times New Roman" w:hAnsi="Times New Roman" w:cs="Times New Roman"/>
+        </w:rPr>
+        <w:commentReference w:id="38"/>
       </w:r>
       <w:r>
         <w:rPr>
           <w:rFonts w:ascii="Times New Roman" w:eastAsia="Times New Roman" w:hAnsi="Times New Roman" w:cs="Times New Roman"/>
           <w:color w:val="000000"/>
         </w:rPr>
-        <w:t xml:space="preserve">in comparison to a starving colony that has not been provided with supplemental feeding. If natural pollen is abundant, it may be unnecessary and potentially confusing to the colony to provide supplemental protein in the form of PSPs, and sucrose syrup along may be a better option. </w:t>
-      </w:r>
-      <w:commentRangeStart w:id="37"/>
-      <w:r>
-        <w:rPr>
-          <w:rFonts w:ascii="Times New Roman" w:eastAsia="Times New Roman" w:hAnsi="Times New Roman" w:cs="Times New Roman"/>
-          <w:color w:val="000000"/>
-        </w:rPr>
-        <w:t>Whether PSPs mixed with natural pollen is a good option is yet to be determined.</w:t>
-      </w:r>
-      <w:commentRangeEnd w:id="37"/>
-      <w:r>
-        <w:rPr>
-          <w:rStyle w:val="CommentReference"/>
-          <w:rFonts w:ascii="Times New Roman" w:eastAsia="Times New Roman" w:hAnsi="Times New Roman" w:cs="Times New Roman"/>
-        </w:rPr>
-        <w:commentReference w:id="37"/>
-      </w:r>
-      <w:r>
-        <w:rPr>
-          <w:rFonts w:ascii="Times New Roman" w:eastAsia="Times New Roman" w:hAnsi="Times New Roman" w:cs="Times New Roman"/>
-          <w:color w:val="000000"/>
-        </w:rPr>
-        <w:t xml:space="preserve"> Our findings shed light on the division of labor in </w:t>
-      </w:r>
-      <w:proofErr w:type="gramStart"/>
-      <w:r>
-        <w:rPr>
-          <w:rFonts w:ascii="Times New Roman" w:eastAsia="Times New Roman" w:hAnsi="Times New Roman" w:cs="Times New Roman"/>
-          <w:color w:val="000000"/>
-        </w:rPr>
-        <w:t>honey bee</w:t>
-      </w:r>
-      <w:proofErr w:type="gramEnd"/>
-      <w:r>
-        <w:rPr>
-          <w:rFonts w:ascii="Times New Roman" w:eastAsia="Times New Roman" w:hAnsi="Times New Roman" w:cs="Times New Roman"/>
-          <w:color w:val="000000"/>
-        </w:rPr>
-        <w:t xml:space="preserve"> colonies under the unnatural circumstances that managed colonies often find themselves. </w:t>
+        <w:t xml:space="preserve"> Our findings shed light on the division of labor in honey bee colonies under the unnatural circumstances that managed colonies often find themselves. </w:t>
       </w:r>
     </w:p>
     <w:p>
@@ -3960,16 +3213,16 @@
           <w:rFonts w:ascii="Times New Roman" w:hAnsi="Times New Roman" w:cs="Times New Roman"/>
         </w:rPr>
       </w:pPr>
-      <w:commentRangeStart w:id="38"/>
+      <w:commentRangeStart w:id="39"/>
       <w:r>
         <w:rPr>
           <w:rFonts w:ascii="Times New Roman" w:eastAsia="Times New Roman" w:hAnsi="Times New Roman" w:cs="Times New Roman"/>
         </w:rPr>
         <w:t>We would like thank Alessandra De Carolis, Chris Oster, James Weaver, Jennifer Standley, Jose Pinheiro Marcelino, Amy Vu, Caroline Pride, Douglas Brazie-Brown, and Payton (last name) for their contribution to this project.</w:t>
       </w:r>
-      <w:commentRangeEnd w:id="38"/>
-      <w:r>
-        <w:commentReference w:id="38"/>
+      <w:commentRangeEnd w:id="39"/>
+      <w:r>
+        <w:commentReference w:id="39"/>
       </w:r>
     </w:p>
     <w:p>
@@ -4044,21 +3297,7 @@
         <w:rPr>
           <w:rFonts w:ascii="Times New Roman" w:eastAsia="Times New Roman" w:hAnsi="Times New Roman" w:cs="Times New Roman"/>
         </w:rPr>
-        <w:t xml:space="preserve">Brodschneider, R., &amp; Crailsheim, K. (2010). Nutrition and health in </w:t>
-      </w:r>
-      <w:proofErr w:type="gramStart"/>
-      <w:r>
-        <w:rPr>
-          <w:rFonts w:ascii="Times New Roman" w:eastAsia="Times New Roman" w:hAnsi="Times New Roman" w:cs="Times New Roman"/>
-        </w:rPr>
-        <w:t>honey bees</w:t>
-      </w:r>
-      <w:proofErr w:type="gramEnd"/>
-      <w:r>
-        <w:rPr>
-          <w:rFonts w:ascii="Times New Roman" w:eastAsia="Times New Roman" w:hAnsi="Times New Roman" w:cs="Times New Roman"/>
-        </w:rPr>
-        <w:t xml:space="preserve">. </w:t>
+        <w:t xml:space="preserve">Brodschneider, R., &amp; Crailsheim, K. (2010). Nutrition and health in honey bees. </w:t>
       </w:r>
       <w:r>
         <w:rPr>
@@ -4101,21 +3340,7 @@
         <w:rPr>
           <w:rFonts w:ascii="Times New Roman" w:eastAsia="Times New Roman" w:hAnsi="Times New Roman" w:cs="Times New Roman"/>
         </w:rPr>
-        <w:t xml:space="preserve">Camazine, S. (1993). The regulation of pollen foraging by </w:t>
-      </w:r>
-      <w:proofErr w:type="gramStart"/>
-      <w:r>
-        <w:rPr>
-          <w:rFonts w:ascii="Times New Roman" w:eastAsia="Times New Roman" w:hAnsi="Times New Roman" w:cs="Times New Roman"/>
-        </w:rPr>
-        <w:t>honey bees</w:t>
-      </w:r>
-      <w:proofErr w:type="gramEnd"/>
-      <w:r>
-        <w:rPr>
-          <w:rFonts w:ascii="Times New Roman" w:eastAsia="Times New Roman" w:hAnsi="Times New Roman" w:cs="Times New Roman"/>
-        </w:rPr>
-        <w:t xml:space="preserve">: how foragers assess the colony's need for pollen. </w:t>
+        <w:t xml:space="preserve">Camazine, S. (1993). The regulation of pollen foraging by honey bees: how foragers assess the colony's need for pollen. </w:t>
       </w:r>
       <w:r>
         <w:rPr>
@@ -4158,21 +3383,7 @@
         <w:rPr>
           <w:rFonts w:ascii="Times New Roman" w:eastAsia="Times New Roman" w:hAnsi="Times New Roman" w:cs="Times New Roman"/>
         </w:rPr>
-        <w:t xml:space="preserve">Camazine, S., Crailsheim, K., Hrassnigg, N., Robinson, G. E., Leonhard, B., &amp; Kropiunigg, H. (1998). Protein trophallaxis and the regulation of pollen foraging by </w:t>
-      </w:r>
-      <w:proofErr w:type="gramStart"/>
-      <w:r>
-        <w:rPr>
-          <w:rFonts w:ascii="Times New Roman" w:eastAsia="Times New Roman" w:hAnsi="Times New Roman" w:cs="Times New Roman"/>
-        </w:rPr>
-        <w:t>honey bees</w:t>
-      </w:r>
-      <w:proofErr w:type="gramEnd"/>
-      <w:r>
-        <w:rPr>
-          <w:rFonts w:ascii="Times New Roman" w:eastAsia="Times New Roman" w:hAnsi="Times New Roman" w:cs="Times New Roman"/>
-        </w:rPr>
-        <w:t xml:space="preserve"> (Apis mellifera L.). </w:t>
+        <w:t xml:space="preserve">Camazine, S., Crailsheim, K., Hrassnigg, N., Robinson, G. E., Leonhard, B., &amp; Kropiunigg, H. (1998). Protein trophallaxis and the regulation of pollen foraging by honey bees (Apis mellifera L.). </w:t>
       </w:r>
       <w:r>
         <w:rPr>
@@ -4215,21 +3426,7 @@
         <w:rPr>
           <w:rFonts w:ascii="Times New Roman" w:eastAsia="Times New Roman" w:hAnsi="Times New Roman" w:cs="Times New Roman"/>
         </w:rPr>
-        <w:t xml:space="preserve">Carroll, M. J., Brown, N., Goodall, C., Downs, A. M., Sheenan, T. H., &amp; Anderson, K. E. (2017). </w:t>
-      </w:r>
-      <w:proofErr w:type="gramStart"/>
-      <w:r>
-        <w:rPr>
-          <w:rFonts w:ascii="Times New Roman" w:eastAsia="Times New Roman" w:hAnsi="Times New Roman" w:cs="Times New Roman"/>
-        </w:rPr>
-        <w:t>Honey bees</w:t>
-      </w:r>
-      <w:proofErr w:type="gramEnd"/>
-      <w:r>
-        <w:rPr>
-          <w:rFonts w:ascii="Times New Roman" w:eastAsia="Times New Roman" w:hAnsi="Times New Roman" w:cs="Times New Roman"/>
-        </w:rPr>
-        <w:t xml:space="preserve"> preferentially consume freshly-stored pollen. </w:t>
+        <w:t xml:space="preserve">Carroll, M. J., Brown, N., Goodall, C., Downs, A. M., Sheenan, T. H., &amp; Anderson, K. E. (2017). Honey bees preferentially consume freshly-stored pollen. </w:t>
       </w:r>
       <w:r>
         <w:rPr>
@@ -4278,21 +3475,7 @@
         <w:rPr>
           <w:rFonts w:ascii="Times New Roman" w:hAnsi="Times New Roman" w:cs="Times New Roman"/>
         </w:rPr>
-        <w:t xml:space="preserve">Corby-Harris, V., Snyder, L., Meador, C., &amp; Ayotte, T. (2018). </w:t>
-      </w:r>
-      <w:proofErr w:type="gramStart"/>
-      <w:r>
-        <w:rPr>
-          <w:rFonts w:ascii="Times New Roman" w:hAnsi="Times New Roman" w:cs="Times New Roman"/>
-        </w:rPr>
-        <w:t>Honey bee</w:t>
-      </w:r>
-      <w:proofErr w:type="gramEnd"/>
-      <w:r>
-        <w:rPr>
-          <w:rFonts w:ascii="Times New Roman" w:hAnsi="Times New Roman" w:cs="Times New Roman"/>
-        </w:rPr>
-        <w:t xml:space="preserve"> (Apis mellifera) nurses do not consume pollens based on their nutritional quality. </w:t>
+        <w:t xml:space="preserve">Corby-Harris, V., Snyder, L., Meador, C., &amp; Ayotte, T. (2018). Honey bee (Apis mellifera) nurses do not consume pollens based on their nutritional quality. </w:t>
       </w:r>
       <w:r>
         <w:rPr>
@@ -4335,21 +3518,7 @@
         <w:rPr>
           <w:rFonts w:ascii="Times New Roman" w:hAnsi="Times New Roman" w:cs="Times New Roman"/>
         </w:rPr>
-        <w:t xml:space="preserve">Crailsheim, K. (1990). The protein balance of the </w:t>
-      </w:r>
-      <w:proofErr w:type="gramStart"/>
-      <w:r>
-        <w:rPr>
-          <w:rFonts w:ascii="Times New Roman" w:hAnsi="Times New Roman" w:cs="Times New Roman"/>
-        </w:rPr>
-        <w:t>honey bee</w:t>
-      </w:r>
-      <w:proofErr w:type="gramEnd"/>
-      <w:r>
-        <w:rPr>
-          <w:rFonts w:ascii="Times New Roman" w:hAnsi="Times New Roman" w:cs="Times New Roman"/>
-        </w:rPr>
-        <w:t xml:space="preserve"> worker. </w:t>
+        <w:t xml:space="preserve">Crailsheim, K. (1990). The protein balance of the honey bee worker. </w:t>
       </w:r>
       <w:r>
         <w:rPr>
@@ -4421,21 +3590,7 @@
         <w:rPr>
           <w:rFonts w:ascii="Times New Roman" w:hAnsi="Times New Roman" w:cs="Times New Roman"/>
         </w:rPr>
-        <w:t xml:space="preserve">DeGrandi-Hoffman, G., &amp; Hagler, J. (2000). The flow of incoming nectar through a </w:t>
-      </w:r>
-      <w:proofErr w:type="gramStart"/>
-      <w:r>
-        <w:rPr>
-          <w:rFonts w:ascii="Times New Roman" w:hAnsi="Times New Roman" w:cs="Times New Roman"/>
-        </w:rPr>
-        <w:t>honey bee</w:t>
-      </w:r>
-      <w:proofErr w:type="gramEnd"/>
-      <w:r>
-        <w:rPr>
-          <w:rFonts w:ascii="Times New Roman" w:hAnsi="Times New Roman" w:cs="Times New Roman"/>
-        </w:rPr>
-        <w:t xml:space="preserve">. </w:t>
+        <w:t xml:space="preserve">DeGrandi-Hoffman, G., &amp; Hagler, J. (2000). The flow of incoming nectar through a honey bee. </w:t>
       </w:r>
       <w:r>
         <w:rPr>
@@ -4484,19 +3639,11 @@
         </w:rPr>
         <w:t xml:space="preserve"> </w:t>
       </w:r>
-      <w:proofErr w:type="gramStart"/>
-      <w:r>
-        <w:rPr>
-          <w:rFonts w:ascii="Times New Roman" w:hAnsi="Times New Roman" w:cs="Times New Roman"/>
-        </w:rPr>
-        <w:t>honey bees</w:t>
-      </w:r>
-      <w:proofErr w:type="gramEnd"/>
-      <w:r>
-        <w:rPr>
-          <w:rFonts w:ascii="Times New Roman" w:hAnsi="Times New Roman" w:cs="Times New Roman"/>
-        </w:rPr>
-        <w:t>: consumption rates by colonies and effects on brood and adult</w:t>
+      <w:r>
+        <w:rPr>
+          <w:rFonts w:ascii="Times New Roman" w:hAnsi="Times New Roman" w:cs="Times New Roman"/>
+        </w:rPr>
+        <w:t>honey bees: consumption rates by colonies and effects on brood and adult</w:t>
       </w:r>
       <w:r>
         <w:rPr>
@@ -4536,21 +3683,7 @@
         <w:rPr>
           <w:rFonts w:ascii="Times New Roman" w:hAnsi="Times New Roman" w:cs="Times New Roman"/>
         </w:rPr>
-        <w:t xml:space="preserve">effect of diet on protein concentration, hypopharyngeal gland development and virus load in worker </w:t>
-      </w:r>
-      <w:proofErr w:type="gramStart"/>
-      <w:r>
-        <w:rPr>
-          <w:rFonts w:ascii="Times New Roman" w:hAnsi="Times New Roman" w:cs="Times New Roman"/>
-        </w:rPr>
-        <w:t>honey bees</w:t>
-      </w:r>
-      <w:proofErr w:type="gramEnd"/>
-      <w:r>
-        <w:rPr>
-          <w:rFonts w:ascii="Times New Roman" w:hAnsi="Times New Roman" w:cs="Times New Roman"/>
-        </w:rPr>
-        <w:t xml:space="preserve"> (Apis mellifera L.). J. Insect</w:t>
+        <w:t>effect of diet on protein concentration, hypopharyngeal gland development and virus load in worker honey bees (Apis mellifera L.). J. Insect</w:t>
       </w:r>
       <w:r>
         <w:rPr>
@@ -4589,21 +3722,7 @@
         <w:rPr>
           <w:rFonts w:ascii="Times New Roman" w:hAnsi="Times New Roman" w:cs="Times New Roman"/>
         </w:rPr>
-        <w:t xml:space="preserve">G. Hidalgo, and E. W. de Jong. 2016. </w:t>
-      </w:r>
-      <w:proofErr w:type="gramStart"/>
-      <w:r>
-        <w:rPr>
-          <w:rFonts w:ascii="Times New Roman" w:hAnsi="Times New Roman" w:cs="Times New Roman"/>
-        </w:rPr>
-        <w:t>Honey bee</w:t>
-      </w:r>
-      <w:proofErr w:type="gramEnd"/>
-      <w:r>
-        <w:rPr>
-          <w:rFonts w:ascii="Times New Roman" w:hAnsi="Times New Roman" w:cs="Times New Roman"/>
-        </w:rPr>
-        <w:t xml:space="preserve"> colonies provided with</w:t>
+        <w:t>G. Hidalgo, and E. W. de Jong. 2016. Honey bee colonies provided with</w:t>
       </w:r>
       <w:r>
         <w:rPr>
@@ -4648,21 +3767,7 @@
         <w:rPr>
           <w:rFonts w:ascii="Times New Roman" w:hAnsi="Times New Roman" w:cs="Times New Roman"/>
         </w:rPr>
-        <w:t xml:space="preserve">De Jong, D., da Silva, E. J., Kevan, P. G., &amp; Atkinson, J. L. (2009). Pollen substitutes increase </w:t>
-      </w:r>
-      <w:proofErr w:type="gramStart"/>
-      <w:r>
-        <w:rPr>
-          <w:rFonts w:ascii="Times New Roman" w:hAnsi="Times New Roman" w:cs="Times New Roman"/>
-        </w:rPr>
-        <w:t>honey bee</w:t>
-      </w:r>
-      <w:proofErr w:type="gramEnd"/>
-      <w:r>
-        <w:rPr>
-          <w:rFonts w:ascii="Times New Roman" w:hAnsi="Times New Roman" w:cs="Times New Roman"/>
-        </w:rPr>
-        <w:t xml:space="preserve"> haemolymph protein levels as much as or more than does pollen. </w:t>
+        <w:t xml:space="preserve">De Jong, D., da Silva, E. J., Kevan, P. G., &amp; Atkinson, J. L. (2009). Pollen substitutes increase honey bee haemolymph protein levels as much as or more than does pollen. </w:t>
       </w:r>
       <w:r>
         <w:rPr>
@@ -4705,21 +3810,7 @@
         <w:rPr>
           <w:rFonts w:ascii="Times New Roman" w:hAnsi="Times New Roman" w:cs="Times New Roman"/>
         </w:rPr>
-        <w:t xml:space="preserve">Goodwin, R. M., Houten, A. T., &amp; Perry, J. H. (1994). Effect of feeding pollen substitutes to </w:t>
-      </w:r>
-      <w:proofErr w:type="gramStart"/>
-      <w:r>
-        <w:rPr>
-          <w:rFonts w:ascii="Times New Roman" w:hAnsi="Times New Roman" w:cs="Times New Roman"/>
-        </w:rPr>
-        <w:t>honey bee</w:t>
-      </w:r>
-      <w:proofErr w:type="gramEnd"/>
-      <w:r>
-        <w:rPr>
-          <w:rFonts w:ascii="Times New Roman" w:hAnsi="Times New Roman" w:cs="Times New Roman"/>
-        </w:rPr>
-        <w:t xml:space="preserve"> colonies used for kiwifruit pollination and honey production.</w:t>
+        <w:t>Goodwin, R. M., Houten, A. T., &amp; Perry, J. H. (1994). Effect of feeding pollen substitutes to honey bee colonies used for kiwifruit pollination and honey production.</w:t>
       </w:r>
     </w:p>
     <w:p>
@@ -4792,25 +3883,7 @@
           <w:color w:val="000000"/>
           <w:shd w:val="clear" w:color="auto" w:fill="FFFFFF"/>
         </w:rPr>
-        <w:t xml:space="preserve">Lau, P., Bryant, V., Ellis, J. D., Huang, Z. Y., Sullivan, J., Schmehl, D. R., ... &amp; Rangel, J. (2019). Seasonal variation of pollen collected by </w:t>
-      </w:r>
-      <w:proofErr w:type="gramStart"/>
-      <w:r>
-        <w:rPr>
-          <w:rFonts w:ascii="Times New Roman" w:eastAsia="Times New Roman" w:hAnsi="Times New Roman" w:cs="Times New Roman"/>
-          <w:color w:val="000000"/>
-          <w:shd w:val="clear" w:color="auto" w:fill="FFFFFF"/>
-        </w:rPr>
-        <w:t>honey bees</w:t>
-      </w:r>
-      <w:proofErr w:type="gramEnd"/>
-      <w:r>
-        <w:rPr>
-          <w:rFonts w:ascii="Times New Roman" w:eastAsia="Times New Roman" w:hAnsi="Times New Roman" w:cs="Times New Roman"/>
-          <w:color w:val="000000"/>
-          <w:shd w:val="clear" w:color="auto" w:fill="FFFFFF"/>
-        </w:rPr>
-        <w:t xml:space="preserve"> (Apis mellifera) in developed areas across four regions in the United States. </w:t>
+        <w:t xml:space="preserve">Lau, P., Bryant, V., Ellis, J. D., Huang, Z. Y., Sullivan, J., Schmehl, D. R., ... &amp; Rangel, J. (2019). Seasonal variation of pollen collected by honey bees (Apis mellifera) in developed areas across four regions in the United States. </w:t>
       </w:r>
       <w:r>
         <w:rPr>
@@ -4865,25 +3938,7 @@
           <w:color w:val="000000"/>
           <w:shd w:val="clear" w:color="auto" w:fill="FFFFFF"/>
         </w:rPr>
-        <w:t xml:space="preserve">Mattila, H. R., &amp; Otis, G. W. (2006). Influence of pollen diet in spring on development of </w:t>
-      </w:r>
-      <w:proofErr w:type="gramStart"/>
-      <w:r>
-        <w:rPr>
-          <w:rFonts w:ascii="Times New Roman" w:eastAsia="Times New Roman" w:hAnsi="Times New Roman" w:cs="Times New Roman"/>
-          <w:color w:val="000000"/>
-          <w:shd w:val="clear" w:color="auto" w:fill="FFFFFF"/>
-        </w:rPr>
-        <w:t>honey bee</w:t>
-      </w:r>
-      <w:proofErr w:type="gramEnd"/>
-      <w:r>
-        <w:rPr>
-          <w:rFonts w:ascii="Times New Roman" w:eastAsia="Times New Roman" w:hAnsi="Times New Roman" w:cs="Times New Roman"/>
-          <w:color w:val="000000"/>
-          <w:shd w:val="clear" w:color="auto" w:fill="FFFFFF"/>
-        </w:rPr>
-        <w:t xml:space="preserve"> (Hymenoptera: Apidae) colonies. </w:t>
+        <w:t xml:space="preserve">Manaswi, A., Noordyke, E., Prouty, C., &amp; Ellis, J. D. (2023). Western honey bee (Apis mellifera L.) attraction to commercial pollen substitutes and wildflower pollen in vitro. </w:t>
       </w:r>
       <w:r>
         <w:rPr>
@@ -4893,7 +3948,7 @@
           <w:color w:val="000000"/>
           <w:shd w:val="clear" w:color="auto" w:fill="FFFFFF"/>
         </w:rPr>
-        <w:t>Journal of economic entomology</w:t>
+        <w:t>Journal of Applied Entomology</w:t>
       </w:r>
       <w:r>
         <w:rPr>
@@ -4911,7 +3966,7 @@
           <w:color w:val="000000"/>
           <w:shd w:val="clear" w:color="auto" w:fill="FFFFFF"/>
         </w:rPr>
-        <w:t>99</w:t>
+        <w:t>147</w:t>
       </w:r>
       <w:r>
         <w:rPr>
@@ -4919,7 +3974,7 @@
           <w:color w:val="000000"/>
           <w:shd w:val="clear" w:color="auto" w:fill="FFFFFF"/>
         </w:rPr>
-        <w:t>(3), 604-613.</w:t>
+        <w:t>(3), 244-247.</w:t>
       </w:r>
     </w:p>
     <w:p>
@@ -4938,25 +3993,7 @@
           <w:color w:val="000000"/>
           <w:shd w:val="clear" w:color="auto" w:fill="FFFFFF"/>
         </w:rPr>
-        <w:t xml:space="preserve">Mortensen, A. N., Jack, C. J., Bustamante, T. A., Schmehl, D. R., &amp; Ellis, J. D. (2019). Effects of supplemental pollen feeding on </w:t>
-      </w:r>
-      <w:proofErr w:type="gramStart"/>
-      <w:r>
-        <w:rPr>
-          <w:rFonts w:ascii="Times New Roman" w:eastAsia="Times New Roman" w:hAnsi="Times New Roman" w:cs="Times New Roman"/>
-          <w:color w:val="000000"/>
-          <w:shd w:val="clear" w:color="auto" w:fill="FFFFFF"/>
-        </w:rPr>
-        <w:t>honey bee</w:t>
-      </w:r>
-      <w:proofErr w:type="gramEnd"/>
-      <w:r>
-        <w:rPr>
-          <w:rFonts w:ascii="Times New Roman" w:eastAsia="Times New Roman" w:hAnsi="Times New Roman" w:cs="Times New Roman"/>
-          <w:color w:val="000000"/>
-          <w:shd w:val="clear" w:color="auto" w:fill="FFFFFF"/>
-        </w:rPr>
-        <w:t xml:space="preserve"> (Hymenoptera: Apidae) colony strength and Nosema spp. infection. </w:t>
+        <w:t xml:space="preserve">Mattila, H. R., &amp; Otis, G. W. (2006). Influence of pollen diet in spring on development of honey bee (Hymenoptera: Apidae) colonies. </w:t>
       </w:r>
       <w:r>
         <w:rPr>
@@ -4966,7 +4003,7 @@
           <w:color w:val="000000"/>
           <w:shd w:val="clear" w:color="auto" w:fill="FFFFFF"/>
         </w:rPr>
-        <w:t>Journal of Economic Entomology</w:t>
+        <w:t>Journal of economic entomology</w:t>
       </w:r>
       <w:r>
         <w:rPr>
@@ -4984,7 +4021,7 @@
           <w:color w:val="000000"/>
           <w:shd w:val="clear" w:color="auto" w:fill="FFFFFF"/>
         </w:rPr>
-        <w:t>112</w:t>
+        <w:t>99</w:t>
       </w:r>
       <w:r>
         <w:rPr>
@@ -4992,7 +4029,173 @@
           <w:color w:val="000000"/>
           <w:shd w:val="clear" w:color="auto" w:fill="FFFFFF"/>
         </w:rPr>
+        <w:t>(3), 604-613.</w:t>
+      </w:r>
+    </w:p>
+    <w:p>
+      <w:pPr>
+        <w:spacing w:line="480" w:lineRule="auto"/>
+        <w:ind w:left="720" w:hanging="720"/>
+        <w:rPr>
+          <w:rFonts w:ascii="Times New Roman" w:eastAsia="Times New Roman" w:hAnsi="Times New Roman" w:cs="Times New Roman"/>
+          <w:color w:val="000000"/>
+          <w:shd w:val="clear" w:color="auto" w:fill="FFFFFF"/>
+        </w:rPr>
+      </w:pPr>
+      <w:r>
+        <w:rPr>
+          <w:rFonts w:ascii="Times New Roman" w:eastAsia="Times New Roman" w:hAnsi="Times New Roman" w:cs="Times New Roman"/>
+          <w:color w:val="000000"/>
+          <w:shd w:val="clear" w:color="auto" w:fill="FFFFFF"/>
+        </w:rPr>
+        <w:lastRenderedPageBreak/>
+        <w:t xml:space="preserve">Mortensen, A. N., Jack, C. J., Bustamante, T. A., Schmehl, D. R., &amp; Ellis, J. D. (2019). Effects of supplemental pollen feeding on honey bee (Hymenoptera: Apidae) colony strength and Nosema spp. infection. </w:t>
+      </w:r>
+      <w:r>
+        <w:rPr>
+          <w:rFonts w:ascii="Times New Roman" w:eastAsia="Times New Roman" w:hAnsi="Times New Roman" w:cs="Times New Roman"/>
+          <w:i/>
+          <w:iCs/>
+          <w:color w:val="000000"/>
+          <w:shd w:val="clear" w:color="auto" w:fill="FFFFFF"/>
+        </w:rPr>
+        <w:t>Journal of Economic Entomology</w:t>
+      </w:r>
+      <w:r>
+        <w:rPr>
+          <w:rFonts w:ascii="Times New Roman" w:eastAsia="Times New Roman" w:hAnsi="Times New Roman" w:cs="Times New Roman"/>
+          <w:color w:val="000000"/>
+          <w:shd w:val="clear" w:color="auto" w:fill="FFFFFF"/>
+        </w:rPr>
+        <w:t xml:space="preserve">, </w:t>
+      </w:r>
+      <w:r>
+        <w:rPr>
+          <w:rFonts w:ascii="Times New Roman" w:eastAsia="Times New Roman" w:hAnsi="Times New Roman" w:cs="Times New Roman"/>
+          <w:i/>
+          <w:iCs/>
+          <w:color w:val="000000"/>
+          <w:shd w:val="clear" w:color="auto" w:fill="FFFFFF"/>
+        </w:rPr>
+        <w:t>112</w:t>
+      </w:r>
+      <w:r>
+        <w:rPr>
+          <w:rFonts w:ascii="Times New Roman" w:eastAsia="Times New Roman" w:hAnsi="Times New Roman" w:cs="Times New Roman"/>
+          <w:color w:val="000000"/>
+          <w:shd w:val="clear" w:color="auto" w:fill="FFFFFF"/>
+        </w:rPr>
         <w:t>(1), 60-66.</w:t>
+      </w:r>
+    </w:p>
+    <w:p>
+      <w:pPr>
+        <w:spacing w:line="480" w:lineRule="auto"/>
+        <w:ind w:left="720" w:hanging="720"/>
+        <w:rPr>
+          <w:rFonts w:ascii="Times New Roman" w:eastAsia="Times New Roman" w:hAnsi="Times New Roman" w:cs="Times New Roman"/>
+          <w:color w:val="000000"/>
+          <w:shd w:val="clear" w:color="auto" w:fill="FFFFFF"/>
+        </w:rPr>
+      </w:pPr>
+      <w:r>
+        <w:rPr>
+          <w:rFonts w:ascii="Times New Roman" w:eastAsia="Times New Roman" w:hAnsi="Times New Roman" w:cs="Times New Roman"/>
+          <w:color w:val="000000"/>
+          <w:shd w:val="clear" w:color="auto" w:fill="FFFFFF"/>
+        </w:rPr>
+        <w:t xml:space="preserve">Noordyke, E. R., van Santen, E., &amp; Ellis, J. D. (2021). Tracing the fate of pollen substitute patties in Western honey bee (Hymenoptera: Apidae) colonies. </w:t>
+      </w:r>
+      <w:r>
+        <w:rPr>
+          <w:rFonts w:ascii="Times New Roman" w:eastAsia="Times New Roman" w:hAnsi="Times New Roman" w:cs="Times New Roman"/>
+          <w:i/>
+          <w:iCs/>
+          <w:color w:val="000000"/>
+          <w:shd w:val="clear" w:color="auto" w:fill="FFFFFF"/>
+        </w:rPr>
+        <w:t>Journal of economic entomology</w:t>
+      </w:r>
+      <w:r>
+        <w:rPr>
+          <w:rFonts w:ascii="Times New Roman" w:eastAsia="Times New Roman" w:hAnsi="Times New Roman" w:cs="Times New Roman"/>
+          <w:color w:val="000000"/>
+          <w:shd w:val="clear" w:color="auto" w:fill="FFFFFF"/>
+        </w:rPr>
+        <w:t xml:space="preserve">, </w:t>
+      </w:r>
+      <w:r>
+        <w:rPr>
+          <w:rFonts w:ascii="Times New Roman" w:eastAsia="Times New Roman" w:hAnsi="Times New Roman" w:cs="Times New Roman"/>
+          <w:i/>
+          <w:iCs/>
+          <w:color w:val="000000"/>
+          <w:shd w:val="clear" w:color="auto" w:fill="FFFFFF"/>
+        </w:rPr>
+        <w:t>114</w:t>
+      </w:r>
+      <w:r>
+        <w:rPr>
+          <w:rFonts w:ascii="Times New Roman" w:eastAsia="Times New Roman" w:hAnsi="Times New Roman" w:cs="Times New Roman"/>
+          <w:color w:val="000000"/>
+          <w:shd w:val="clear" w:color="auto" w:fill="FFFFFF"/>
+        </w:rPr>
+        <w:t>(4), 1421-1430.</w:t>
+      </w:r>
+    </w:p>
+    <w:p>
+      <w:pPr>
+        <w:spacing w:line="480" w:lineRule="auto"/>
+        <w:ind w:left="720" w:hanging="720"/>
+        <w:rPr>
+          <w:rFonts w:ascii="Times New Roman" w:eastAsia="Times New Roman" w:hAnsi="Times New Roman" w:cs="Times New Roman"/>
+          <w:color w:val="000000"/>
+          <w:shd w:val="clear" w:color="auto" w:fill="FFFFFF"/>
+        </w:rPr>
+      </w:pPr>
+      <w:r>
+        <w:rPr>
+          <w:rFonts w:ascii="Times New Roman" w:eastAsia="Times New Roman" w:hAnsi="Times New Roman" w:cs="Times New Roman"/>
+          <w:color w:val="000000"/>
+          <w:shd w:val="clear" w:color="auto" w:fill="FFFFFF"/>
+        </w:rPr>
+        <w:t xml:space="preserve">Noordyke, E. R., &amp; Ellis, J. D. (2021). Reviewing the efficacy of pollen substitutes as a management tool for improving the health and productivity of western honey bee (Apis mellifera) colonies. </w:t>
+      </w:r>
+      <w:r>
+        <w:rPr>
+          <w:rFonts w:ascii="Times New Roman" w:eastAsia="Times New Roman" w:hAnsi="Times New Roman" w:cs="Times New Roman"/>
+          <w:i/>
+          <w:iCs/>
+          <w:color w:val="000000"/>
+          <w:shd w:val="clear" w:color="auto" w:fill="FFFFFF"/>
+        </w:rPr>
+        <w:t>Frontiers in Sustainable Food Systems</w:t>
+      </w:r>
+      <w:r>
+        <w:rPr>
+          <w:rFonts w:ascii="Times New Roman" w:eastAsia="Times New Roman" w:hAnsi="Times New Roman" w:cs="Times New Roman"/>
+          <w:color w:val="000000"/>
+          <w:shd w:val="clear" w:color="auto" w:fill="FFFFFF"/>
+        </w:rPr>
+        <w:t xml:space="preserve">, </w:t>
+      </w:r>
+      <w:r>
+        <w:rPr>
+          <w:rFonts w:ascii="Times New Roman" w:eastAsia="Times New Roman" w:hAnsi="Times New Roman" w:cs="Times New Roman"/>
+          <w:i/>
+          <w:iCs/>
+          <w:color w:val="000000"/>
+          <w:shd w:val="clear" w:color="auto" w:fill="FFFFFF"/>
+        </w:rPr>
+        <w:t>5</w:t>
+      </w:r>
+      <w:r>
+        <w:rPr>
+          <w:rFonts w:ascii="Times New Roman" w:eastAsia="Times New Roman" w:hAnsi="Times New Roman" w:cs="Times New Roman"/>
+          <w:color w:val="000000"/>
+          <w:shd w:val="clear" w:color="auto" w:fill="FFFFFF"/>
+        </w:rPr>
+        <w:t>, 772897.</w:t>
       </w:r>
     </w:p>
     <w:p>
@@ -5013,63 +4216,26 @@
           <w:color w:val="000000"/>
           <w:shd w:val="clear" w:color="auto" w:fill="FFFFFF"/>
         </w:rPr>
-        <w:lastRenderedPageBreak/>
-        <w:t xml:space="preserve">Noordyke, E. R., van Santen, E., &amp; Ellis, J. D. (2022). Evaluating the strength of western </w:t>
-      </w:r>
-      <w:proofErr w:type="gramStart"/>
-      <w:r>
+        <w:t>Noordyke, E. R., van Santen, E., &amp; Ellis, J. D. (2022). Evaluating the strength of western honey bee (Apis mellifera L.) colonies fed pollen substitutes over winter. Journal of Applied Entomology, 146(3), 291-300.</w:t>
+      </w:r>
+    </w:p>
+    <w:p>
+      <w:pPr>
+        <w:spacing w:line="480" w:lineRule="auto"/>
+        <w:ind w:left="720" w:hanging="720"/>
         <w:rPr>
           <w:rFonts w:ascii="Times New Roman" w:eastAsia="Times New Roman" w:hAnsi="Times New Roman" w:cs="Times New Roman"/>
           <w:color w:val="000000"/>
           <w:shd w:val="clear" w:color="auto" w:fill="FFFFFF"/>
         </w:rPr>
-        <w:t>honey bee</w:t>
-      </w:r>
-      <w:proofErr w:type="gramEnd"/>
+      </w:pPr>
       <w:r>
         <w:rPr>
           <w:rFonts w:ascii="Times New Roman" w:eastAsia="Times New Roman" w:hAnsi="Times New Roman" w:cs="Times New Roman"/>
           <w:color w:val="000000"/>
           <w:shd w:val="clear" w:color="auto" w:fill="FFFFFF"/>
         </w:rPr>
-        <w:t xml:space="preserve"> (Apis mellifera L.) colonies fed pollen substitutes over winter. Journal of Applied Entomology, 146(3), 291-300.</w:t>
-      </w:r>
-    </w:p>
-    <w:p>
-      <w:pPr>
-        <w:spacing w:line="480" w:lineRule="auto"/>
-        <w:ind w:left="720" w:hanging="720"/>
-        <w:rPr>
-          <w:rFonts w:ascii="Times New Roman" w:eastAsia="Times New Roman" w:hAnsi="Times New Roman" w:cs="Times New Roman"/>
-          <w:color w:val="000000"/>
-          <w:shd w:val="clear" w:color="auto" w:fill="FFFFFF"/>
-        </w:rPr>
-      </w:pPr>
-      <w:r>
-        <w:rPr>
-          <w:rFonts w:ascii="Times New Roman" w:eastAsia="Times New Roman" w:hAnsi="Times New Roman" w:cs="Times New Roman"/>
-          <w:color w:val="000000"/>
-          <w:shd w:val="clear" w:color="auto" w:fill="FFFFFF"/>
-        </w:rPr>
-        <w:t xml:space="preserve">Schmickl, T., &amp; Crailsheim, K. (2004). Inner nest homeostasis in a changing environment with special emphasis on </w:t>
-      </w:r>
-      <w:proofErr w:type="gramStart"/>
-      <w:r>
-        <w:rPr>
-          <w:rFonts w:ascii="Times New Roman" w:eastAsia="Times New Roman" w:hAnsi="Times New Roman" w:cs="Times New Roman"/>
-          <w:color w:val="000000"/>
-          <w:shd w:val="clear" w:color="auto" w:fill="FFFFFF"/>
-        </w:rPr>
-        <w:t>honey bee</w:t>
-      </w:r>
-      <w:proofErr w:type="gramEnd"/>
-      <w:r>
-        <w:rPr>
-          <w:rFonts w:ascii="Times New Roman" w:eastAsia="Times New Roman" w:hAnsi="Times New Roman" w:cs="Times New Roman"/>
-          <w:color w:val="000000"/>
-          <w:shd w:val="clear" w:color="auto" w:fill="FFFFFF"/>
-        </w:rPr>
-        <w:t xml:space="preserve"> brood nursing and pollen supply. </w:t>
+        <w:t xml:space="preserve">Schmickl, T., &amp; Crailsheim, K. (2004). Inner nest homeostasis in a changing environment with special emphasis on honey bee brood nursing and pollen supply. </w:t>
       </w:r>
       <w:r>
         <w:rPr>
@@ -5124,25 +4290,7 @@
           <w:color w:val="000000"/>
           <w:shd w:val="clear" w:color="auto" w:fill="FFFFFF"/>
         </w:rPr>
-        <w:t xml:space="preserve">Schulz, D. J., Huang, Z. Y., &amp; Robinson, G. E. (1998). Effects of colony food shortage on behavioral development in </w:t>
-      </w:r>
-      <w:proofErr w:type="gramStart"/>
-      <w:r>
-        <w:rPr>
-          <w:rFonts w:ascii="Times New Roman" w:eastAsia="Times New Roman" w:hAnsi="Times New Roman" w:cs="Times New Roman"/>
-          <w:color w:val="000000"/>
-          <w:shd w:val="clear" w:color="auto" w:fill="FFFFFF"/>
-        </w:rPr>
-        <w:t>honey bees</w:t>
-      </w:r>
-      <w:proofErr w:type="gramEnd"/>
-      <w:r>
-        <w:rPr>
-          <w:rFonts w:ascii="Times New Roman" w:eastAsia="Times New Roman" w:hAnsi="Times New Roman" w:cs="Times New Roman"/>
-          <w:color w:val="000000"/>
-          <w:shd w:val="clear" w:color="auto" w:fill="FFFFFF"/>
-        </w:rPr>
-        <w:t>. Behavioral Ecology and Sociobiology, 42, 295-303.</w:t>
+        <w:t>Schulz, D. J., Huang, Z. Y., &amp; Robinson, G. E. (1998). Effects of colony food shortage on behavioral development in honey bees. Behavioral Ecology and Sociobiology, 42, 295-303.</w:t>
       </w:r>
     </w:p>
     <w:p>
@@ -5182,31 +4330,57 @@
           <w:i/>
           <w:iCs/>
         </w:rPr>
-        <w:t xml:space="preserve">The Foraging Behavior of the </w:t>
-      </w:r>
-      <w:proofErr w:type="gramStart"/>
+        <w:t>The Foraging Behavior of the Honey Bee (Apis Mellifera, L.)</w:t>
+      </w:r>
+      <w:r>
+        <w:rPr>
+          <w:rFonts w:ascii="Times New Roman" w:eastAsia="Times New Roman" w:hAnsi="Times New Roman" w:cs="Times New Roman"/>
+        </w:rPr>
+        <w:t xml:space="preserve"> (pp. 105-120). Academic Press.</w:t>
+      </w:r>
+    </w:p>
+    <w:p>
+      <w:pPr>
+        <w:spacing w:line="480" w:lineRule="auto"/>
+        <w:ind w:left="720" w:hanging="720"/>
+        <w:rPr>
+          <w:rFonts w:ascii="Times New Roman" w:eastAsia="Times New Roman" w:hAnsi="Times New Roman" w:cs="Times New Roman"/>
+        </w:rPr>
+      </w:pPr>
+      <w:r>
+        <w:rPr>
+          <w:rFonts w:ascii="Times New Roman" w:eastAsia="Times New Roman" w:hAnsi="Times New Roman" w:cs="Times New Roman"/>
+        </w:rPr>
+        <w:lastRenderedPageBreak/>
+        <w:t xml:space="preserve">Vásquez, A., &amp; Olofsson, T. C. (2009). The lactic acid bacteria involved in the production of bee pollen and bee bread. </w:t>
+      </w:r>
       <w:r>
         <w:rPr>
           <w:rFonts w:ascii="Times New Roman" w:eastAsia="Times New Roman" w:hAnsi="Times New Roman" w:cs="Times New Roman"/>
           <w:i/>
           <w:iCs/>
         </w:rPr>
-        <w:t>Honey Bee</w:t>
-      </w:r>
-      <w:proofErr w:type="gramEnd"/>
+        <w:t>Journal of apicultural research</w:t>
+      </w:r>
+      <w:r>
+        <w:rPr>
+          <w:rFonts w:ascii="Times New Roman" w:eastAsia="Times New Roman" w:hAnsi="Times New Roman" w:cs="Times New Roman"/>
+        </w:rPr>
+        <w:t xml:space="preserve">, </w:t>
+      </w:r>
       <w:r>
         <w:rPr>
           <w:rFonts w:ascii="Times New Roman" w:eastAsia="Times New Roman" w:hAnsi="Times New Roman" w:cs="Times New Roman"/>
           <w:i/>
           <w:iCs/>
         </w:rPr>
-        <w:t xml:space="preserve"> (Apis Mellifera, L.)</w:t>
-      </w:r>
-      <w:r>
-        <w:rPr>
-          <w:rFonts w:ascii="Times New Roman" w:eastAsia="Times New Roman" w:hAnsi="Times New Roman" w:cs="Times New Roman"/>
-        </w:rPr>
-        <w:t xml:space="preserve"> (pp. 105-120). Academic Press.</w:t>
+        <w:t>48</w:t>
+      </w:r>
+      <w:r>
+        <w:rPr>
+          <w:rFonts w:ascii="Times New Roman" w:eastAsia="Times New Roman" w:hAnsi="Times New Roman" w:cs="Times New Roman"/>
+        </w:rPr>
+        <w:t>(3), 189-195.</w:t>
       </w:r>
     </w:p>
     <w:p>
@@ -5221,64 +4395,7 @@
         <w:rPr>
           <w:rFonts w:ascii="Times New Roman" w:eastAsia="Times New Roman" w:hAnsi="Times New Roman" w:cs="Times New Roman"/>
         </w:rPr>
-        <w:t xml:space="preserve">Vásquez, A., &amp; Olofsson, T. C. (2009). The lactic acid bacteria involved in the production of bee pollen and bee bread. </w:t>
-      </w:r>
-      <w:r>
-        <w:rPr>
-          <w:rFonts w:ascii="Times New Roman" w:eastAsia="Times New Roman" w:hAnsi="Times New Roman" w:cs="Times New Roman"/>
-          <w:i/>
-          <w:iCs/>
-        </w:rPr>
-        <w:t>Journal of apicultural research</w:t>
-      </w:r>
-      <w:r>
-        <w:rPr>
-          <w:rFonts w:ascii="Times New Roman" w:eastAsia="Times New Roman" w:hAnsi="Times New Roman" w:cs="Times New Roman"/>
-        </w:rPr>
-        <w:t xml:space="preserve">, </w:t>
-      </w:r>
-      <w:r>
-        <w:rPr>
-          <w:rFonts w:ascii="Times New Roman" w:eastAsia="Times New Roman" w:hAnsi="Times New Roman" w:cs="Times New Roman"/>
-          <w:i/>
-          <w:iCs/>
-        </w:rPr>
-        <w:t>48</w:t>
-      </w:r>
-      <w:r>
-        <w:rPr>
-          <w:rFonts w:ascii="Times New Roman" w:eastAsia="Times New Roman" w:hAnsi="Times New Roman" w:cs="Times New Roman"/>
-        </w:rPr>
-        <w:t>(3), 189-195.</w:t>
-      </w:r>
-    </w:p>
-    <w:p>
-      <w:pPr>
-        <w:spacing w:line="480" w:lineRule="auto"/>
-        <w:ind w:left="720" w:hanging="720"/>
-        <w:rPr>
-          <w:rFonts w:ascii="Times New Roman" w:eastAsia="Times New Roman" w:hAnsi="Times New Roman" w:cs="Times New Roman"/>
-        </w:rPr>
-      </w:pPr>
-      <w:r>
-        <w:rPr>
-          <w:rFonts w:ascii="Times New Roman" w:eastAsia="Times New Roman" w:hAnsi="Times New Roman" w:cs="Times New Roman"/>
-        </w:rPr>
-        <w:t xml:space="preserve">Wright, G. A., Nicolson, S. W., &amp; Shafir, S. (2018). Nutritional physiology and ecology of </w:t>
-      </w:r>
-      <w:proofErr w:type="gramStart"/>
-      <w:r>
-        <w:rPr>
-          <w:rFonts w:ascii="Times New Roman" w:eastAsia="Times New Roman" w:hAnsi="Times New Roman" w:cs="Times New Roman"/>
-        </w:rPr>
-        <w:t>honey bees</w:t>
-      </w:r>
-      <w:proofErr w:type="gramEnd"/>
-      <w:r>
-        <w:rPr>
-          <w:rFonts w:ascii="Times New Roman" w:eastAsia="Times New Roman" w:hAnsi="Times New Roman" w:cs="Times New Roman"/>
-        </w:rPr>
-        <w:t xml:space="preserve">. </w:t>
+        <w:t xml:space="preserve">Wright, G. A., Nicolson, S. W., &amp; Shafir, S. (2018). Nutritional physiology and ecology of honey bees. </w:t>
       </w:r>
       <w:r>
         <w:rPr>
@@ -5814,7 +4931,32 @@
       </w:r>
     </w:p>
   </w:comment>
-  <w:comment w:id="21" w:author="cody" w:date="2024-04-01T10:42:00Z" w:initials="c">
+  <w:comment w:id="21" w:author="Prouty, Cody S." w:date="2024-04-24T10:27:00Z" w:initials="CP">
+    <w:p>
+      <w:pPr>
+        <w:pStyle w:val="CommentText"/>
+      </w:pPr>
+      <w:r>
+        <w:rPr>
+          <w:rStyle w:val="CommentReference"/>
+        </w:rPr>
+        <w:annotationRef/>
+      </w:r>
+      <w:r>
+        <w:t>“Since the clay weighed less than did the pollen substitutes by volume, we fed 43 g clay per colony. This corresponded to the same volume (83.3 cm</w:t>
+      </w:r>
+      <w:r>
+        <w:rPr>
+          <w:vertAlign w:val="superscript"/>
+        </w:rPr>
+        <w:t>3</w:t>
+      </w:r>
+      <w:r>
+        <w:t>) as 100 g of pollen substitute, allowing us to standardize the surface area to which bees would have had access for all diet types. “</w:t>
+      </w:r>
+    </w:p>
+  </w:comment>
+  <w:comment w:id="22" w:author="cody" w:date="2024-04-01T10:42:00Z" w:initials="c">
     <w:p>
       <w:r>
         <w:rPr>
@@ -5825,7 +4967,7 @@
       </w:r>
     </w:p>
   </w:comment>
-  <w:comment w:id="22" w:author="Kaylin" w:date="2022-06-10T10:32:00Z" w:initials="KK">
+  <w:comment w:id="23" w:author="Kaylin" w:date="2022-06-10T10:32:00Z" w:initials="KK">
     <w:p>
       <w:r>
         <w:rPr>
@@ -5836,7 +4978,7 @@
       </w:r>
     </w:p>
   </w:comment>
-  <w:comment w:id="23" w:author="Prouty, Cody S. [2]" w:date="2022-06-13T12:06:00Z" w:initials="PCS">
+  <w:comment w:id="24" w:author="Prouty, Cody S. [2]" w:date="2022-06-13T12:06:00Z" w:initials="PCS">
     <w:p>
       <w:r>
         <w:rPr>
@@ -5847,7 +4989,7 @@
       </w:r>
     </w:p>
   </w:comment>
-  <w:comment w:id="24" w:author="cody" w:date="2024-04-01T10:43:00Z" w:initials="c">
+  <w:comment w:id="25" w:author="cody" w:date="2024-04-01T10:43:00Z" w:initials="c">
     <w:p>
       <w:r>
         <w:rPr>
@@ -5858,7 +5000,7 @@
       </w:r>
     </w:p>
   </w:comment>
-  <w:comment w:id="25" w:author="Prouty, Cody S." w:date="2024-04-17T10:22:00Z" w:initials="CP">
+  <w:comment w:id="26" w:author="Prouty, Cody S." w:date="2024-04-17T10:22:00Z" w:initials="CP">
     <w:p>
       <w:pPr>
         <w:pStyle w:val="CommentText"/>
@@ -5926,7 +5068,7 @@
       </w:r>
     </w:p>
   </w:comment>
-  <w:comment w:id="26" w:author="Prouty, Cody S." w:date="2024-04-17T10:19:00Z" w:initials="CP">
+  <w:comment w:id="27" w:author="Prouty, Cody S." w:date="2024-04-17T10:19:00Z" w:initials="CP">
     <w:p>
       <w:pPr>
         <w:pStyle w:val="CommentText"/>
@@ -5942,7 +5084,7 @@
       </w:r>
     </w:p>
   </w:comment>
-  <w:comment w:id="27" w:author="Prouty, Cody S." w:date="2024-04-17T10:47:00Z" w:initials="CP">
+  <w:comment w:id="28" w:author="Prouty, Cody S." w:date="2024-04-17T10:47:00Z" w:initials="CP">
     <w:p>
       <w:pPr>
         <w:pStyle w:val="CommentText"/>
@@ -6010,7 +5152,7 @@
       </w:r>
     </w:p>
   </w:comment>
-  <w:comment w:id="28" w:author="Prouty, Cody S." w:date="2024-04-17T10:39:00Z" w:initials="CP">
+  <w:comment w:id="29" w:author="Prouty, Cody S." w:date="2024-04-17T10:39:00Z" w:initials="CP">
     <w:p>
       <w:pPr>
         <w:pStyle w:val="CommentText"/>
@@ -6026,7 +5168,7 @@
       </w:r>
     </w:p>
   </w:comment>
-  <w:comment w:id="29" w:author="Prouty, Cody S." w:date="2024-04-17T11:05:00Z" w:initials="CP">
+  <w:comment w:id="30" w:author="Prouty, Cody S." w:date="2024-04-17T11:05:00Z" w:initials="CP">
     <w:p>
       <w:pPr>
         <w:pStyle w:val="CommentText"/>
@@ -6084,7 +5226,7 @@
       </w:r>
     </w:p>
   </w:comment>
-  <w:comment w:id="30" w:author="Prouty, Cody S." w:date="2024-04-17T11:06:00Z" w:initials="CP">
+  <w:comment w:id="31" w:author="Prouty, Cody S." w:date="2024-04-17T11:06:00Z" w:initials="CP">
     <w:p>
       <w:pPr>
         <w:pStyle w:val="CommentText"/>
@@ -6100,7 +5242,7 @@
       </w:r>
     </w:p>
   </w:comment>
-  <w:comment w:id="31" w:author="Prouty, Cody S." w:date="2024-04-24T08:50:00Z" w:initials="CP">
+  <w:comment w:id="32" w:author="Prouty, Cody S." w:date="2024-04-24T08:50:00Z" w:initials="CP">
     <w:p>
       <w:pPr>
         <w:pStyle w:val="CommentText"/>
@@ -6284,7 +5426,7 @@
       </w:r>
     </w:p>
   </w:comment>
-  <w:comment w:id="32" w:author="Prouty, Cody S." w:date="2024-04-24T09:17:00Z" w:initials="CP">
+  <w:comment w:id="33" w:author="Prouty, Cody S." w:date="2024-04-24T09:17:00Z" w:initials="CP">
     <w:p>
       <w:pPr>
         <w:pStyle w:val="CommentText"/>
@@ -6300,7 +5442,7 @@
       </w:r>
     </w:p>
   </w:comment>
-  <w:comment w:id="33" w:author="Prouty, Cody S." w:date="2024-04-24T10:07:00Z" w:initials="CP">
+  <w:comment w:id="34" w:author="Prouty, Cody S." w:date="2024-04-24T10:07:00Z" w:initials="CP">
     <w:p>
       <w:pPr>
         <w:pStyle w:val="CommentText"/>
@@ -6316,7 +5458,7 @@
       </w:r>
     </w:p>
   </w:comment>
-  <w:comment w:id="34" w:author="Prouty, Cody S." w:date="2024-04-24T09:29:00Z" w:initials="CP">
+  <w:comment w:id="35" w:author="Prouty, Cody S." w:date="2024-04-24T09:29:00Z" w:initials="CP">
     <w:p>
       <w:pPr>
         <w:pStyle w:val="CommentText"/>
@@ -6332,7 +5474,7 @@
       </w:r>
     </w:p>
   </w:comment>
-  <w:comment w:id="35" w:author="Prouty, Cody S." w:date="2024-04-24T08:53:00Z" w:initials="CP">
+  <w:comment w:id="36" w:author="Prouty, Cody S." w:date="2024-04-24T08:53:00Z" w:initials="CP">
     <w:p>
       <w:pPr>
         <w:pStyle w:val="CommentText"/>
@@ -6396,7 +5538,7 @@
       </w:r>
     </w:p>
   </w:comment>
-  <w:comment w:id="36" w:author="Prouty, Cody S." w:date="2024-04-24T08:59:00Z" w:initials="CP">
+  <w:comment w:id="37" w:author="Prouty, Cody S." w:date="2024-04-24T08:59:00Z" w:initials="CP">
     <w:p>
       <w:pPr>
         <w:pStyle w:val="CommentText"/>
@@ -6412,7 +5554,7 @@
       </w:r>
     </w:p>
   </w:comment>
-  <w:comment w:id="37" w:author="Prouty, Cody S." w:date="2024-04-24T09:39:00Z" w:initials="CP">
+  <w:comment w:id="38" w:author="Prouty, Cody S." w:date="2024-04-24T09:39:00Z" w:initials="CP">
     <w:p>
       <w:pPr>
         <w:pStyle w:val="CommentText"/>
@@ -6428,7 +5570,7 @@
       </w:r>
     </w:p>
   </w:comment>
-  <w:comment w:id="38" w:author="Noordyke,Emily R" w:date="2021-12-27T12:58:00Z" w:initials="NR">
+  <w:comment w:id="39" w:author="Noordyke,Emily R" w:date="2021-12-27T12:58:00Z" w:initials="NR">
     <w:p>
       <w:r>
         <w:rPr>
@@ -6465,6 +5607,7 @@
   <w15:commentEx w15:paraId="00000009" w15:done="0"/>
   <w15:commentEx w15:paraId="1555029D" w15:paraIdParent="00000009" w15:done="0"/>
   <w15:commentEx w15:paraId="00000008" w15:done="0"/>
+  <w15:commentEx w15:paraId="47708E7E" w15:paraIdParent="00000008" w15:done="0"/>
   <w15:commentEx w15:paraId="00000003" w15:done="0"/>
   <w15:commentEx w15:paraId="00000004" w15:done="0"/>
   <w15:commentEx w15:paraId="00000005" w15:paraIdParent="00000004" w15:done="0"/>
@@ -6509,6 +5652,7 @@
   <w16cex:commentExtensible w16cex:durableId="2374E0AB" w16cex:dateUtc="2020-12-04T21:22:00Z"/>
   <w16cex:commentExtensible w16cex:durableId="2CE16A32" w16cex:dateUtc="2024-04-03T17:16:00Z"/>
   <w16cex:commentExtensible w16cex:durableId="2374DDB6" w16cex:dateUtc="2020-12-04T21:09:00Z"/>
+  <w16cex:commentExtensible w16cex:durableId="675BF8C8" w16cex:dateUtc="2024-04-24T15:27:00Z"/>
   <w16cex:commentExtensible w16cex:durableId="6A290767" w16cex:dateUtc="2024-04-01T15:42:00Z"/>
   <w16cex:commentExtensible w16cex:durableId="264D9C59" w16cex:dateUtc="2022-06-10T14:32:00Z"/>
   <w16cex:commentExtensible w16cex:durableId="2651A6B7" w16cex:dateUtc="2022-06-13T16:06:00Z"/>
@@ -6553,6 +5697,7 @@
   <w16cid:commentId w16cid:paraId="00000009" w16cid:durableId="2374E0AB"/>
   <w16cid:commentId w16cid:paraId="1555029D" w16cid:durableId="2CE16A32"/>
   <w16cid:commentId w16cid:paraId="00000008" w16cid:durableId="2374DDB6"/>
+  <w16cid:commentId w16cid:paraId="47708E7E" w16cid:durableId="675BF8C8"/>
   <w16cid:commentId w16cid:paraId="00000003" w16cid:durableId="6A290767"/>
   <w16cid:commentId w16cid:paraId="00000004" w16cid:durableId="264D9C59"/>
   <w16cid:commentId w16cid:paraId="00000005" w16cid:durableId="2651A6B7"/>

</xml_diff>